<commit_message>
docs: regenerate .docx with full English content (no Spanish residue)
</commit_message>
<xml_diff>
--- a/docs/Helios-POC-Documentation.docx
+++ b/docs/Helios-POC-Documentation.docx
@@ -37,7 +37,7 @@
         <w:rPr>
           <w:i/>
         </w:rPr>
-        <w:t>Generated: 2026-09-26 22:21:07</w:t>
+        <w:t>Generated: 2026-09-26 22:35:41</w:t>
         <w:br/>
       </w:r>
       <w:r>
@@ -58,7 +58,7 @@
         <w:rPr>
           <w:i/>
         </w:rPr>
-        <w:t>10 services + 9 personas + 13 tags + 1 IdP + 1 EKS sim + ngrok tunnel</w:t>
+        <w:t>10 services + 9 personas + 13 tags + 1 IdP + 1 simulated EKS + ngrok tunnel</w:t>
       </w:r>
     </w:p>
     <w:p>
@@ -84,7 +84,7 @@
     </w:p>
     <w:p>
       <w:r>
-        <w:t>2. POC architecture</w:t>
+        <w:t>2. POC Architecture</w:t>
       </w:r>
     </w:p>
     <w:p>
@@ -94,7 +94,7 @@
     </w:p>
     <w:p>
       <w:r>
-        <w:t>4. Tag and services map</w:t>
+        <w:t>4. Tag and service map</w:t>
       </w:r>
     </w:p>
     <w:p>
@@ -144,7 +144,7 @@
     </w:p>
     <w:p>
       <w:r>
-        <w:t>14. Tailscale SaaS vs Headscale comparison</w:t>
+        <w:t>14. Comparison: Tailscale SaaS vs Headscale</w:t>
       </w:r>
     </w:p>
     <w:p>
@@ -169,7 +169,7 @@
           <w:b w:val="0"/>
           <w:i w:val="0"/>
         </w:rPr>
-        <w:t>Helios is a fictional B2B SaaS company (B2B SaaS for AP automation aimed at fintechs) used as a vehicle to validate the corporate access management pattern with Tailscale.</w:t>
+        <w:t>Helios is a fictional B2B SaaS company (B2B SaaS for accounts-payable automation used by fintechs) used as the vehicle to validate the corporate access-management pattern with Tailscale.</w:t>
       </w:r>
     </w:p>
     <w:p>
@@ -178,7 +178,7 @@
           <w:b w:val="0"/>
           <w:i w:val="0"/>
         </w:rPr>
-        <w:t>The POC demonstrates that an organization of ~50 employees can replace OpenVPN with Tailscale + Google Workspace SSO + tag-based ACLs, obtaining granularity per team, environment, and resource, with less attack surface and a better user experience.</w:t>
+        <w:t>The POC proves that an organization of ~50 employees can replace OpenVPN with Tailscale + Google Workspace SSO + tag-based ACLs, gaining per-team, per-environment, and per-resource granularity with less attack surface and a better user experience.</w:t>
       </w:r>
     </w:p>
     <w:p>
@@ -195,7 +195,7 @@
         <w:pStyle w:val="ListBullet"/>
       </w:pPr>
       <w:r>
-        <w:t>10 services + 9 personas + 1 simulated EKS cluster operated with a single CLI (heliosctl).</w:t>
+        <w:t>10 services + 9 personas + 1 simulated EKS cluster operated by a single CLI (heliosctl).</w:t>
       </w:r>
     </w:p>
     <w:p>
@@ -203,7 +203,7 @@
         <w:pStyle w:val="ListBullet"/>
       </w:pPr>
       <w:r>
-        <w:t>13 tags in the policy allow fine-grained control per team, environment, and privilege level.</w:t>
+        <w:t>13 tags in the policy give fine-grained control by team, environment, and privilege level.</w:t>
       </w:r>
     </w:p>
     <w:p>
@@ -219,7 +219,7 @@
         <w:pStyle w:val="ListBullet"/>
       </w:pPr>
       <w:r>
-        <w:t>The pattern is portable: the same policy.hujson works in both Tailscale SaaS and Headscale self-hosted.</w:t>
+        <w:t>The pattern is portable: the same policy.hujson works on both Tailscale SaaS and self-hosted Headscale.</w:t>
       </w:r>
     </w:p>
     <w:p>
@@ -243,7 +243,7 @@
         <w:rPr>
           <w:color w:val="1F4E79"/>
         </w:rPr>
-        <w:t>2. POC architecture</w:t>
+        <w:t>2. POC Architecture</w:t>
       </w:r>
     </w:p>
     <w:p>
@@ -252,7 +252,7 @@
           <w:b w:val="0"/>
           <w:i w:val="0"/>
         </w:rPr>
-        <w:t>The POC is composed of 5 layers: identity, control plane, services, data, and personas. Each layer is a separate domain; crossings between layers go through the tailnet.</w:t>
+        <w:t>The POC is composed of 5 layers: identity, control plane, services, data, and personas. Each layer is a separate domain; cross-layer hops go through the tailnet.</w:t>
       </w:r>
     </w:p>
     <w:p>
@@ -301,7 +301,7 @@
           <w:color w:val="666666"/>
           <w:sz w:val="18"/>
         </w:rPr>
-        <w:t>Figure: Layered architecture of the Helios POC</w:t>
+        <w:t>Figura: Layer architecture of the Helios POC</w:t>
       </w:r>
     </w:p>
     <w:p>
@@ -310,7 +310,7 @@
           <w:b/>
           <w:i w:val="0"/>
         </w:rPr>
-        <w:t>Key architectural decisions:</w:t>
+        <w:t>Key architecture decisions:</w:t>
       </w:r>
     </w:p>
     <w:p>
@@ -318,7 +318,7 @@
         <w:rPr>
           <w:b/>
         </w:rPr>
-        <w:t xml:space="preserve">• Per-container tailscale sidecar: </w:t>
+        <w:t xml:space="preserve">• Tailscale sidecar per container: </w:t>
       </w:r>
       <w:r>
         <w:t>Each service has a `tailscale/tailscale:latest` sidecar that shares the network namespace. The service sees the `tailscale0` interface and resolves MagicDNS as if it were in the real tailnet.</w:t>
@@ -332,7 +332,7 @@
         <w:t xml:space="preserve">• One isolated Docker network per node: </w:t>
       </w:r>
       <w:r>
-        <w:t>Forces inter-service traffic to cross the real tailnet, not Compose's embedded DNS. Without this, ACLs would be irrelevant.</w:t>
+        <w:t>Forces service-to-service traffic to cross the real tailnet rather than the embedded Compose DNS. Without this, ACLs would be meaningless.</w:t>
       </w:r>
     </w:p>
     <w:p>
@@ -343,7 +343,7 @@
         <w:t xml:space="preserve">• environment as a map, not a list: </w:t>
       </w:r>
       <w:r>
-        <w:t>Known Compose bug: if `environment:` is a list, `&lt;&lt;: *ts-env` overwrites everything. As a map, it merges correctly. Critical so `TS_USERSPACE=false` isn't lost.</w:t>
+        <w:t>Known Compose gotcha: if `environment:` is a list, `&lt;&lt;: *ts-env` overwrites everything. As a map, it merges correctly. Critical so `TS_USERSPACE=false` is not lost.</w:t>
       </w:r>
     </w:p>
     <w:p>
@@ -351,10 +351,10 @@
         <w:rPr>
           <w:b/>
         </w:rPr>
-        <w:t xml:space="preserve">• Simulated IdP (Authentik) → real IdP (Google Workspace) drop-in: </w:t>
-      </w:r>
-      <w:r>
-        <w:t>The swap in prod is 1 line: change the issuer URL. The policy doesn't need modification.</w:t>
+        <w:t xml:space="preserve">• Simulated IdP (Authentik) -&gt; Real IdP (Google Workspace) drop-in: </w:t>
+      </w:r>
+      <w:r>
+        <w:t>Prod swap is a one-line change: update the issuer URL. The policy does not need to change.</w:t>
       </w:r>
     </w:p>
     <w:p>
@@ -362,10 +362,10 @@
         <w:rPr>
           <w:b/>
         </w:rPr>
-        <w:t xml:space="preserve">• Simulated EKS with kind: </w:t>
-      </w:r>
-      <w:r>
-        <w:t>Allows validating RBAC + tag-based access without spending on a real cluster. Differences documented in `eks/docs/overview.md`.</w:t>
+        <w:t xml:space="preserve">• EKS simulated with kind: </w:t>
+      </w:r>
+      <w:r>
+        <w:t>Lets you validate RBAC + tag-based access without paying for a real cluster. Differences are documented in `eks/docs/overview.md`.</w:t>
       </w:r>
     </w:p>
     <w:p>
@@ -903,7 +903,7 @@
               <w:rPr>
                 <w:sz w:val="18"/>
               </w:rPr>
-              <w:t>ETL: primary → warehouse</w:t>
+              <w:t>ETL: primary -&gt; warehouse</w:t>
             </w:r>
           </w:p>
         </w:tc>
@@ -1119,7 +1119,7 @@
               <w:rPr>
                 <w:sz w:val="18"/>
               </w:rPr>
-              <w:t>Internal portal (employee-facing)</w:t>
+              <w:t>Internal employee-facing portal</w:t>
             </w:r>
           </w:p>
         </w:tc>
@@ -1173,7 +1173,7 @@
               <w:rPr>
                 <w:sz w:val="18"/>
               </w:rPr>
-              <w:t>Diego, Rafa, Sam, Lena, Carla, Tomás, Nina, Eve</w:t>
+              <w:t>Diego, Rafa, Sam, Lena, Carla, Tomas, Nina, Eve</w:t>
             </w:r>
           </w:p>
         </w:tc>
@@ -1185,7 +1185,7 @@
           <w:b/>
           <w:i w:val="0"/>
         </w:rPr>
-        <w:t>Supporting components (not services):</w:t>
+        <w:t>Support components (not services):</w:t>
       </w:r>
     </w:p>
     <w:tbl>
@@ -1609,7 +1609,7 @@
         <w:rPr>
           <w:color w:val="1F4E79"/>
         </w:rPr>
-        <w:t>4. Tag and services map</w:t>
+        <w:t>4. Tag and service map</w:t>
       </w:r>
     </w:p>
     <w:p>
@@ -1618,7 +1618,7 @@
           <w:b w:val="0"/>
           <w:i w:val="0"/>
         </w:rPr>
-        <w:t>The POC defines 13 tags modeling each service or resource. Google groups (from IdP) and service tags (from intermediate services) combine to form the access control matrix.</w:t>
+        <w:t>The POC defines 13 tags that model every service or resource. Google groups (from the IdP) and service tags (from intermediate services) combine to form the access-control matrix.</w:t>
       </w:r>
     </w:p>
     <w:p>
@@ -1667,7 +1667,7 @@
           <w:color w:val="666666"/>
           <w:sz w:val="18"/>
         </w:rPr>
-        <w:t>Figure: Mapping of groups and nested tags to service tags</w:t>
+        <w:t>Figura: Mapping of groups and nested tags to service tags</w:t>
       </w:r>
     </w:p>
     <w:p>
@@ -1774,7 +1774,7 @@
         <w:rPr>
           <w:color w:val="1F4E79"/>
         </w:rPr>
-        <w:t>5. Access matrix (roles × resources)</w:t>
+        <w:t>5. Access matrix (roles x resources)</w:t>
       </w:r>
     </w:p>
     <w:p>
@@ -1783,14 +1783,14 @@
           <w:b w:val="0"/>
           <w:i w:val="0"/>
         </w:rPr>
-        <w:t>Each green cell indicates the role can reach the service; each red cell indicates deny. The matrix is built entirely from policy.hujson. This is the most important view for auditors and security review.</w:t>
+        <w:t>Each green cell means the role can reach the service; each red cell means deny. The matrix is built entirely from policy.hujson. This is the most important view for auditors and security review.</w:t>
       </w:r>
     </w:p>
     <w:p>
       <w:r>
         <w:drawing>
           <wp:inline xmlns:a="http://schemas.openxmlformats.org/drawingml/2006/main" xmlns:pic="http://schemas.openxmlformats.org/drawingml/2006/picture">
-            <wp:extent cx="6400800" cy="3953203"/>
+            <wp:extent cx="6400800" cy="3964468"/>
             <wp:docPr id="3" name="Picture 3"/>
             <wp:cNvGraphicFramePr>
               <a:graphicFrameLocks noChangeAspect="1"/>
@@ -1811,7 +1811,7 @@
                   <pic:spPr>
                     <a:xfrm>
                       <a:off x="0" y="0"/>
-                      <a:ext cx="6400800" cy="3953203"/>
+                      <a:ext cx="6400800" cy="3964468"/>
                     </a:xfrm>
                     <a:prstGeom prst="rect"/>
                   </pic:spPr>
@@ -1832,7 +1832,7 @@
           <w:color w:val="666666"/>
           <w:sz w:val="18"/>
         </w:rPr>
-        <w:t>Figure: Access matrix derived from policy.hujson</w:t>
+        <w:t>Figura: Access matrix derived from policy.hujson</w:t>
       </w:r>
     </w:p>
     <w:p>
@@ -1849,7 +1849,7 @@
         <w:pStyle w:val="ListBullet"/>
       </w:pPr>
       <w:r>
-        <w:t>Default-deny: any (src, dst) not explicitly allowed is DENIED.</w:t>
+        <w:t>Default-deny: any (src, dst) not explicitly permitted is DENIED.</w:t>
       </w:r>
     </w:p>
     <w:p>
@@ -1857,7 +1857,7 @@
         <w:pStyle w:val="ListBullet"/>
       </w:pPr>
       <w:r>
-        <w:t>Tags as service identity: identity-bridge and warehouse-job can touch primary-db; no one else.</w:t>
+        <w:t>Tags as service identity: identity-bridge and warehouse-job may touch primary-db; nobody else.</w:t>
       </w:r>
     </w:p>
     <w:p>
@@ -1865,7 +1865,7 @@
         <w:pStyle w:val="ListBullet"/>
       </w:pPr>
       <w:r>
-        <w:t>Granularity by port on EKS: 9100 = metrics (everyone), 9101 = logs (no auditors), 9102 = exec (sre-lead only).</w:t>
+        <w:t>Per-port granularity in EKS: 9100 = metrics (everyone), 9101 = logs (no auditors), 9102 = exec (sre-lead only).</w:t>
       </w:r>
     </w:p>
     <w:p>
@@ -1873,7 +1873,7 @@
         <w:pStyle w:val="ListBullet"/>
       </w:pPr>
       <w:r>
-        <w:t>External users do NOT touch infra: customer-success and sales-eng do not reach admin-portal nor DBs.</w:t>
+        <w:t>External users do NOT touch infra: customer-success and sales-eng cannot reach admin-portal or any DB.</w:t>
       </w:r>
     </w:p>
     <w:p>
@@ -1906,7 +1906,7 @@
           <w:b w:val="0"/>
           <w:i w:val="0"/>
         </w:rPr>
-        <w:t>Each app is a realistic mock of the service it represents. They are built in Flask (Python 3.12) for portability and simplicity. In production, they would be replaced by Helios's real services without changing the network contract.</w:t>
+        <w:t>Each app is a realistic mock of the service it represents. They are built on Flask (Python 3.12) for portability and simplicity. In production, they would be replaced by Helios's real services without changing the network contract.</w:t>
       </w:r>
     </w:p>
     <w:p>
@@ -1917,7 +1917,7 @@
         <w:rPr>
           <w:color w:val="1F4E79"/>
         </w:rPr>
-        <w:t xml:space="preserve">  • admin-portal (port 8080)</w:t>
+        <w:t xml:space="preserve">  - admin-portal (port 8080)</w:t>
       </w:r>
     </w:p>
     <w:p>
@@ -1970,7 +1970,7 @@
         <w:rPr>
           <w:color w:val="1F4E79"/>
         </w:rPr>
-        <w:t xml:space="preserve">  • identity-bridge (port 9090)</w:t>
+        <w:t xml:space="preserve">  - identity-bridge (port 9090)</w:t>
       </w:r>
     </w:p>
     <w:p>
@@ -1979,7 +1979,7 @@
           <w:b w:val="0"/>
           <w:i w:val="0"/>
         </w:rPr>
-        <w:t>Generic SSO bridge. Reads DB credentials from MiniStack (simulated Secrets Manager) at runtime. Lazy cache so it doesn't fail at boot if MiniStack isn't ready.</w:t>
+        <w:t>Generic SSO bridge. Reads DB credentials from MiniStack (Secrets Manager sim) at runtime. Uses lazy caching so the boot does not fail if MiniStack is not yet ready.</w:t>
       </w:r>
     </w:p>
     <w:p>
@@ -2018,7 +2018,7 @@
         <w:rPr>
           <w:color w:val="1F4E79"/>
         </w:rPr>
-        <w:t xml:space="preserve">  • api-gateway (port 8443)</w:t>
+        <w:t xml:space="preserve">  - api-gateway (port 8443)</w:t>
       </w:r>
     </w:p>
     <w:p>
@@ -2027,7 +2027,7 @@
           <w:b w:val="0"/>
           <w:i w:val="0"/>
         </w:rPr>
-        <w:t>B2B REST API. Mock endpoints that return invoices and customers. In production, this would be the gateway that validates API keys against the customer portal.</w:t>
+        <w:t>B2B REST API. Mock endpoints returning invoices and customers. In production, this would be the gateway that validates API keys against the customer portal.</w:t>
       </w:r>
     </w:p>
     <w:p>
@@ -2065,7 +2065,7 @@
         <w:rPr>
           <w:color w:val="1F4E79"/>
         </w:rPr>
-        <w:t xml:space="preserve">  • customer-portal (port 9443)</w:t>
+        <w:t xml:space="preserve">  - customer-portal (port 9443)</w:t>
       </w:r>
     </w:p>
     <w:p>
@@ -2074,7 +2074,7 @@
           <w:b w:val="0"/>
           <w:i w:val="0"/>
         </w:rPr>
-        <w:t>External portal for Helios customers. In prod exposed via Tailscale Funnel (public HTTPS). Uses `socket.gethostname()` to identify the instance in logs.</w:t>
+        <w:t>External portal for Helios customers. In prod it is exposed via Tailscale Funnel (public HTTPS). Uses `socket.gethostname()` to identify the instance in logs.</w:t>
       </w:r>
     </w:p>
     <w:p>
@@ -2118,7 +2118,7 @@
         <w:rPr>
           <w:color w:val="1F4E79"/>
         </w:rPr>
-        <w:t xml:space="preserve">  • grafana (port 3000)</w:t>
+        <w:t xml:space="preserve">  - grafana (port 3000)</w:t>
       </w:r>
     </w:p>
     <w:p>
@@ -2127,7 +2127,7 @@
           <w:b w:val="0"/>
           <w:i w:val="0"/>
         </w:rPr>
-        <w:t>Real Grafana (not a mock). Pre-loaded with Prometheus datasource pointing to observability:9100 and a 'Helios POC — Overview' dashboard with DB pool and node count metrics.</w:t>
+        <w:t>Real Grafana (not a mock). Pre-loaded with a Prometheus datasource pointing at observability:9100 and a 'Helios POC - Overview' dashboard with DB pool and node-count metrics.</w:t>
       </w:r>
     </w:p>
     <w:p>
@@ -2161,7 +2161,7 @@
         <w:rPr>
           <w:color w:val="1F4E79"/>
         </w:rPr>
-        <w:t xml:space="preserve">  • intranet (port 7000)</w:t>
+        <w:t xml:space="preserve">  - intranet (port 7000)</w:t>
       </w:r>
     </w:p>
     <w:p>
@@ -2170,7 +2170,7 @@
           <w:b w:val="0"/>
           <w:i w:val="0"/>
         </w:rPr>
-        <w:t>Internal portal (employee-facing). Has sections `/engineering` (engineers only), `/admin-tools` (admins only), `/people` (public). Access decisions are made by evaluating the `Tailscale-User-Groups` headers against expected groups.</w:t>
+        <w:t>Internal portal (employee-facing). Has `/engineering` (engineers only), `/admin-tools` (admins only), `/people` (public) sections. Access decisions are made by evaluating `Tailscale-User-Groups` headers against expected groups.</w:t>
       </w:r>
     </w:p>
     <w:p>
@@ -2206,7 +2206,7 @@
         <w:rPr>
           <w:color w:val="1F4E79"/>
         </w:rPr>
-        <w:t xml:space="preserve">  • eks-gateway (port 9100/9101/9102)</w:t>
+        <w:t xml:space="preserve">  - eks-gateway (port 9100/9101/9102)</w:t>
       </w:r>
     </w:p>
     <w:p>
@@ -2215,7 +2215,7 @@
           <w:b w:val="0"/>
           <w:i w:val="0"/>
         </w:rPr>
-        <w:t>Simulates 3 EKS resources in a single container with different ports. Each port is a 'resource' from the ACL's point of view: metrics / logs / exec.</w:t>
+        <w:t>Simulates 3 EKS resources in a single container on different ports. Each port is a 'resource' from the ACL point of view: metrics / logs / exec.</w:t>
       </w:r>
     </w:p>
     <w:p>
@@ -2247,7 +2247,7 @@
         <w:rPr>
           <w:color w:val="1F4E79"/>
         </w:rPr>
-        <w:t xml:space="preserve">  • observability (port 9100)</w:t>
+        <w:t xml:space="preserve">  - observability (port 9100)</w:t>
       </w:r>
     </w:p>
     <w:p>
@@ -2256,7 +2256,7 @@
           <w:b w:val="0"/>
           <w:i w:val="0"/>
         </w:rPr>
-        <w:t>Service that emits metrics in Prometheus format. The Grafana dashboard consumes them. Maintains an in-memory access log that Nina (auditor) can read.</w:t>
+        <w:t>Service emitting Prometheus-formatted metrics. The Grafana dashboard consumes them. Keeps an in-memory access log that Nina (auditor) can read.</w:t>
       </w:r>
     </w:p>
     <w:p>
@@ -2294,7 +2294,7 @@
         <w:rPr>
           <w:color w:val="1F4E79"/>
         </w:rPr>
-        <w:t xml:space="preserve">  • ml-platform (port 8501)</w:t>
+        <w:t xml:space="preserve">  - ml-platform (port 8501)</w:t>
       </w:r>
     </w:p>
     <w:p>
@@ -2303,7 +2303,7 @@
           <w:b w:val="0"/>
           <w:i w:val="0"/>
         </w:rPr>
-        <w:t>Mock ML serving. Deterministic predictions (based on input hash) so tests are reproducible.</w:t>
+        <w:t>Mock ML serving. Deterministic predictions (based on a hash of the input) so tests are reproducible.</w:t>
       </w:r>
     </w:p>
     <w:p>
@@ -2337,7 +2337,7 @@
         <w:rPr>
           <w:color w:val="1F4E79"/>
         </w:rPr>
-        <w:t xml:space="preserve">  • warehouse-job (port n/a)</w:t>
+        <w:t xml:space="preserve">  - warehouse-job (port n/a)</w:t>
       </w:r>
     </w:p>
     <w:p>
@@ -2346,7 +2346,7 @@
           <w:b w:val="0"/>
           <w:i w:val="0"/>
         </w:rPr>
-        <w:t>One-shot ETL job. Reads invoices from primary-db, writes aggregates to warehouse-db. The only job that touches both DBs.</w:t>
+        <w:t>One-shot ETL job. Reads invoices from primary-db, writes aggregates into warehouse-db. The only job that touches both DBs.</w:t>
       </w:r>
     </w:p>
     <w:p>
@@ -2358,7 +2358,7 @@
           <w:rFonts w:ascii="Courier New" w:hAnsi="Courier New"/>
           <w:sz w:val="16"/>
         </w:rPr>
-        <w:t># Read invoices from primary-db, write aggregates to warehouse-db</w:t>
+        <w:t># Read invoices from primary-db, write aggregates into warehouse-db</w:t>
         <w:br/>
         <w:t>with psycopg.connect(_dsn(primary)) as conn:</w:t>
         <w:br/>
@@ -2394,7 +2394,7 @@
           <w:b w:val="0"/>
           <w:i w:val="0"/>
         </w:rPr>
-        <w:t>Authentik runs as a Docker container and simulates Google Workspace for the POC. It has an API that allows creating users, groups, and configuring an OIDC provider programmatically.</w:t>
+        <w:t>Authentik runs as a Docker container and simulates Google Workspace for the POC. It exposes an API to create users, groups, and configure an OIDC provider programmatically.</w:t>
       </w:r>
     </w:p>
     <w:p>
@@ -2455,7 +2455,7 @@
         <w:t xml:space="preserve">            api.add_user_to_group(user_pk, group_pks[gname])</w:t>
         <w:br/>
         <w:br/>
-        <w:t xml:space="preserve">    # Configure OIDC provider for Tailscale</w:t>
+        <w:t xml:space="preserve">    # Configure the OIDC provider for Tailscale</w:t>
         <w:br/>
         <w:t xml:space="preserve">    api.ensure_oidc_provider()</w:t>
       </w:r>
@@ -2529,7 +2529,7 @@
                 <w:color w:val="FFFFFF"/>
                 <w:sz w:val="20"/>
               </w:rPr>
-              <w:t>Role at Helios</w:t>
+              <w:t>Role in Helios</w:t>
             </w:r>
           </w:p>
         </w:tc>
@@ -2734,7 +2734,7 @@
               <w:rPr>
                 <w:sz w:val="18"/>
               </w:rPr>
-              <w:t>SRE + exec on EKS</w:t>
+              <w:t>SRE + exec in EKS</w:t>
             </w:r>
           </w:p>
         </w:tc>
@@ -2803,7 +2803,7 @@
               <w:rPr>
                 <w:sz w:val="18"/>
               </w:rPr>
-              <w:t>Tomás</w:t>
+              <w:t>Tomas</w:t>
             </w:r>
           </w:p>
         </w:tc>
@@ -2816,7 +2816,7 @@
               <w:rPr>
                 <w:sz w:val="18"/>
               </w:rPr>
-              <w:t>Prospect demos</w:t>
+              <w:t>Demos for prospects</w:t>
             </w:r>
           </w:p>
         </w:tc>
@@ -2910,7 +2910,7 @@
           <w:b w:val="0"/>
           <w:i w:val="0"/>
         </w:rPr>
-        <w:t>Important: groups are created in Authentik but NOT in Tailscale until a user logs in via SSO. The Tailscale API validates that each referenced `group:X` exists in the tailnet.</w:t>
+        <w:t>Important: groups are created in Authentik but NOT in Tailscale until a user logs in via SSO. The Tailscale API validates that every `group:X` referenced in the policy exists in the tailnet.</w:t>
       </w:r>
     </w:p>
     <w:p>
@@ -2935,7 +2935,7 @@
           <w:b w:val="0"/>
           <w:i w:val="0"/>
         </w:rPr>
-        <w:t>The `eks/` module brings up a real Kubernetes cluster using kind (3 nodes, 1 control-plane + 2 workers), applies 3 ClusterRoles (viewer/editor/admin) and deploys 3 workloads that simulate metrics, logs, and exec.</w:t>
+        <w:t>The `eks/` module spins up a real Kubernetes cluster using kind (3 nodes, 1 control-plane + 2 workers), applies 3 ClusterRoles (viewer/editor/admin), and deploys 3 workloads that simulate metrics, logs, and exec.</w:t>
       </w:r>
     </w:p>
     <w:p>
@@ -3166,7 +3166,7 @@
         <w:t>no</w:t>
         <w:br/>
         <w:br/>
-        <w:t># editor: read+write on dev, NOT on prod</w:t>
+        <w:t># editor: read+write in dev, NOT in prod</w:t>
         <w:br/>
         <w:t>$ kubectl auth can-i create pods --as=system:serviceaccount:kube-system:k8s-editor -n helios-dev</w:t>
         <w:br/>
@@ -3191,7 +3191,7 @@
           <w:b/>
           <w:i w:val="0"/>
         </w:rPr>
-        <w:t>Differences from real EKS:</w:t>
+        <w:t>Differences vs real EKS:</w:t>
       </w:r>
     </w:p>
     <w:tbl>
@@ -3254,7 +3254,7 @@
                 <w:color w:val="FFFFFF"/>
                 <w:sz w:val="20"/>
               </w:rPr>
-              <w:t>real EKS</w:t>
+              <w:t>EKS real</w:t>
             </w:r>
           </w:p>
         </w:tc>
@@ -3528,7 +3528,7 @@
           <w:b w:val="0"/>
           <w:i w:val="0"/>
         </w:rPr>
-        <w:t>Tailscale SaaS cannot call localhost for the OIDC callback. ngrok exposes Authentik (on localhost:9000) at a public HTTPS URL. That URL is configured as 'Issuer URL' in the Tailscale admin console.</w:t>
+        <w:t>Tailscale SaaS cannot reach localhost for the OIDC callback. ngrok exposes Authentik (on localhost:9000) at a public HTTPS URL. That URL is configured as the 'Issuer URL' in the Tailscale admin console.</w:t>
       </w:r>
     </w:p>
     <w:p>
@@ -3549,21 +3549,21 @@
           <w:rFonts w:ascii="Courier New" w:hAnsi="Courier New"/>
           <w:sz w:val="16"/>
         </w:rPr>
-        <w:t># 1. Obtener authtoken</w:t>
+        <w:t># 1. Get the authtoken</w:t>
         <w:br/>
         <w:t>$ ngrok config add-authtoken &lt;YOUR_TOKEN&gt;</w:t>
         <w:br/>
         <w:br/>
-        <w:t># 2. Bring up ngrok</w:t>
+        <w:t># 2. Bring ngrok up</w:t>
         <w:br/>
         <w:t>$ docker compose -f ngrok/docker-compose.ngrok.yml up -d</w:t>
         <w:br/>
         <w:br/>
-        <w:t># 3. Copy the public URL assigned by ngrok</w:t>
+        <w:t># 3. Copy the public URL ngrok assigned</w:t>
         <w:br/>
         <w:t>$ docker logs helios-ngrok | grep tunnel</w:t>
         <w:br/>
-        <w:t>→ https://abc123.ngrok-free.app → http://authentik-server:9000</w:t>
+        <w:t>-&gt; https://abc123.ngrok-free.app -&gt; http://authentik-server:9000</w:t>
         <w:br/>
         <w:br/>
         <w:t># 4. Configure Authentik with that public URL</w:t>
@@ -3573,7 +3573,7 @@
         <w:br/>
         <w:t># 5. Configure SSO in the Tailscale admin console</w:t>
         <w:br/>
-        <w:t>#    Settings → Single Sign-On → Connect Identity Provider</w:t>
+        <w:t>#    Settings -&gt; Single Sign-On -&gt; Connect Identity Provider</w:t>
         <w:br/>
         <w:t>#    Issuer URL: https://abc123.ngrok-free.app/application/o/helios-tailnet/</w:t>
         <w:br/>
@@ -3596,7 +3596,7 @@
         <w:pStyle w:val="ListBullet"/>
       </w:pPr>
       <w:r>
-        <w:t>Random URL on every restart (free plan). For paid demos: custom domain $8/mo.</w:t>
+        <w:t>Random URL on every restart (free plan). For paid demos: custom domain $8/month.</w:t>
       </w:r>
     </w:p>
     <w:p>
@@ -3604,7 +3604,7 @@
         <w:pStyle w:val="ListBullet"/>
       </w:pPr>
       <w:r>
-        <w:t>1 GB/mo bandwidth (free). OK for POC, not for prod.</w:t>
+        <w:t>1 GB/month bandwidth (free). OK for POC, not for prod.</w:t>
       </w:r>
     </w:p>
     <w:p>
@@ -3658,7 +3658,7 @@
         <w:br/>
         <w:t>$ curl -fsSL https://get.docker.com | sh</w:t>
         <w:br/>
-        <w:t>$ sudo usermod -aG docker $USER  # log out and back in</w:t>
+        <w:t>$ sudo usermod -aG docker $USER  # re-login</w:t>
         <w:br/>
         <w:t>$ # ... ngrok, kind, kubectl, terraform from their official sites</w:t>
       </w:r>
@@ -3692,7 +3692,7 @@
         <w:t>#   Paste TS_AUTHKEY_* (18), TAILSCALE_API_KEY, NGROK_AUTHTOKEN, passwords</w:t>
         <w:br/>
         <w:br/>
-        <w:t># 2. Bring up the whole stack</w:t>
+        <w:t># 2. Bring the whole stack up</w:t>
         <w:br/>
         <w:t>$ ./scripts/heliosctl start all</w:t>
         <w:br/>
@@ -3707,7 +3707,7 @@
         <w:t>$ ./scripts/demo.sh --fast</w:t>
         <w:br/>
         <w:br/>
-        <w:t># 5. Cleanup</w:t>
+        <w:t># 5. Clean up</w:t>
         <w:br/>
         <w:t>$ ./scripts/heliosctl stop all    # stop containers</w:t>
         <w:br/>
@@ -3814,7 +3814,7 @@
           <w:color w:val="333333"/>
           <w:sz w:val="16"/>
         </w:rPr>
-        <w:t>?[1m?[0;34m== POC end-to-end validation ==?[0m</w:t>
+        <w:t>== POC end-to-end validation ==</w:t>
       </w:r>
     </w:p>
     <w:p>
@@ -3839,7 +3839,7 @@
           <w:color w:val="333333"/>
           <w:sz w:val="16"/>
         </w:rPr>
-        <w:t>?[0;36mℹ?[0m 1. Check .env</w:t>
+        <w:t>ℹ 1. Check .env</w:t>
       </w:r>
     </w:p>
     <w:p>
@@ -3852,7 +3852,7 @@
           <w:color w:val="333333"/>
           <w:sz w:val="16"/>
         </w:rPr>
-        <w:t>?[0;32m✓?[0m   .env has 18 auth keys</w:t>
+        <w:t>✓   .env has 18 auth keys</w:t>
       </w:r>
     </w:p>
     <w:p>
@@ -3877,7 +3877,7 @@
           <w:color w:val="333333"/>
           <w:sz w:val="16"/>
         </w:rPr>
-        <w:t>?[0;36mℹ?[0m 2. Check docker-compose.yml</w:t>
+        <w:t>ℹ 2. Check docker-compose.yml</w:t>
       </w:r>
     </w:p>
     <w:p>
@@ -3890,7 +3890,7 @@
           <w:color w:val="333333"/>
           <w:sz w:val="16"/>
         </w:rPr>
-        <w:t>?[0;32m✓?[0m   docker-compose.yml is valid</w:t>
+        <w:t>✓   docker-compose.yml is valid</w:t>
       </w:r>
     </w:p>
     <w:p>
@@ -3915,7 +3915,7 @@
           <w:color w:val="333333"/>
           <w:sz w:val="16"/>
         </w:rPr>
-        <w:t>?[0;36mℹ?[0m 3. Check apps/ have Dockerfile OR base image</w:t>
+        <w:t>ℹ 3. Check apps/ have Dockerfile OR base image</w:t>
       </w:r>
     </w:p>
     <w:p>
@@ -3928,7 +3928,7 @@
           <w:color w:val="333333"/>
           <w:sz w:val="16"/>
         </w:rPr>
-        <w:t>?[0;32m✓?[0m   all apps have a Dockerfile or base image</w:t>
+        <w:t>✓   all apps have a Dockerfile or base image</w:t>
       </w:r>
     </w:p>
     <w:p>
@@ -3953,7 +3953,7 @@
           <w:color w:val="333333"/>
           <w:sz w:val="16"/>
         </w:rPr>
-        <w:t>?[0;36mℹ?[0m 4. Check acl/policy.hujson (JSONC)</w:t>
+        <w:t>ℹ 4. Check acl/policy.hujson (JSONC)</w:t>
       </w:r>
     </w:p>
     <w:p>
@@ -3991,7 +3991,7 @@
           <w:color w:val="333333"/>
           <w:sz w:val="16"/>
         </w:rPr>
-        <w:t>?[0;36mℹ?[0m 5. Check running containers</w:t>
+        <w:t>ℹ 5. Check running containers</w:t>
       </w:r>
     </w:p>
     <w:p>
@@ -4004,7 +4004,7 @@
           <w:color w:val="333333"/>
           <w:sz w:val="16"/>
         </w:rPr>
-        <w:t>?[1;33m⚠?[0m   9/18 containers running (some missing — sandbox pool limit?)</w:t>
+        <w:t>⚠   9/18 containers running (some missing — sandbox pool limit?)</w:t>
       </w:r>
     </w:p>
     <w:p>
@@ -4017,7 +4017,7 @@
           <w:color w:val="333333"/>
           <w:sz w:val="16"/>
         </w:rPr>
-        <w:t>?[0;36mℹ?[0m   run: heliosctl restart all (may fail due to docker network pool)</w:t>
+        <w:t>ℹ   run: heliosctl restart all (may fail due to docker network pool)</w:t>
       </w:r>
     </w:p>
     <w:p>
@@ -4042,7 +4042,7 @@
           <w:color w:val="333333"/>
           <w:sz w:val="16"/>
         </w:rPr>
-        <w:t>?[0;36mℹ?[0m 6. Check Tailscale API access</w:t>
+        <w:t>ℹ 6. Check Tailscale API access</w:t>
       </w:r>
     </w:p>
     <w:p>
@@ -4055,7 +4055,7 @@
           <w:color w:val="333333"/>
           <w:sz w:val="16"/>
         </w:rPr>
-        <w:t>?[0;36mℹ?[0m   TAILSCALE_API_KEY not set — skip</w:t>
+        <w:t>ℹ   TAILSCALE_API_KEY not set — skip</w:t>
       </w:r>
     </w:p>
     <w:p>
@@ -4080,7 +4080,7 @@
           <w:color w:val="333333"/>
           <w:sz w:val="16"/>
         </w:rPr>
-        <w:t>?[0;36mℹ?[0m 7. Check ngrok</w:t>
+        <w:t>ℹ 7. Check ngrok</w:t>
       </w:r>
     </w:p>
     <w:p>
@@ -4093,7 +4093,7 @@
           <w:color w:val="333333"/>
           <w:sz w:val="16"/>
         </w:rPr>
-        <w:t>?[0;32m✓?[0m   ngrok running: https://sardine-overact-blast.***REDACTED***.dev</w:t>
+        <w:t>✓   ngrok running: https://sardine-overact-blast.***REDACTED***.dev</w:t>
       </w:r>
     </w:p>
     <w:p>
@@ -4118,7 +4118,7 @@
           <w:color w:val="333333"/>
           <w:sz w:val="16"/>
         </w:rPr>
-        <w:t>?[0;32m✓?[0m ✓ Validation OK — POC ready to use</w:t>
+        <w:t>✓ ✓ Validation OK — POC ready to use</w:t>
       </w:r>
     </w:p>
     <w:p>
@@ -4185,7 +4185,7 @@
                 <w:color w:val="FFFFFF"/>
                 <w:sz w:val="20"/>
               </w:rPr>
-              <w:t>State</w:t>
+              <w:t>Status</w:t>
             </w:r>
           </w:p>
         </w:tc>
@@ -4217,7 +4217,7 @@
               <w:rPr>
                 <w:sz w:val="18"/>
               </w:rPr>
-              <w:t>.env has ≥10 auth keys</w:t>
+              <w:t>.env has &gt;=10 auth keys</w:t>
             </w:r>
           </w:p>
         </w:tc>
@@ -4230,7 +4230,7 @@
               <w:rPr>
                 <w:sz w:val="18"/>
               </w:rPr>
-              <w:t>✓</w:t>
+              <w:t>OK</w:t>
             </w:r>
           </w:p>
         </w:tc>
@@ -4271,7 +4271,7 @@
               <w:rPr>
                 <w:sz w:val="18"/>
               </w:rPr>
-              <w:t>✓</w:t>
+              <w:t>OK</w:t>
             </w:r>
           </w:p>
         </w:tc>
@@ -4299,7 +4299,7 @@
               <w:rPr>
                 <w:sz w:val="18"/>
               </w:rPr>
-              <w:t>Apps have Dockerfile or base image</w:t>
+              <w:t>Apps have a Dockerfile or base image</w:t>
             </w:r>
           </w:p>
         </w:tc>
@@ -4312,7 +4312,7 @@
               <w:rPr>
                 <w:sz w:val="18"/>
               </w:rPr>
-              <w:t>✓</w:t>
+              <w:t>OK</w:t>
             </w:r>
           </w:p>
         </w:tc>
@@ -4353,7 +4353,7 @@
               <w:rPr>
                 <w:sz w:val="18"/>
               </w:rPr>
-              <w:t>✓</w:t>
+              <w:t>OK</w:t>
             </w:r>
           </w:p>
         </w:tc>
@@ -4394,7 +4394,7 @@
               <w:rPr>
                 <w:sz w:val="18"/>
               </w:rPr>
-              <w:t>⚠</w:t>
+              <w:t>WARN</w:t>
             </w:r>
           </w:p>
         </w:tc>
@@ -4407,7 +4407,7 @@
               <w:rPr>
                 <w:sz w:val="18"/>
               </w:rPr>
-              <w:t>not started in sandbox due to address pool limit</w:t>
+              <w:t>not brought up in sandbox due to address pool limit</w:t>
             </w:r>
           </w:p>
         </w:tc>
@@ -4422,7 +4422,7 @@
               <w:rPr>
                 <w:sz w:val="18"/>
               </w:rPr>
-              <w:t>Tailscale API accessible</w:t>
+              <w:t>Tailscale API reachable</w:t>
             </w:r>
           </w:p>
         </w:tc>
@@ -4489,7 +4489,7 @@
               <w:rPr>
                 <w:sz w:val="18"/>
               </w:rPr>
-              <w:t>not started in this test</w:t>
+              <w:t>not brought up in this test</w:t>
             </w:r>
           </w:p>
         </w:tc>
@@ -4517,7 +4517,7 @@
           <w:b w:val="0"/>
           <w:i w:val="0"/>
         </w:rPr>
-        <w:t>With NGROK_AUTHTOKEN configured in .env, ngrok started a public HTTPS tunnel that redirects to Authentik-server:9000 inside the Docker network. The public URL is what Tailscale SaaS would use as redirect_uri for the SSO callback (instead of localhost:9000 which is unreachable from Tailscale's servers).</w:t>
+        <w:t>With NGROK_AUTHTOKEN configured in .env, ngrok started a public HTTPS tunnel that forwards to Authentik-server:9000 inside the Docker network. That public URL is what Tailscale SaaS would use as redirect_uri for the SSO callback (instead of localhost:9000, which is unreachable from Tailscale's servers).</w:t>
       </w:r>
     </w:p>
     <w:p>
@@ -4526,7 +4526,7 @@
           <w:b/>
           <w:i w:val="0"/>
         </w:rPr>
-        <w:t>Current tunnel state:</w:t>
+        <w:t>Current tunnel status:</w:t>
       </w:r>
     </w:p>
     <w:tbl>
@@ -4599,7 +4599,7 @@
               <w:rPr>
                 <w:sz w:val="18"/>
               </w:rPr>
-              <w:t>authentik → http://authentik-server:9000</w:t>
+              <w:t>authentik -&gt; http://authentik-server:9000</w:t>
             </w:r>
           </w:p>
         </w:tc>
@@ -4795,7 +4795,7 @@
               <w:rPr>
                 <w:sz w:val="18"/>
               </w:rPr>
-              <w:t>HTTP 302 → /if/flow/default-authentication-flow/ → HTTP 200</w:t>
+              <w:t>HTTP 302 -&gt; /if/flow/default-authentication-flow/ -&gt; HTTP 200</w:t>
             </w:r>
           </w:p>
         </w:tc>
@@ -4835,7 +4835,7 @@
           <w:b/>
           <w:i w:val="0"/>
         </w:rPr>
-        <w:t>Next step — use the public URL in Tailscale SSO:</w:t>
+        <w:t>Next step - use the public URL in Tailscale SSO:</w:t>
       </w:r>
     </w:p>
     <w:p>
@@ -4846,13 +4846,13 @@
         </w:rPr>
         <w:t>1. Copy the public URL: https://sardine-overact-blast.ngrok-free.dev</w:t>
         <w:br/>
-        <w:t>2. In Tailscale admin console: Settings → SSO → Configure → Authentik issuer URL = that URL</w:t>
+        <w:t>2. In Tailscale admin console: Settings -&gt; SSO -&gt; Configure -&gt; Authentik issuer URL = that URL</w:t>
         <w:br/>
         <w:t>3. Redirect URI: https://sardine-overact-blast.ngrok-free.dev/application/o/callback/</w:t>
         <w:br/>
         <w:t>4. Authentik application: helios-tailnet (already created by bootstrap), add the URL</w:t>
         <w:br/>
-        <w:t>5. Click 'Test connection' in Tailscale — it should open the Authentik flow</w:t>
+        <w:t>5. Click 'Test connection' in Tailscale - it should open the Authentik flow</w:t>
         <w:br/>
         <w:t>6. Once SSO works, Google Workspace users can log in via the simulated IdP</w:t>
       </w:r>
@@ -4916,7 +4916,7 @@
           <w:color w:val="333333"/>
           <w:sz w:val="16"/>
         </w:rPr>
-        <w:t>ngrok web UI: http://localhost:4040 (en el sandbox)</w:t>
+        <w:t>ngrok web UI: http://localhost:4040 (in this sandbox)</w:t>
       </w:r>
     </w:p>
     <w:p>
@@ -5055,7 +5055,7 @@
           <w:color w:val="333333"/>
           <w:sz w:val="16"/>
         </w:rPr>
-        <w:t>[4] ngrok tunnel inspection (de localhost:4040):</w:t>
+        <w:t>[4] ngrok tunnel inspection (from localhost:4040):</w:t>
       </w:r>
     </w:p>
     <w:p>
@@ -5119,7 +5119,7 @@
           <w:color w:val="333333"/>
           <w:sz w:val="16"/>
         </w:rPr>
-        <w:t>[5] Docker network routing (ngrok → authentik-server):</w:t>
+        <w:t>[5] Docker network routing (ngrok -&gt; authentik-server):</w:t>
       </w:r>
     </w:p>
     <w:p>
@@ -5162,7 +5162,7 @@
           <w:b w:val="0"/>
           <w:i/>
         </w:rPr>
-        <w:t>After adding NGROK_AUTHTOKEN to .env, bringing up ngrok and Authentik, and applying three fixes to heliosctl (tsctl.py path, is_running, partial-containers not failed, URL pattern .ngrok-free.dev), `heliosctl validate` passes all 7 checks:</w:t>
+        <w:t>After adding NGROK_AUTHTOKEN to .env, bringing ngrok and Authentik up, and applying three fixes to heliosctl (tsctl.py path, is_running, partial-containers-not-failed, URL pattern .ngrok-free.dev), `heliosctl validate` passes all 7 checks:</w:t>
       </w:r>
     </w:p>
     <w:p>
@@ -5198,7 +5198,7 @@
           <w:color w:val="333333"/>
           <w:sz w:val="16"/>
         </w:rPr>
-        <w:t>?[1m?[0;34m== POC end-to-end validation ==?[0m</w:t>
+        <w:t>== POC end-to-end validation ==</w:t>
       </w:r>
     </w:p>
     <w:p>
@@ -5223,7 +5223,7 @@
           <w:color w:val="333333"/>
           <w:sz w:val="16"/>
         </w:rPr>
-        <w:t>?[0;36mℹ?[0m 1. Check .env</w:t>
+        <w:t>ℹ 1. Check .env</w:t>
       </w:r>
     </w:p>
     <w:p>
@@ -5236,7 +5236,7 @@
           <w:color w:val="333333"/>
           <w:sz w:val="16"/>
         </w:rPr>
-        <w:t>?[0;32m✓?[0m   .env has 18 auth keys</w:t>
+        <w:t>✓   .env has 18 auth keys</w:t>
       </w:r>
     </w:p>
     <w:p>
@@ -5261,7 +5261,7 @@
           <w:color w:val="333333"/>
           <w:sz w:val="16"/>
         </w:rPr>
-        <w:t>?[0;36mℹ?[0m 2. Check docker-compose.yml</w:t>
+        <w:t>ℹ 2. Check docker-compose.yml</w:t>
       </w:r>
     </w:p>
     <w:p>
@@ -5274,7 +5274,7 @@
           <w:color w:val="333333"/>
           <w:sz w:val="16"/>
         </w:rPr>
-        <w:t>?[0;32m✓?[0m   docker-compose.yml is valid</w:t>
+        <w:t>✓   docker-compose.yml is valid</w:t>
       </w:r>
     </w:p>
     <w:p>
@@ -5299,7 +5299,7 @@
           <w:color w:val="333333"/>
           <w:sz w:val="16"/>
         </w:rPr>
-        <w:t>?[0;36mℹ?[0m 3. Check apps/ have Dockerfile OR base image</w:t>
+        <w:t>ℹ 3. Check apps/ have Dockerfile OR base image</w:t>
       </w:r>
     </w:p>
     <w:p>
@@ -5312,7 +5312,7 @@
           <w:color w:val="333333"/>
           <w:sz w:val="16"/>
         </w:rPr>
-        <w:t>?[0;32m✓?[0m   all apps have a Dockerfile or base image</w:t>
+        <w:t>✓   all apps have a Dockerfile or base image</w:t>
       </w:r>
     </w:p>
     <w:p>
@@ -5337,7 +5337,7 @@
           <w:color w:val="333333"/>
           <w:sz w:val="16"/>
         </w:rPr>
-        <w:t>?[0;36mℹ?[0m 4. Check acl/policy.hujson (JSONC)</w:t>
+        <w:t>ℹ 4. Check acl/policy.hujson (JSONC)</w:t>
       </w:r>
     </w:p>
     <w:p>
@@ -5375,7 +5375,7 @@
           <w:color w:val="333333"/>
           <w:sz w:val="16"/>
         </w:rPr>
-        <w:t>?[0;36mℹ?[0m 5. Check running containers</w:t>
+        <w:t>ℹ 5. Check running containers</w:t>
       </w:r>
     </w:p>
     <w:p>
@@ -5388,7 +5388,7 @@
           <w:color w:val="333333"/>
           <w:sz w:val="16"/>
         </w:rPr>
-        <w:t>?[1;33m⚠?[0m   9/18 containers running (some missing — sandbox pool limit?)</w:t>
+        <w:t>⚠   9/18 containers running (some missing — sandbox pool limit?)</w:t>
       </w:r>
     </w:p>
     <w:p>
@@ -5401,7 +5401,7 @@
           <w:color w:val="333333"/>
           <w:sz w:val="16"/>
         </w:rPr>
-        <w:t>?[0;36mℹ?[0m   run: heliosctl restart all (may fail due to docker network pool)</w:t>
+        <w:t>ℹ   run: heliosctl restart all (may fail due to docker network pool)</w:t>
       </w:r>
     </w:p>
     <w:p>
@@ -5426,7 +5426,7 @@
           <w:color w:val="333333"/>
           <w:sz w:val="16"/>
         </w:rPr>
-        <w:t>?[0;36mℹ?[0m 6. Check Tailscale API access</w:t>
+        <w:t>ℹ 6. Check Tailscale API access</w:t>
       </w:r>
     </w:p>
     <w:p>
@@ -5439,7 +5439,7 @@
           <w:color w:val="333333"/>
           <w:sz w:val="16"/>
         </w:rPr>
-        <w:t>?[0;36mℹ?[0m   TAILSCALE_API_KEY not set — skip</w:t>
+        <w:t>ℹ   TAILSCALE_API_KEY not set — skip</w:t>
       </w:r>
     </w:p>
     <w:p>
@@ -5464,7 +5464,7 @@
           <w:color w:val="333333"/>
           <w:sz w:val="16"/>
         </w:rPr>
-        <w:t>?[0;36mℹ?[0m 7. Check ngrok</w:t>
+        <w:t>ℹ 7. Check ngrok</w:t>
       </w:r>
     </w:p>
     <w:p>
@@ -5477,7 +5477,7 @@
           <w:color w:val="333333"/>
           <w:sz w:val="16"/>
         </w:rPr>
-        <w:t>?[0;32m✓?[0m   ngrok running: https://sardine-overact-blast.***REDACTED***.dev</w:t>
+        <w:t>✓   ngrok running: https://sardine-overact-blast.***REDACTED***.dev</w:t>
       </w:r>
     </w:p>
     <w:p>
@@ -5502,7 +5502,7 @@
           <w:color w:val="333333"/>
           <w:sz w:val="16"/>
         </w:rPr>
-        <w:t>?[0;32m✓?[0m ✓ Validation OK — POC ready to use</w:t>
+        <w:t>✓ ✓ Validation OK — POC ready to use</w:t>
       </w:r>
     </w:p>
     <w:p>
@@ -5530,7 +5530,7 @@
         <w:rPr>
           <w:color w:val="1F4E79"/>
         </w:rPr>
-        <w:t>11c. Real cross-service traffic (5 sidecars logged in tailnet, 100.x IPs)</w:t>
+        <w:t>11c. Cross-service real traffic (5 sidecars logged in tailnet, 100.x IPs)</w:t>
       </w:r>
     </w:p>
     <w:p>
@@ -5539,7 +5539,7 @@
           <w:b w:val="0"/>
           <w:i w:val="0"/>
         </w:rPr>
-        <w:t>In this sandbox 9 services of the new schema were brought up (admin-portal, identity-bridge, api-gateway, customer-portal, ml-platform, observability, primary-db, warehouse-db, grafana + intranet) with their tailscale sidecars. 5 of the sidecars authenticated with TS_AUTHKEY_* and logged into the cerberusbyte.com tailnet, receiving 100.x IPs and MagicDNS names (admin-portal.taila1b884.ts.net, etc.).</w:t>
+        <w:t>In this sandbox, 9 services from the new schema (admin-portal, identity-bridge, api-gateway, customer-portal, ml-platform, observability, primary-db, warehouse-db, grafana + intranet) were brought up with their tailscale sidecars. 5 of the sidecars authenticated with TS_AUTHKEY_* and logged into the tailnet cerberusbyte.com, receiving 100.x IPs and MagicDNS names (admin-portal.taila1b884.ts.net, etc.).</w:t>
       </w:r>
     </w:p>
     <w:p>
@@ -5548,7 +5548,7 @@
           <w:b/>
           <w:i w:val="0"/>
         </w:rPr>
-        <w:t>Logged-in sidecars state:</w:t>
+        <w:t>Logged-in sidecars status:</w:t>
       </w:r>
     </w:p>
     <w:tbl>
@@ -5629,7 +5629,7 @@
                 <w:color w:val="FFFFFF"/>
                 <w:sz w:val="20"/>
               </w:rPr>
-              <w:t>State</w:t>
+              <w:t>Status</w:t>
             </w:r>
           </w:p>
         </w:tc>
@@ -5927,7 +5927,7 @@
               <w:rPr>
                 <w:sz w:val="18"/>
               </w:rPr>
-              <w:t>—</w:t>
+              <w:t>-</w:t>
             </w:r>
           </w:p>
         </w:tc>
@@ -5940,7 +5940,7 @@
               <w:rPr>
                 <w:sz w:val="18"/>
               </w:rPr>
-              <w:t>—</w:t>
+              <w:t>-</w:t>
             </w:r>
           </w:p>
         </w:tc>
@@ -5981,7 +5981,7 @@
               <w:rPr>
                 <w:sz w:val="18"/>
               </w:rPr>
-              <w:t>—</w:t>
+              <w:t>-</w:t>
             </w:r>
           </w:p>
         </w:tc>
@@ -5994,7 +5994,7 @@
               <w:rPr>
                 <w:sz w:val="18"/>
               </w:rPr>
-              <w:t>—</w:t>
+              <w:t>-</w:t>
             </w:r>
           </w:p>
         </w:tc>
@@ -6019,7 +6019,7 @@
           <w:b/>
           <w:i w:val="0"/>
         </w:rPr>
-        <w:t>Result of cross-service HTTP via Tailscale WireGuard:</w:t>
+        <w:t>Cross-service HTTP via Tailscale WireGuard result:</w:t>
       </w:r>
     </w:p>
     <w:p>
@@ -6028,7 +6028,7 @@
           <w:b w:val="0"/>
           <w:i w:val="0"/>
         </w:rPr>
-        <w:t>From admin-portal (100.124.232.36) we attempted to reach the other 4 nodes via Tailscale overlay. Result: 0 ALLOW, 4 DENY. This is NOT a failure — it is the policy working as designed. The live rule in the tailnet requires src=autogroup:admin (human user), not src=tag:admin-portal (another tag). Therefore admin-portal cannot touch identity-bridge/api-gateway/ml-platform/observability via overlay.</w:t>
+        <w:t>From admin-portal (100.124.232.36) we attempted to reach the other 4 nodes via the Tailscale overlay. Result: 0 ALLOW, 4 DENY. This is NOT a failure - it is the policy working as designed. The live rule in the tailnet requires src=autogroup:admin (a human user), not src=tag:admin-portal (another tag). That is why admin-portal cannot reach identity-bridge/api-gateway/ml-platform/observability via the overlay.</w:t>
       </w:r>
     </w:p>
     <w:p>
@@ -6039,7 +6039,7 @@
           <w:color w:val="666666"/>
           <w:sz w:val="18"/>
         </w:rPr>
-        <w:t>$ cross_service_real.py (admin-portal → 4 nodes via Tailscale)</w:t>
+        <w:t>$ cross_service_real.py (admin-portal -&gt; 4 nodes via Tailscale)</w:t>
       </w:r>
     </w:p>
     <w:p>
@@ -6116,7 +6116,7 @@
           <w:color w:val="333333"/>
           <w:sz w:val="16"/>
         </w:rPr>
-        <w:t>[1] HTTP traffic desde admin-portal (100.124.232.36) hacia los otros:</w:t>
+        <w:t>[1] HTTP traffic from admin-portal (100.124.232.36) to the others:</w:t>
       </w:r>
     </w:p>
     <w:p>
@@ -6142,7 +6142,7 @@
           <w:color w:val="333333"/>
           <w:sz w:val="16"/>
         </w:rPr>
-        <w:t xml:space="preserve">  admin-portal → identity-bridge      DENY                 URL ERR: [Errno 113] No route to host</w:t>
+        <w:t xml:space="preserve">  admin-portal -&gt; identity-bridge      DENY                 URL ERR: [Errno 113] No route to host</w:t>
       </w:r>
     </w:p>
     <w:p>
@@ -6155,7 +6155,7 @@
           <w:color w:val="333333"/>
           <w:sz w:val="16"/>
         </w:rPr>
-        <w:t xml:space="preserve">  admin-portal → api-gateway          DENY                 URL ERR: [Errno 113] No route to host</w:t>
+        <w:t xml:space="preserve">  admin-portal -&gt; api-gateway          DENY                 URL ERR: [Errno 113] No route to host</w:t>
       </w:r>
     </w:p>
     <w:p>
@@ -6168,7 +6168,7 @@
           <w:color w:val="333333"/>
           <w:sz w:val="16"/>
         </w:rPr>
-        <w:t xml:space="preserve">  admin-portal → ml-platform          DENY                 URL ERR: [Errno 113] No route to host</w:t>
+        <w:t xml:space="preserve">  admin-portal -&gt; ml-platform          DENY                 URL ERR: [Errno 113] No route to host</w:t>
       </w:r>
     </w:p>
     <w:p>
@@ -6181,7 +6181,7 @@
           <w:color w:val="333333"/>
           <w:sz w:val="16"/>
         </w:rPr>
-        <w:t xml:space="preserve">  admin-portal → observability        DENY                 URL ERR: [Errno 113] No route to host</w:t>
+        <w:t xml:space="preserve">  admin-portal -&gt; observability        DENY                 URL ERR: [Errno 113] No route to host</w:t>
       </w:r>
     </w:p>
     <w:p>
@@ -6206,7 +6206,7 @@
           <w:color w:val="333333"/>
           <w:sz w:val="16"/>
         </w:rPr>
-        <w:t>[2] Self-traffic (admin-portal → admin-portal, debe ser ALLOW):</w:t>
+        <w:t>[2] Self-traffic (admin-portal -&gt; admin-portal, must be ALLOW):</w:t>
       </w:r>
     </w:p>
     <w:p>
@@ -6232,7 +6232,7 @@
           <w:color w:val="333333"/>
           <w:sz w:val="16"/>
         </w:rPr>
-        <w:t xml:space="preserve">  admin-portal → admin-portal        ALLOW               HTTP 200: {"status":"healthy"}</w:t>
+        <w:t xml:space="preserve">  admin-portal -&gt; admin-portal        ALLOW               HTTP 200: {"status":"healthy"}</w:t>
       </w:r>
     </w:p>
     <w:p>
@@ -6257,7 +6257,7 @@
           <w:color w:val="333333"/>
           <w:sz w:val="16"/>
         </w:rPr>
-        <w:t>[3] Resumen:</w:t>
+        <w:t>[3] Summary:</w:t>
       </w:r>
     </w:p>
     <w:p>
@@ -6334,7 +6334,7 @@
           <w:color w:val="333333"/>
           <w:sz w:val="16"/>
         </w:rPr>
-        <w:t>Interpretación:</w:t>
+        <w:t>Interpretation:</w:t>
       </w:r>
     </w:p>
     <w:p>
@@ -6347,7 +6347,7 @@
           <w:color w:val="333333"/>
           <w:sz w:val="16"/>
         </w:rPr>
-        <w:t xml:space="preserve">  - DENY aquí significa Errno 113 'No route to host' — Tailscale WireGuard</w:t>
+        <w:t xml:space="preserve">  - DENY here means Errno 113 'No route to host' - Tailscale WireGuard</w:t>
       </w:r>
     </w:p>
     <w:p>
@@ -6360,7 +6360,7 @@
           <w:color w:val="333333"/>
           <w:sz w:val="16"/>
         </w:rPr>
-        <w:t xml:space="preserve">    está droppeando los paquetes en la capa ACL porque admin-portal tiene</w:t>
+        <w:t xml:space="preserve">    is dropping packets at the ACL layer because admin-portal carries</w:t>
       </w:r>
     </w:p>
     <w:p>
@@ -6373,7 +6373,7 @@
           <w:color w:val="333333"/>
           <w:sz w:val="16"/>
         </w:rPr>
-        <w:t xml:space="preserve">    tag:admin-portal y la regla pide src=autogroup:admin (no tag).</w:t>
+        <w:t xml:space="preserve">    tag:admin-portal and the rule requires src=autogroup:admin (not a tag).</w:t>
       </w:r>
     </w:p>
     <w:p>
@@ -6386,7 +6386,7 @@
           <w:color w:val="333333"/>
           <w:sz w:val="16"/>
         </w:rPr>
-        <w:t xml:space="preserve">  - Esto ES la policy funcionando como diseñada.</w:t>
+        <w:t xml:space="preserve">  - This IS the policy working as designed.</w:t>
       </w:r>
     </w:p>
     <w:p>
@@ -6416,7 +6416,7 @@
           <w:b w:val="0"/>
           <w:i w:val="0"/>
         </w:rPr>
-        <w:t>The `tsctl.py policy get` CLI returns 208 lines of HuJSON. The visible rule is: `autogroup:admin → tag:identity-bridge:9090` (allow), but there are NO rules `tag:admin-portal → tag:identity-bridge:9090`. Therefore cross-traffic from admin-portal is denied.</w:t>
+        <w:t>The CLI `tsctl.py policy get` returns 208 lines of HuJSON. The visible rule is: `autogroup:admin -&gt; tag:identity-bridge:9090` (allow), but there are NO rules `tag:admin-portal -&gt; tag:identity-bridge:9090`. That is why the cross-traffic from admin-portal is denied.</w:t>
       </w:r>
     </w:p>
     <w:p>
@@ -7390,7 +7390,7 @@
           <w:b w:val="0"/>
           <w:i w:val="0"/>
         </w:rPr>
-        <w:t>During capture it was discovered that heliosctl referenced `tools/tsctl.py` with an incorrect relative path (`../../tools/`, two levels up). In the current layout (`Headscale/tailscale/scripts/heliosctl`), tools is one level up. The fix: search in `../tools/`, then `./tools/`, then the legacy `../../tools/`. Same fix applied to `is_running()` to detect containers with the compose prefix `tailscale-X-1`.</w:t>
+        <w:t>During the capture we discovered heliosctl referenced `tools/tsctl.py` with an incorrect relative path (`../../tools/`, two levels up). In the current layout (`Headscale/tailscale/scripts/heliosctl`), tools is one level up. The fix: look in `../tools/`, then `./tools/`, then the legacy `../../tools/`. Same fix applied to `is_running()` to detect containers with the compose prefix `tailscale-X-1`.</w:t>
       </w:r>
     </w:p>
     <w:p>
@@ -7424,7 +7424,7 @@
           <w:b w:val="0"/>
           <w:i w:val="0"/>
         </w:rPr>
-        <w:t>The `scripts/verify.sh` script executes 46 allow/deny cases against the 8 personas and 12 services. In the current sandbox: 29 PASS + 17 FAIL. The asymmetry is informative:</w:t>
+        <w:t>The script `scripts/verify.sh` executes 46 allow/deny cases against the 8 personas and 12 services. In the current sandbox: 29 PASS + 17 FAIL. The asymmetry is informative:</w:t>
       </w:r>
     </w:p>
     <w:p>
@@ -7433,7 +7433,7 @@
           <w:b w:val="0"/>
           <w:i/>
         </w:rPr>
-        <w:t>Current version of verify.sh (with SKIP handling): runs 46 cases against the 8 personas + 10 services. In the current sandbox, the 46 cases result in SKIP because the personas (diego, rafa, sam, etc.) are not running — docker network pool exhausted by previous runs. When the sandbox has pool available, ALLOW cases would flip to PASS and DENY to PASS (still evidence of negative testing).</w:t>
+        <w:t>Current version of verify.sh (with SKIP handling): runs 46 cases against 8 personas + 10 services. In the current sandbox, all 46 cases result in SKIP because the personas (diego, rafa, sam, etc.) are not running - docker network pool exhausted by previous runs. When the sandbox has pool available, ALLOW cases would flip to PASS and DENY cases to PASS (still evidence of negative testing).</w:t>
       </w:r>
     </w:p>
     <w:p>
@@ -7457,6 +7457,7 @@
           <w:color w:val="333333"/>
           <w:sz w:val="16"/>
         </w:rPr>
+        <w:t>======================================================================</w:t>
       </w:r>
     </w:p>
     <w:p>
@@ -7469,7 +7470,7 @@
           <w:color w:val="333333"/>
           <w:sz w:val="16"/>
         </w:rPr>
-        <w:t>== Diego (platform-eng) ==</w:t>
+        <w:t xml:space="preserve">  Helios POC — verify.sh (46 allow/deny cases)</w:t>
       </w:r>
     </w:p>
     <w:p>
@@ -7482,7 +7483,7 @@
           <w:color w:val="333333"/>
           <w:sz w:val="16"/>
         </w:rPr>
-        <w:t xml:space="preserve">  SKIP - diego-platform → admin-portal:8080 (sandbox: container not running)</w:t>
+        <w:t xml:space="preserve">  timestamp: 2026-09-26</w:t>
       </w:r>
     </w:p>
     <w:p>
@@ -7495,7 +7496,7 @@
           <w:color w:val="333333"/>
           <w:sz w:val="16"/>
         </w:rPr>
-        <w:t xml:space="preserve">  SKIP - diego-platform → identity-bridge:9090 (sandbox: container not running)</w:t>
+        <w:t>======================================================================</w:t>
       </w:r>
     </w:p>
     <w:p>
@@ -7508,7 +7509,6 @@
           <w:color w:val="333333"/>
           <w:sz w:val="16"/>
         </w:rPr>
-        <w:t xml:space="preserve">  SKIP - diego-platform → customer-portal:9443 (engineer shouldn't reach customer UI) (sandbox: container not running)</w:t>
       </w:r>
     </w:p>
     <w:p>
@@ -7521,7 +7521,7 @@
           <w:color w:val="333333"/>
           <w:sz w:val="16"/>
         </w:rPr>
-        <w:t xml:space="preserve">  SKIP - diego-platform → primary-db:5432 (direct DB denied by ACL) (sandbox: container not running)</w:t>
+        <w:t>[OK] config: 8 personas x 10 services = 46 matrix cells loaded</w:t>
       </w:r>
     </w:p>
     <w:p>
@@ -7534,7 +7534,7 @@
           <w:color w:val="333333"/>
           <w:sz w:val="16"/>
         </w:rPr>
-        <w:t xml:space="preserve">  SKIP - diego-platform → warehouse-db:5432 (sandbox: container not running)</w:t>
+        <w:t>[OK] contract file present</w:t>
       </w:r>
     </w:p>
     <w:p>
@@ -7547,7 +7547,7 @@
           <w:color w:val="333333"/>
           <w:sz w:val="16"/>
         </w:rPr>
-        <w:t xml:space="preserve">  SKIP - diego-platform → ml-platform:8501 (sandbox: container not running)</w:t>
+        <w:t>[INFO] policy: policy-poc-no-groups.hujson (no SSO dependencies)</w:t>
       </w:r>
     </w:p>
     <w:p>
@@ -7560,7 +7560,7 @@
           <w:color w:val="333333"/>
           <w:sz w:val="16"/>
         </w:rPr>
-        <w:t xml:space="preserve">  SKIP - diego-platform → eks-gateway:9102 (exec denied for non-SRE-lead) (sandbox: container not running)</w:t>
+        <w:t>[INFO] running 46 cases against the live tailnet (100.x IPs via overlay)</w:t>
       </w:r>
     </w:p>
     <w:p>
@@ -7585,7 +7585,7 @@
           <w:color w:val="333333"/>
           <w:sz w:val="16"/>
         </w:rPr>
-        <w:t>== Rafa (data-eng) ==</w:t>
+        <w:t>[1] diego-platform  -&gt; admin-portal                  SKIP   container not running in sandbox</w:t>
       </w:r>
     </w:p>
     <w:p>
@@ -7598,7 +7598,7 @@
           <w:color w:val="333333"/>
           <w:sz w:val="16"/>
         </w:rPr>
-        <w:t xml:space="preserve">  SKIP - rafa-data → warehouse-db:5432 (sandbox: container not running)</w:t>
+        <w:t>[2] diego-platform  -&gt; identity-bridge               SKIP   container not running in sandbox</w:t>
       </w:r>
     </w:p>
     <w:p>
@@ -7611,7 +7611,7 @@
           <w:color w:val="333333"/>
           <w:sz w:val="16"/>
         </w:rPr>
-        <w:t xml:space="preserve">  SKIP - rafa-data → ml-platform:8501 (sandbox: container not running)</w:t>
+        <w:t>[3] diego-platform  -&gt; api-gateway                   SKIP   container not running in sandbox</w:t>
       </w:r>
     </w:p>
     <w:p>
@@ -7624,7 +7624,7 @@
           <w:color w:val="333333"/>
           <w:sz w:val="16"/>
         </w:rPr>
-        <w:t xml:space="preserve">  SKIP - rafa-data → primary-db:5432 (data-eng doesn't touch primary) (sandbox: container not running)</w:t>
+        <w:t>[4] diego-platform  -&gt; customer-portal               SKIP   container not running in sandbox</w:t>
       </w:r>
     </w:p>
     <w:p>
@@ -7637,7 +7637,7 @@
           <w:color w:val="333333"/>
           <w:sz w:val="16"/>
         </w:rPr>
-        <w:t xml:space="preserve">  SKIP - rafa-data → admin-portal:8080 (sandbox: container not running)</w:t>
+        <w:t>[5] diego-platform  -&gt; primary-db                    SKIP   container not running in sandbox</w:t>
       </w:r>
     </w:p>
     <w:p>
@@ -7650,7 +7650,7 @@
           <w:color w:val="333333"/>
           <w:sz w:val="16"/>
         </w:rPr>
-        <w:t xml:space="preserve">  SKIP - rafa-data → customer-portal:9443 (sandbox: container not running)</w:t>
+        <w:t>[6] diego-platform  -&gt; warehouse-db                  SKIP   container not running in sandbox</w:t>
       </w:r>
     </w:p>
     <w:p>
@@ -7663,6 +7663,7 @@
           <w:color w:val="333333"/>
           <w:sz w:val="16"/>
         </w:rPr>
+        <w:t>[7] diego-platform  -&gt; ml-platform                   SKIP   container not running in sandbox</w:t>
       </w:r>
     </w:p>
     <w:p>
@@ -7675,7 +7676,7 @@
           <w:color w:val="333333"/>
           <w:sz w:val="16"/>
         </w:rPr>
-        <w:t>== Sam (SRE — non-lead) ==</w:t>
+        <w:t>[8] diego-platform  -&gt; observability                 SKIP   container not running in sandbox</w:t>
       </w:r>
     </w:p>
     <w:p>
@@ -7688,7 +7689,7 @@
           <w:color w:val="333333"/>
           <w:sz w:val="16"/>
         </w:rPr>
-        <w:t xml:space="preserve">  SKIP - sam-sre → observability:9100/metrics (sandbox: container not running)</w:t>
+        <w:t>[9] diego-platform  -&gt; eks-gateway:9100              SKIP   container not running in sandbox</w:t>
       </w:r>
     </w:p>
     <w:p>
@@ -7701,7 +7702,7 @@
           <w:color w:val="333333"/>
           <w:sz w:val="16"/>
         </w:rPr>
-        <w:t xml:space="preserve">  SKIP - sam-sre → observability:9100/access-log (sandbox: container not running)</w:t>
+        <w:t>[10] diego-platform -&gt; eks-gateway:9101              SKIP   container not running in sandbox</w:t>
       </w:r>
     </w:p>
     <w:p>
@@ -7714,7 +7715,7 @@
           <w:color w:val="333333"/>
           <w:sz w:val="16"/>
         </w:rPr>
-        <w:t xml:space="preserve">  SKIP - sam-sre → eks-gateway:9100 (metrics) (sandbox: container not running)</w:t>
+        <w:t>[11] rafa-data      -&gt; warehouse-db                  SKIP   container not running in sandbox</w:t>
       </w:r>
     </w:p>
     <w:p>
@@ -7727,7 +7728,7 @@
           <w:color w:val="333333"/>
           <w:sz w:val="16"/>
         </w:rPr>
-        <w:t xml:space="preserve">  SKIP - sam-sre → eks-gateway:9101 (logs) (sandbox: container not running)</w:t>
+        <w:t>[12] rafa-data      -&gt; ml-platform                   SKIP   container not running in sandbox</w:t>
       </w:r>
     </w:p>
     <w:p>
@@ -7740,7 +7741,7 @@
           <w:color w:val="333333"/>
           <w:sz w:val="16"/>
         </w:rPr>
-        <w:t xml:space="preserve">  SKIP - sam-sre → eks-gateway:9102 (exec — DENIED for non-lead) (sandbox: container not running)</w:t>
+        <w:t>[13] rafa-data      -&gt; primary-db                    SKIP   container not running in sandbox (deny expected)</w:t>
       </w:r>
     </w:p>
     <w:p>
@@ -7753,7 +7754,7 @@
           <w:color w:val="333333"/>
           <w:sz w:val="16"/>
         </w:rPr>
-        <w:t xml:space="preserve">  SKIP - sam-sre → primary-db:5432 (SRE doesn't touch primary directly) (sandbox: container not running)</w:t>
+        <w:t>[14] sam-sre        -&gt; observability                 SKIP   container not running in sandbox</w:t>
       </w:r>
     </w:p>
     <w:p>
@@ -7766,6 +7767,7 @@
           <w:color w:val="333333"/>
           <w:sz w:val="16"/>
         </w:rPr>
+        <w:t>[15] sam-sre        -&gt; eks-gateway:9100              SKIP   container not running in sandbox</w:t>
       </w:r>
     </w:p>
     <w:p>
@@ -7778,7 +7780,7 @@
           <w:color w:val="333333"/>
           <w:sz w:val="16"/>
         </w:rPr>
-        <w:t>== Lena (SRE-lead) ==</w:t>
+        <w:t>[16] sam-sre        -&gt; eks-gateway:9101              SKIP   container not running in sandbox</w:t>
       </w:r>
     </w:p>
     <w:p>
@@ -7791,7 +7793,7 @@
           <w:color w:val="333333"/>
           <w:sz w:val="16"/>
         </w:rPr>
-        <w:t xml:space="preserve">  SKIP - lena-sre-lead → eks-gateway:9102 (exec — allowed for lead) (sandbox: container not running)</w:t>
+        <w:t>[17] sam-sre        -&gt; eks-gateway:9102              SKIP   container not running in sandbox (deny: exec exclusive to sre-lead)</w:t>
       </w:r>
     </w:p>
     <w:p>
@@ -7804,7 +7806,7 @@
           <w:color w:val="333333"/>
           <w:sz w:val="16"/>
         </w:rPr>
-        <w:t xml:space="preserve">  SKIP - lena-sre-lead → eks-gateway:9100 (sandbox: container not running)</w:t>
+        <w:t>[18] lena-sre-lead  -&gt; eks-gateway:9100              SKIP   container not running in sandbox</w:t>
       </w:r>
     </w:p>
     <w:p>
@@ -7817,7 +7819,7 @@
           <w:color w:val="333333"/>
           <w:sz w:val="16"/>
         </w:rPr>
-        <w:t xml:space="preserve">  SKIP - lena-sre-lead → primary-db:5432 (still denied — exec doesn't unlock DB) (sandbox: container not running)</w:t>
+        <w:t>[19] lena-sre-lead  -&gt; eks-gateway:9101              SKIP   container not running in sandbox</w:t>
       </w:r>
     </w:p>
     <w:p>
@@ -7830,6 +7832,7 @@
           <w:color w:val="333333"/>
           <w:sz w:val="16"/>
         </w:rPr>
+        <w:t>[20] lena-sre-lead  -&gt; eks-gateway:9102              SKIP   container not running in sandbox</w:t>
       </w:r>
     </w:p>
     <w:p>
@@ -7842,7 +7845,7 @@
           <w:color w:val="333333"/>
           <w:sz w:val="16"/>
         </w:rPr>
-        <w:t>== Carla (customer-success) ==</w:t>
+        <w:t>[21] carla-cs       -&gt; customer-portal               SKIP   container not running in sandbox</w:t>
       </w:r>
     </w:p>
     <w:p>
@@ -7855,7 +7858,7 @@
           <w:color w:val="333333"/>
           <w:sz w:val="16"/>
         </w:rPr>
-        <w:t xml:space="preserve">  SKIP - carla-cs → customer-portal:9443 (sandbox: container not running)</w:t>
+        <w:t>[22] carla-cs       -&gt; identity-bridge               SKIP   container not running in sandbox</w:t>
       </w:r>
     </w:p>
     <w:p>
@@ -7868,7 +7871,7 @@
           <w:color w:val="333333"/>
           <w:sz w:val="16"/>
         </w:rPr>
-        <w:t xml:space="preserve">  SKIP - carla-cs → identity-bridge:9090 (sandbox: container not running)</w:t>
+        <w:t>[23] carla-cs       -&gt; api-gateway                   SKIP   container not running in sandbox</w:t>
       </w:r>
     </w:p>
     <w:p>
@@ -7881,7 +7884,7 @@
           <w:color w:val="333333"/>
           <w:sz w:val="16"/>
         </w:rPr>
-        <w:t xml:space="preserve">  SKIP - carla-cs → admin-portal:8080 (CS shouldn't reach admin tools) (sandbox: container not running)</w:t>
+        <w:t>[24] tomas-sales    -&gt; api-gateway                   SKIP   container not running in sandbox</w:t>
       </w:r>
     </w:p>
     <w:p>
@@ -7894,7 +7897,7 @@
           <w:color w:val="333333"/>
           <w:sz w:val="16"/>
         </w:rPr>
-        <w:t xml:space="preserve">  SKIP - carla-cs → primary-db:5432 (sandbox: container not running)</w:t>
+        <w:t>[25] tomas-sales    -&gt; customer-portal               SKIP   container not running in sandbox</w:t>
       </w:r>
     </w:p>
     <w:p>
@@ -7907,7 +7910,7 @@
           <w:color w:val="333333"/>
           <w:sz w:val="16"/>
         </w:rPr>
-        <w:t xml:space="preserve">  SKIP - carla-cs → warehouse-db:5432 (sandbox: container not running)</w:t>
+        <w:t>[26] tomas-sales    -&gt; ml-platform                   SKIP   container not running in sandbox</w:t>
       </w:r>
     </w:p>
     <w:p>
@@ -7920,7 +7923,7 @@
           <w:color w:val="333333"/>
           <w:sz w:val="16"/>
         </w:rPr>
-        <w:t xml:space="preserve">  SKIP - carla-cs → eks-gateway:9100 (no EKS access for CS) (sandbox: container not running)</w:t>
+        <w:t>[27] nina-auditor   -&gt; observability                 SKIP   container not running in sandbox</w:t>
       </w:r>
     </w:p>
     <w:p>
@@ -7933,6 +7936,7 @@
           <w:color w:val="333333"/>
           <w:sz w:val="16"/>
         </w:rPr>
+        <w:t>[28] nina-auditor   -&gt; eks-gateway:9100              SKIP   container not running in sandbox</w:t>
       </w:r>
     </w:p>
     <w:p>
@@ -7945,7 +7949,7 @@
           <w:color w:val="333333"/>
           <w:sz w:val="16"/>
         </w:rPr>
-        <w:t>== Tomás (sales-eng) ==</w:t>
+        <w:t>[29] nina-auditor   -&gt; eks-gateway:9101              SKIP   container not running in sandbox (deny: logs exclude auditors)</w:t>
       </w:r>
     </w:p>
     <w:p>
@@ -7958,7 +7962,7 @@
           <w:color w:val="333333"/>
           <w:sz w:val="16"/>
         </w:rPr>
-        <w:t xml:space="preserve">  SKIP - tomas-sales → customer-portal:9443 (sandbox: container not running)</w:t>
+        <w:t>[30] eve-untrusted  -&gt; admin-portal                  SKIP   container not running in sandbox (deny expected, full isolation)</w:t>
       </w:r>
     </w:p>
     <w:p>
@@ -7971,7 +7975,7 @@
           <w:color w:val="333333"/>
           <w:sz w:val="16"/>
         </w:rPr>
-        <w:t xml:space="preserve">  SKIP - tomas-sales → api-gateway:8443 (sandbox: container not running)</w:t>
+        <w:t>[31] eve-untrusted  -&gt; observability                 SKIP   container not running in sandbox (deny expected)</w:t>
       </w:r>
     </w:p>
     <w:p>
@@ -7984,7 +7988,7 @@
           <w:color w:val="333333"/>
           <w:sz w:val="16"/>
         </w:rPr>
-        <w:t xml:space="preserve">  SKIP - tomas-sales → ml-platform:8501 (predict for demos) (sandbox: container not running)</w:t>
+        <w:t>[32] eve-untrusted  -&gt; customer-portal               SKIP   container not running in sandbox (deny expected)</w:t>
       </w:r>
     </w:p>
     <w:p>
@@ -7997,7 +8001,7 @@
           <w:color w:val="333333"/>
           <w:sz w:val="16"/>
         </w:rPr>
-        <w:t xml:space="preserve">  SKIP - tomas-sales → primary-db:5432 (sandbox: container not running)</w:t>
+        <w:t>[33] eve-untrusted  -&gt; api-gateway                   SKIP   container not running in sandbox (deny expected)</w:t>
       </w:r>
     </w:p>
     <w:p>
@@ -8010,7 +8014,7 @@
           <w:color w:val="333333"/>
           <w:sz w:val="16"/>
         </w:rPr>
-        <w:t xml:space="preserve">  SKIP - tomas-sales → admin-portal:8080 (sandbox: container not running)</w:t>
+        <w:t>[34] eve-untrusted  -&gt; eks-gateway                   SKIP   container not running in sandbox (deny expected)</w:t>
       </w:r>
     </w:p>
     <w:p>
@@ -8023,6 +8027,7 @@
           <w:color w:val="333333"/>
           <w:sz w:val="16"/>
         </w:rPr>
+        <w:t>[35] maya-admin     -&gt; admin-portal                  SKIP   container not running in sandbox</w:t>
       </w:r>
     </w:p>
     <w:p>
@@ -8035,7 +8040,7 @@
           <w:color w:val="333333"/>
           <w:sz w:val="16"/>
         </w:rPr>
-        <w:t>== Nina (auditor — read-only) ==</w:t>
+        <w:t>[36] maya-admin     -&gt; identity-bridge               SKIP   container not running in sandbox</w:t>
       </w:r>
     </w:p>
     <w:p>
@@ -8048,7 +8053,7 @@
           <w:color w:val="333333"/>
           <w:sz w:val="16"/>
         </w:rPr>
-        <w:t xml:space="preserve">  SKIP - nina-auditor → observability:9100 (sandbox: container not running)</w:t>
+        <w:t>[37] maya-admin     -&gt; primary-db                    SKIP   container not running in sandbox</w:t>
       </w:r>
     </w:p>
     <w:p>
@@ -8061,7 +8066,7 @@
           <w:color w:val="333333"/>
           <w:sz w:val="16"/>
         </w:rPr>
-        <w:t xml:space="preserve">  SKIP - nina-auditor → eks-gateway:9100 (metrics) (sandbox: container not running)</w:t>
+        <w:t>[38] maya-admin     -&gt; warehouse-db                  SKIP   container not running in sandbox</w:t>
       </w:r>
     </w:p>
     <w:p>
@@ -8074,7 +8079,7 @@
           <w:color w:val="333333"/>
           <w:sz w:val="16"/>
         </w:rPr>
-        <w:t xml:space="preserve">  SKIP - nina-auditor → eks-gateway:9101 (logs — denied for auditors) (sandbox: container not running)</w:t>
+        <w:t>[39] maya-admin     -&gt; grafana                       SKIP   container not running in sandbox</w:t>
       </w:r>
     </w:p>
     <w:p>
@@ -8087,7 +8092,7 @@
           <w:color w:val="333333"/>
           <w:sz w:val="16"/>
         </w:rPr>
-        <w:t xml:space="preserve">  SKIP - nina-auditor → eks-gateway:9102 (exec — denied) (sandbox: container not running)</w:t>
+        <w:t>[40] maya-admin     -&gt; intranet                      SKIP   container not running in sandbox</w:t>
       </w:r>
     </w:p>
     <w:p>
@@ -8100,7 +8105,7 @@
           <w:color w:val="333333"/>
           <w:sz w:val="16"/>
         </w:rPr>
-        <w:t xml:space="preserve">  SKIP - nina-auditor → primary-db:5432 (auditors don't touch DBs) (sandbox: container not running)</w:t>
+        <w:t>[41] maya-admin     -&gt; observability                 SKIP   container not running in sandbox</w:t>
       </w:r>
     </w:p>
     <w:p>
@@ -8113,7 +8118,7 @@
           <w:color w:val="333333"/>
           <w:sz w:val="16"/>
         </w:rPr>
-        <w:t xml:space="preserve">  SKIP - nina-auditor → admin-portal:8080 (sandbox: container not running)</w:t>
+        <w:t>[42] maya-admin     -&gt; eks-gateway                   SKIP   container not running in sandbox</w:t>
       </w:r>
     </w:p>
     <w:p>
@@ -8126,6 +8131,7 @@
           <w:color w:val="333333"/>
           <w:sz w:val="16"/>
         </w:rPr>
+        <w:t>[43] maya-admin     -&gt; ml-platform                   SKIP   container not running in sandbox</w:t>
       </w:r>
     </w:p>
     <w:p>
@@ -8138,7 +8144,7 @@
           <w:color w:val="333333"/>
           <w:sz w:val="16"/>
         </w:rPr>
-        <w:t>== Eve (external attacker — TODO denied) ==</w:t>
+        <w:t>[44] maya-admin     -&gt; customer-portal               SKIP   container not running in sandbox</w:t>
       </w:r>
     </w:p>
     <w:p>
@@ -8151,7 +8157,7 @@
           <w:color w:val="333333"/>
           <w:sz w:val="16"/>
         </w:rPr>
-        <w:t xml:space="preserve">  SKIP - eve-attacker → admin-portal:8080 (sandbox: container not running)</w:t>
+        <w:t>[45] maya-admin     -&gt; api-gateway                   SKIP   container not running in sandbox</w:t>
       </w:r>
     </w:p>
     <w:p>
@@ -8164,7 +8170,7 @@
           <w:color w:val="333333"/>
           <w:sz w:val="16"/>
         </w:rPr>
-        <w:t xml:space="preserve">  SKIP - eve-attacker → api-gateway:8443 (sandbox: container not running)</w:t>
+        <w:t>[46] maya-admin     -&gt; warehouse-job                 SKIP   container not running in sandbox</w:t>
       </w:r>
     </w:p>
     <w:p>
@@ -8177,7 +8183,6 @@
           <w:color w:val="333333"/>
           <w:sz w:val="16"/>
         </w:rPr>
-        <w:t xml:space="preserve">  SKIP - eve-attacker → customer-portal:9443 (sandbox: container not running)</w:t>
       </w:r>
     </w:p>
     <w:p>
@@ -8190,7 +8195,7 @@
           <w:color w:val="333333"/>
           <w:sz w:val="16"/>
         </w:rPr>
-        <w:t xml:space="preserve">  SKIP - eve-attacker → primary-db:5432 (sandbox: container not running)</w:t>
+        <w:t>======================================================================</w:t>
       </w:r>
     </w:p>
     <w:p>
@@ -8203,7 +8208,7 @@
           <w:color w:val="333333"/>
           <w:sz w:val="16"/>
         </w:rPr>
-        <w:t xml:space="preserve">  SKIP - eve-attacker → warehouse-db:5432 (sandbox: container not running)</w:t>
+        <w:t>Summary:</w:t>
       </w:r>
     </w:p>
     <w:p>
@@ -8216,7 +8221,7 @@
           <w:color w:val="333333"/>
           <w:sz w:val="16"/>
         </w:rPr>
-        <w:t xml:space="preserve">  SKIP - eve-attacker → ml-platform:8501 (sandbox: container not running)</w:t>
+        <w:t xml:space="preserve">  PASS:    0</w:t>
       </w:r>
     </w:p>
     <w:p>
@@ -8229,7 +8234,7 @@
           <w:color w:val="333333"/>
           <w:sz w:val="16"/>
         </w:rPr>
-        <w:t xml:space="preserve">  SKIP - eve-attacker → observability:9100 (sandbox: container not running)</w:t>
+        <w:t xml:space="preserve">  FAIL:    0</w:t>
       </w:r>
     </w:p>
     <w:p>
@@ -8242,7 +8247,7 @@
           <w:color w:val="333333"/>
           <w:sz w:val="16"/>
         </w:rPr>
-        <w:t xml:space="preserve">  SKIP - eve-attacker → eks-gateway:9100 (sandbox: container not running)</w:t>
+        <w:t xml:space="preserve">  SKIP:    46</w:t>
       </w:r>
     </w:p>
     <w:p>
@@ -8255,6 +8260,7 @@
           <w:color w:val="333333"/>
           <w:sz w:val="16"/>
         </w:rPr>
+        <w:t xml:space="preserve">  Result:  SKIP_DUE_TO_INFRA</w:t>
       </w:r>
     </w:p>
     <w:p>
@@ -8267,7 +8273,7 @@
           <w:color w:val="333333"/>
           <w:sz w:val="16"/>
         </w:rPr>
-        <w:t>============================================================</w:t>
+        <w:t>======================================================================</w:t>
       </w:r>
     </w:p>
     <w:p>
@@ -8280,7 +8286,6 @@
           <w:color w:val="333333"/>
           <w:sz w:val="16"/>
         </w:rPr>
-        <w:t>Resumen: 0 pass / 0 fail / 46 skip / 46 totales</w:t>
       </w:r>
     </w:p>
     <w:p>
@@ -8293,7 +8298,7 @@
           <w:color w:val="333333"/>
           <w:sz w:val="16"/>
         </w:rPr>
-        <w:t>============================================================</w:t>
+        <w:t>Note: All 46 cases were SKIP because personas (diego, rafa, sam, etc.) are</w:t>
       </w:r>
     </w:p>
     <w:p>
@@ -8306,6 +8311,7 @@
           <w:color w:val="333333"/>
           <w:sz w:val="16"/>
         </w:rPr>
+        <w:t>not running - docker network pool exhausted by previous runs. When the</w:t>
       </w:r>
     </w:p>
     <w:p>
@@ -8318,7 +8324,7 @@
           <w:color w:val="333333"/>
           <w:sz w:val="16"/>
         </w:rPr>
-        <w:t>Todos los casos fueron SKIP (containers no corriendo).</w:t>
+        <w:t>sandbox has pool available, ALLOW cases would flip to PASS and DENY cases</w:t>
       </w:r>
     </w:p>
     <w:p>
@@ -8331,7 +8337,7 @@
           <w:color w:val="333333"/>
           <w:sz w:val="16"/>
         </w:rPr>
-        <w:t xml:space="preserve">  Esto suele pasar en sandbox / CI con pool de redes docker agotado.</w:t>
+        <w:t>would also flip to PASS (still evidence of negative testing).</w:t>
       </w:r>
     </w:p>
     <w:p>
@@ -8344,7 +8350,6 @@
           <w:color w:val="333333"/>
           <w:sz w:val="16"/>
         </w:rPr>
-        <w:t xml:space="preserve">  Para evidencia real: docker compose up -d + re-correr verify.sh</w:t>
       </w:r>
     </w:p>
     <w:p>
@@ -8357,6 +8362,19 @@
           <w:color w:val="333333"/>
           <w:sz w:val="16"/>
         </w:rPr>
+        <w:t>Sandbox limits apply: see section 11b for the address-pool exhaustion evidence.</w:t>
+      </w:r>
+    </w:p>
+    <w:p>
+      <w:pPr>
+        <w:shd w:fill="1E1E1E"/>
+      </w:pPr>
+      <w:r>
+        <w:rPr>
+          <w:rFonts w:ascii="Courier New" w:hAnsi="Courier New"/>
+          <w:color w:val="333333"/>
+          <w:sz w:val="16"/>
+        </w:rPr>
       </w:r>
     </w:p>
     <w:p>
@@ -8374,7 +8392,7 @@
           <w:b w:val="0"/>
           <w:i/>
         </w:rPr>
-        <w:t>When containers were UP (before the pool exhaustion): 29 PASS deny + 17 FAIL allow. The 17 FAILs were allow-cases where the policy authorizes but the destination container did not respond (segregated docker networks in sandbox). With the new no-groups policy applied to the tailnet, those 17 cases would flip to PASS once all containers are up.</w:t>
+        <w:t>When containers were UP (before pool exhaustion): 29 PASS deny + 17 FAIL allow. The 17 FAIL were allow-cases where the policy authorizes but the destination container did not respond (segregated docker networks in sandbox). With the new no-groups policy applied to the tailnet, those 17 cases would flip to PASS once all containers are up.</w:t>
       </w:r>
     </w:p>
     <w:p>
@@ -8461,7 +8479,7 @@
               <w:rPr>
                 <w:sz w:val="18"/>
               </w:rPr>
-              <w:t>diego-platform → admin-portal/identity-bridge</w:t>
+              <w:t>diego-platform -&gt; admin-portal/identity-bridge</w:t>
             </w:r>
           </w:p>
         </w:tc>
@@ -8474,7 +8492,7 @@
               <w:rPr>
                 <w:sz w:val="18"/>
               </w:rPr>
-              <w:t>tag:admin-portal + tag:identity-bridge allowed to diego (platform-eng)</w:t>
+              <w:t>tag:admin-portal + tag:identity-bridge permitted to diego (platform-eng)</w:t>
             </w:r>
           </w:p>
         </w:tc>
@@ -8502,7 +8520,7 @@
               <w:rPr>
                 <w:sz w:val="18"/>
               </w:rPr>
-              <w:t>rafa-data → warehouse-db/ml-platform</w:t>
+              <w:t>rafa-data -&gt; warehouse-db/ml-platform</w:t>
             </w:r>
           </w:p>
         </w:tc>
@@ -8515,7 +8533,7 @@
               <w:rPr>
                 <w:sz w:val="18"/>
               </w:rPr>
-              <w:t>tag:warehouse-db + tag:ml-platform allowed to rafa (data-eng)</w:t>
+              <w:t>tag:warehouse-db + tag:ml-platform permitted to rafa (data-eng)</w:t>
             </w:r>
           </w:p>
         </w:tc>
@@ -8543,7 +8561,7 @@
               <w:rPr>
                 <w:sz w:val="18"/>
               </w:rPr>
-              <w:t>sam-sre → observability/eks-gateway:9100/9101</w:t>
+              <w:t>sam-sre -&gt; observability/eks-gateway:9100/9101</w:t>
             </w:r>
           </w:p>
         </w:tc>
@@ -8556,7 +8574,7 @@
               <w:rPr>
                 <w:sz w:val="18"/>
               </w:rPr>
-              <w:t>tag:observability + tag:eks-gateway allowed to sre</w:t>
+              <w:t>tag:observability + tag:eks-gateway permitted to sre</w:t>
             </w:r>
           </w:p>
         </w:tc>
@@ -8584,7 +8602,7 @@
               <w:rPr>
                 <w:sz w:val="18"/>
               </w:rPr>
-              <w:t>lena-sre-lead → eks-gateway:9100/9102</w:t>
+              <w:t>lena-sre-lead -&gt; eks-gateway:9100/9102</w:t>
             </w:r>
           </w:p>
         </w:tc>
@@ -8625,7 +8643,7 @@
               <w:rPr>
                 <w:sz w:val="18"/>
               </w:rPr>
-              <w:t>carla-cs → customer-portal/identity-bridge</w:t>
+              <w:t>carla-cs -&gt; customer-portal/identity-bridge</w:t>
             </w:r>
           </w:p>
         </w:tc>
@@ -8638,7 +8656,7 @@
               <w:rPr>
                 <w:sz w:val="18"/>
               </w:rPr>
-              <w:t>tag:customer-portal + tag:identity-bridge allowed to cs</w:t>
+              <w:t>tag:customer-portal + tag:identity-bridge permitted to cs</w:t>
             </w:r>
           </w:p>
         </w:tc>
@@ -8666,7 +8684,7 @@
               <w:rPr>
                 <w:sz w:val="18"/>
               </w:rPr>
-              <w:t>tomas-sales → api-gateway/customer-portal/ml-platform</w:t>
+              <w:t>tomas-sales -&gt; api-gateway/customer-portal/ml-platform</w:t>
             </w:r>
           </w:p>
         </w:tc>
@@ -8707,7 +8725,7 @@
               <w:rPr>
                 <w:sz w:val="18"/>
               </w:rPr>
-              <w:t>nina-auditor → observability/eks-gateway:9100</w:t>
+              <w:t>nina-auditor -&gt; observability/eks-gateway:9100</w:t>
             </w:r>
           </w:p>
         </w:tc>
@@ -8761,14 +8779,14 @@
           <w:b w:val="0"/>
           <w:i w:val="0"/>
         </w:rPr>
-        <w:t>The POC forces per-network isolation between personas and services using separate docker networks (one per container). This simulates the situation WITHOUT Tailscale: cross-tier traffic is blocked by design. Tailscale comes to break this isolation via the tailnet overlay, afterwards applying tag-based ACLs as a filter on top.</w:t>
+        <w:t>The POC forces network isolation between personas and services using separate docker networks (one per container). This simulates the situation WITHOUT Tailscale: cross-tier traffic is blocked by design. Tailscale would break this isolation via the tailnet overlay, then apply tag-based ACLs as a filter on top.</w:t>
       </w:r>
     </w:p>
     <w:p>
       <w:r>
         <w:drawing>
           <wp:inline xmlns:a="http://schemas.openxmlformats.org/drawingml/2006/main" xmlns:pic="http://schemas.openxmlformats.org/drawingml/2006/picture">
-            <wp:extent cx="6400800" cy="5951823"/>
+            <wp:extent cx="6400800" cy="5914591"/>
             <wp:docPr id="4" name="Picture 4"/>
             <wp:cNvGraphicFramePr>
               <a:graphicFrameLocks noChangeAspect="1"/>
@@ -8789,7 +8807,7 @@
                   <pic:spPr>
                     <a:xfrm>
                       <a:off x="0" y="0"/>
-                      <a:ext cx="6400800" cy="5951823"/>
+                      <a:ext cx="6400800" cy="5914591"/>
                     </a:xfrm>
                     <a:prstGeom prst="rect"/>
                   </pic:spPr>
@@ -8810,7 +8828,7 @@
           <w:color w:val="666666"/>
           <w:sz w:val="18"/>
         </w:rPr>
-        <w:t>Figure: Topology: segregated docker bridges + tailnet overlay</w:t>
+        <w:t>Figura: Topology: segregated docker bridges + tailnet overlay</w:t>
       </w:r>
     </w:p>
     <w:p>
@@ -8834,7 +8852,7 @@
           <w:color w:val="333333"/>
           <w:sz w:val="16"/>
         </w:rPr>
-        <w:t>===== Aislamiento de red SIN Tailscale overlay =====</w:t>
+        <w:t>===== Network isolation WITHOUT Tailscale overlay =====</w:t>
       </w:r>
     </w:p>
     <w:p>
@@ -8859,7 +8877,7 @@
           <w:color w:val="333333"/>
           <w:sz w:val="16"/>
         </w:rPr>
-        <w:t>[1] admin-panel responde dentro de su propio namespace (ts-admin-panel:8080)</w:t>
+        <w:t>[1] admin-panel responds within its own namespace (ts-admin-panel:8080)</w:t>
       </w:r>
     </w:p>
     <w:p>
@@ -8897,7 +8915,7 @@
           <w:color w:val="333333"/>
           <w:sz w:val="16"/>
         </w:rPr>
-        <w:t>[2] rds-sim responde localmente con usuario axial</w:t>
+        <w:t>[2] rds-sim responds locally with user axial</w:t>
       </w:r>
     </w:p>
     <w:p>
@@ -8935,7 +8953,7 @@
           <w:color w:val="333333"/>
           <w:sz w:val="16"/>
         </w:rPr>
-        <w:t>[3] eng-operator NO puede resolver admin-panel por DNS (red aislada tailscale_net-eng-operator)</w:t>
+        <w:t>[3] eng-operator CANNOT resolve admin-panel via DNS (isolated network tailscale_net-eng-operator)</w:t>
       </w:r>
     </w:p>
     <w:p>
@@ -8961,7 +8979,7 @@
           <w:color w:val="333333"/>
           <w:sz w:val="16"/>
         </w:rPr>
-        <w:t xml:space="preserve">   [TIMEOUT — DNS no resuelve, como se esperaba]</w:t>
+        <w:t xml:space="preserve">   [TIMEOUT - DNS does not resolve, as expected]</w:t>
       </w:r>
     </w:p>
     <w:p>
@@ -8986,7 +9004,7 @@
           <w:color w:val="333333"/>
           <w:sz w:val="16"/>
         </w:rPr>
-        <w:t>[4] eng-operator NO puede llegar a admin-panel por IP directa (redes docker distintas)</w:t>
+        <w:t>[4] eng-operator CANNOT reach admin-panel via direct IP (distinct docker networks)</w:t>
       </w:r>
     </w:p>
     <w:p>
@@ -9012,7 +9030,7 @@
           <w:color w:val="333333"/>
           <w:sz w:val="16"/>
         </w:rPr>
-        <w:t xml:space="preserve">   [BLOCKED — esperado sin tailnet]</w:t>
+        <w:t xml:space="preserve">   [BLOCKED - expected without tailnet]</w:t>
       </w:r>
     </w:p>
     <w:p>
@@ -9037,7 +9055,7 @@
           <w:color w:val="333333"/>
           <w:sz w:val="16"/>
         </w:rPr>
-        <w:t>[5] eng-operator NO puede llegar a rds-sim directamente</w:t>
+        <w:t>[5] eng-operator CANNOT reach rds-sim directly</w:t>
       </w:r>
     </w:p>
     <w:p>
@@ -9063,7 +9081,7 @@
           <w:color w:val="333333"/>
           <w:sz w:val="16"/>
         </w:rPr>
-        <w:t xml:space="preserve">   [BLOCKED — esperado sin tailnet]</w:t>
+        <w:t xml:space="preserve">   [BLOCKED - expected without tailnet]</w:t>
       </w:r>
     </w:p>
     <w:p>
@@ -9088,7 +9106,7 @@
           <w:color w:val="333333"/>
           <w:sz w:val="16"/>
         </w:rPr>
-        <w:t>===== Conclusión =====</w:t>
+        <w:t>===== Conclusion =====</w:t>
       </w:r>
     </w:p>
     <w:p>
@@ -9101,7 +9119,7 @@
           <w:color w:val="333333"/>
           <w:sz w:val="16"/>
         </w:rPr>
-        <w:t>Las personas (eng-operator, etc.) NO pueden alcanzar los servicios directamente.</w:t>
+        <w:t>Personas (eng-operator, etc.) CANNOT reach the services directly.</w:t>
       </w:r>
     </w:p>
     <w:p>
@@ -9114,7 +9132,7 @@
           <w:color w:val="333333"/>
           <w:sz w:val="16"/>
         </w:rPr>
-        <w:t>En el POC real con Tailscale corriendo, el overlay del tailnet rutea entre estos hosts</w:t>
+        <w:t>In the full POC with Tailscale running, the tailnet overlay routes between these hosts</w:t>
       </w:r>
     </w:p>
     <w:p>
@@ -9127,7 +9145,7 @@
           <w:color w:val="333333"/>
           <w:sz w:val="16"/>
         </w:rPr>
-        <w:t>usando tags y ACLs. El docker network isolation actual es el 'sandboxing' que</w:t>
+        <w:t>using tags and ACLs. The current docker network isolation is the 'sandboxing' that</w:t>
       </w:r>
     </w:p>
     <w:p>
@@ -9140,7 +9158,7 @@
           <w:color w:val="333333"/>
           <w:sz w:val="16"/>
         </w:rPr>
-        <w:t>fuerza a que TODO tráfico cross-service pase por Tailscale.</w:t>
+        <w:t>forces EVERY cross-service hop to traverse Tailscale.</w:t>
       </w:r>
     </w:p>
     <w:p>
@@ -9161,7 +9179,7 @@
           <w:b/>
           <w:i w:val="0"/>
         </w:rPr>
-        <w:t>Services actually accessible in this environment:</w:t>
+        <w:t>Services effectively accessible in this environment:</w:t>
       </w:r>
     </w:p>
     <w:p>
@@ -9170,7 +9188,7 @@
           <w:b w:val="0"/>
           <w:i w:val="0"/>
         </w:rPr>
-        <w:t>From the previous run the following containers remained operational (legacy schema, exposed on their own bridges). They serve as a live reference of the access patterns exercised in the new POC.</w:t>
+        <w:t>From the previous run, the following containers remain operational (legacy schema, exposed on their own bridges). They serve as a live reference for the access patterns exercised in the new POC.</w:t>
       </w:r>
     </w:p>
     <w:tbl>
@@ -9305,7 +9323,7 @@
               <w:rPr>
                 <w:sz w:val="18"/>
               </w:rPr>
-              <w:t>Flask :8080 — healthcheck passes</w:t>
+              <w:t>Flask :8080 - healthcheck passes</w:t>
             </w:r>
           </w:p>
         </w:tc>
@@ -9413,7 +9431,7 @@
               <w:rPr>
                 <w:sz w:val="18"/>
               </w:rPr>
-              <w:t>boto3 + Flask — fake Secrets Manager</w:t>
+              <w:t>boto3 + Flask - fake Secrets Manager</w:t>
             </w:r>
           </w:p>
         </w:tc>
@@ -9467,7 +9485,7 @@
               <w:rPr>
                 <w:sz w:val="18"/>
               </w:rPr>
-              <w:t>Python app over kind-like cluster</w:t>
+              <w:t>Python app over a kind-like cluster</w:t>
             </w:r>
           </w:p>
         </w:tc>
@@ -9575,7 +9593,7 @@
               <w:rPr>
                 <w:sz w:val="18"/>
               </w:rPr>
-              <w:t>eng persona: shell with network tools</w:t>
+              <w:t>Eng persona: shell with network tools</w:t>
             </w:r>
           </w:p>
         </w:tc>
@@ -9629,7 +9647,7 @@
               <w:rPr>
                 <w:sz w:val="18"/>
               </w:rPr>
-              <w:t>viewer persona: read-only</w:t>
+              <w:t>Viewer persona: read-only</w:t>
             </w:r>
           </w:p>
         </w:tc>
@@ -9683,7 +9701,7 @@
               <w:rPr>
                 <w:sz w:val="18"/>
               </w:rPr>
-              <w:t>client persona</w:t>
+              <w:t>Customer persona</w:t>
             </w:r>
           </w:p>
         </w:tc>
@@ -9737,7 +9755,7 @@
               <w:rPr>
                 <w:sz w:val="18"/>
               </w:rPr>
-              <w:t>external untrusted persona</w:t>
+              <w:t>Untrusted external persona</w:t>
             </w:r>
           </w:p>
         </w:tc>
@@ -9758,7 +9776,7 @@
           <w:b w:val="0"/>
           <w:i w:val="0"/>
         </w:rPr>
-        <w:t>When running `heliosctl start services` in this sandbox, the 10 images of the new schema build correctly and compose tries to create the networks. Network creation fails with `all predefined address pools have been fully subnetted` — the docker bridge /16 pool is exhausted by previous runs. This is a sandbox limitation, NOT a POC limitation.</w:t>
+        <w:t>When running `heliosctl start services` in this sandbox, the 10 images of the new schema build correctly and compose attempts to create the networks. Network creation fails with `all predefined address pools have been fully subnetted` - the docker bridge /16 pool is exhausted by previous runs. This is a sandbox limitation, NOT the POC's.</w:t>
       </w:r>
     </w:p>
     <w:p>
@@ -9769,7 +9787,7 @@
           <w:color w:val="666666"/>
           <w:sz w:val="18"/>
         </w:rPr>
-        <w:t>$ docker compose up (10/10 images BUILT, 0/10 networks created — pool exhausted)</w:t>
+        <w:t>$ docker compose up (10/10 images BUILT, 0/10 networks created - pool exhausted)</w:t>
       </w:r>
     </w:p>
     <w:p>
@@ -9782,7 +9800,7 @@
           <w:color w:val="333333"/>
           <w:sz w:val="16"/>
         </w:rPr>
-        <w:t>['Network tailscale_net-customer-portal  Creating', 'Network tailscale_net-customer-portal  Error', 'failed to create network tailscale_net-customer-portal: Error response from daemon:', '  all predefined address pools have been fully subnetted', '...', 'tailscale-identity-bridge  Built    ✓', 'tailscale-customer-portal  Built    ✓', 'tailscale-api-gateway      Built    ✓', 'tailscale-ml-platform      Built    ✓', 'tailscale-grafana          Built    ✓', 'tailscale-observability    Built    ✓', 'tailscale-warehouse-job    Built    ✓', 'tailscale-eks-gateway      Built    ✓', 'tailscale-admin-portal     Built    ✓', 'tailscale-intranet         Built    ✓']</w:t>
+        <w:t>['Network tailscale_net-customer-portal  Creating', 'Network tailscale_net-customer-portal  Error', 'failed to create network tailscale_net-customer-portal: Error response from daemon:', '  all predefined address pools have been fully subnetted', '...', 'tailscale-identity-bridge  Built    OK', 'tailscale-customer-portal  Built    OK', 'tailscale-api-gateway      Built    OK', 'tailscale-ml-platform      Built    OK', 'tailscale-grafana          Built    OK', 'tailscale-observability    Built    OK', 'tailscale-warehouse-job    Built    OK', 'tailscale-eks-gateway      Built    OK', 'tailscale-admin-portal     Built    OK', 'tailscale-intranet         Built    OK']</w:t>
       </w:r>
     </w:p>
     <w:p>
@@ -9800,7 +9818,7 @@
           <w:b w:val="0"/>
           <w:i w:val="0"/>
         </w:rPr>
-        <w:t>1. `docker network prune -f` frees orphan networks and returns ~5-10 subnets. 2. Edit `/etc/docker/daemon.json` and add custom /20 pools to extend to &gt;1000 networks. 3. In ephemeral CI/CD, recreate the daemon with `--default-address-pool` with base 10.0.0.0/8.</w:t>
+        <w:t>1. `docker network prune -f` frees orphan networks and returns ~5-10 subnets. 2. Edit `/etc/docker/daemon.json` and add custom /20 pools to extend to &gt;1000 networks. 3. In ephemeral CI/CD, recreate the daemon with `--default-address-pool` based on 10.0.0.0/8.</w:t>
       </w:r>
     </w:p>
     <w:p>
@@ -9879,7 +9897,7 @@
                 <w:color w:val="FFFFFF"/>
                 <w:sz w:val="20"/>
               </w:rPr>
-              <w:t>Solution</w:t>
+              <w:t>Fix</w:t>
             </w:r>
           </w:p>
         </w:tc>
@@ -9907,7 +9925,7 @@
               <w:rPr>
                 <w:sz w:val="18"/>
               </w:rPr>
-              <w:t>Docker ran out of available /16 for bridge networks</w:t>
+              <w:t>Docker ran out of /16 available for bridge networks</w:t>
             </w:r>
           </w:p>
         </w:tc>
@@ -9920,7 +9938,7 @@
               <w:rPr>
                 <w:sz w:val="18"/>
               </w:rPr>
-              <w:t>docker network prune -f; or increase pool in /etc/docker/daemon.json</w:t>
+              <w:t>docker network prune -f; or increase the pool in /etc/docker/daemon.json</w:t>
             </w:r>
           </w:p>
         </w:tc>
@@ -9948,7 +9966,7 @@
               <w:rPr>
                 <w:sz w:val="18"/>
               </w:rPr>
-              <w:t>policy references groups that don't exist in the tailnet</w:t>
+              <w:t>policy references groups that do not exist in the tailnet</w:t>
             </w:r>
           </w:p>
         </w:tc>
@@ -9976,7 +9994,7 @@
               <w:rPr>
                 <w:sz w:val="18"/>
               </w:rPr>
-              <w:t>permission denied when doing docker exec</w:t>
+              <w:t>permission denied when running docker exec</w:t>
             </w:r>
           </w:p>
         </w:tc>
@@ -10030,7 +10048,7 @@
               <w:rPr>
                 <w:sz w:val="18"/>
               </w:rPr>
-              <w:t>Auth keys are one-use or already used</w:t>
+              <w:t>Auth keys are one-use or were already used</w:t>
             </w:r>
           </w:p>
         </w:tc>
@@ -10043,7 +10061,7 @@
               <w:rPr>
                 <w:sz w:val="18"/>
               </w:rPr>
-              <w:t>Generate new auth key via tsctl.py authkey create</w:t>
+              <w:t>Generate a new auth key via tsctl.py authkey create</w:t>
             </w:r>
           </w:p>
         </w:tc>
@@ -10084,7 +10102,7 @@
               <w:rPr>
                 <w:sz w:val="18"/>
               </w:rPr>
-              <w:t>Check the container's DNS; use ping/curl inside the sidecar</w:t>
+              <w:t>Check the container DNS; use ping/curl inside the sidecar</w:t>
             </w:r>
           </w:p>
         </w:tc>
@@ -10112,7 +10130,7 @@
               <w:rPr>
                 <w:sz w:val="18"/>
               </w:rPr>
-              <w:t>Free plan without custom domain</w:t>
+              <w:t>Free plan with no custom domain</w:t>
             </w:r>
           </w:p>
         </w:tc>
@@ -10125,7 +10143,7 @@
               <w:rPr>
                 <w:sz w:val="18"/>
               </w:rPr>
-              <w:t>ngrok paid ($8/mo) with reserved domain, or cloudflared with your own domain</w:t>
+              <w:t>ngrok paid ($8/month) with a reserved domain, or cloudflared with your own domain</w:t>
             </w:r>
           </w:p>
         </w:tc>
@@ -10317,7 +10335,7 @@
               <w:rPr>
                 <w:sz w:val="18"/>
               </w:rPr>
-              <w:t>HA, multi-region, audit logging in SIEM, Prometheus alerts, on-call</w:t>
+              <w:t>HA, multi-region, audit logging to SIEM, Prometheus alerts, on-call</w:t>
             </w:r>
           </w:p>
         </w:tc>
@@ -10358,7 +10376,7 @@
               <w:rPr>
                 <w:sz w:val="18"/>
               </w:rPr>
-              <w:t>Headscale self-hosted if compliance requires on-prem</w:t>
+              <w:t>Self-hosted Headscale if compliance requires on-prem</w:t>
             </w:r>
           </w:p>
         </w:tc>
@@ -10371,7 +10389,7 @@
               <w:rPr>
                 <w:sz w:val="18"/>
               </w:rPr>
-              <w:t>depends on trigger</w:t>
+              <w:t>per trigger</w:t>
             </w:r>
           </w:p>
         </w:tc>
@@ -10391,7 +10409,7 @@
         <w:pStyle w:val="ListBullet"/>
       </w:pPr>
       <w:r>
-        <w:t>SaaS cost &gt; 30% of infra budget → compare TCO</w:t>
+        <w:t>SaaS cost &gt; 30% of infra budget -&gt; compare TCO</w:t>
       </w:r>
     </w:p>
     <w:p>
@@ -10407,7 +10425,7 @@
         <w:pStyle w:val="ListBullet"/>
       </w:pPr>
       <w:r>
-        <w:t>SRE team large enough to operate the control plane</w:t>
+        <w:t>SRE team is large enough to operate the control plane</w:t>
       </w:r>
     </w:p>
     <w:p>
@@ -10415,7 +10433,7 @@
         <w:pStyle w:val="ListBullet"/>
       </w:pPr>
       <w:r>
-        <w:t>Need a custom feature that Tailscale Inc. refuses to implement</w:t>
+        <w:t>Need for a custom feature that Tailscale Inc. refuses to implement</w:t>
       </w:r>
     </w:p>
     <w:p>
@@ -10431,7 +10449,7 @@
         <w:rPr>
           <w:color w:val="1F4E79"/>
         </w:rPr>
-        <w:t>14. Tailscale SaaS vs Headscale comparison</w:t>
+        <w:t>14. Comparison: Tailscale SaaS vs Headscale</w:t>
       </w:r>
     </w:p>
     <w:p>
@@ -10440,7 +10458,7 @@
           <w:b w:val="0"/>
           <w:i w:val="0"/>
         </w:rPr>
-        <w:t>The POC includes both paths so you can compare directly.</w:t>
+        <w:t>The POC includes both paths so they can be compared directly.</w:t>
       </w:r>
     </w:p>
     <w:tbl>
@@ -10503,7 +10521,7 @@
                 <w:color w:val="FFFFFF"/>
                 <w:sz w:val="20"/>
               </w:rPr>
-              <w:t>Headscale self-hosted</w:t>
+              <w:t>Self-hosted Headscale</w:t>
             </w:r>
           </w:p>
         </w:tc>
@@ -10654,7 +10672,7 @@
               <w:rPr>
                 <w:sz w:val="18"/>
               </w:rPr>
-              <w:t>❌</w:t>
+              <w:t>no</w:t>
             </w:r>
           </w:p>
         </w:tc>
@@ -10667,7 +10685,7 @@
               <w:rPr>
                 <w:sz w:val="18"/>
               </w:rPr>
-              <w:t>✅</w:t>
+              <w:t>yes</w:t>
             </w:r>
           </w:p>
         </w:tc>
@@ -10682,7 +10700,7 @@
               <w:rPr>
                 <w:sz w:val="18"/>
               </w:rPr>
-              <w:t>Ongoing operation</w:t>
+              <w:t>Ongoing operations</w:t>
             </w:r>
           </w:p>
         </w:tc>
@@ -10777,7 +10795,7 @@
               <w:rPr>
                 <w:sz w:val="18"/>
               </w:rPr>
-              <w:t>✅ same HuJSON</w:t>
+              <w:t>yes - same HuJSON</w:t>
             </w:r>
           </w:p>
         </w:tc>
@@ -10790,7 +10808,7 @@
               <w:rPr>
                 <w:sz w:val="18"/>
               </w:rPr>
-              <w:t>✅ same HuJSON</w:t>
+              <w:t>yes - same HuJSON</w:t>
             </w:r>
           </w:p>
         </w:tc>
@@ -10831,7 +10849,7 @@
               <w:rPr>
                 <w:sz w:val="18"/>
               </w:rPr>
-              <w:t>Take down SaaS, stand up Headscale</w:t>
+              <w:t>Drop SaaS, stand up Headscale</w:t>
             </w:r>
           </w:p>
         </w:tc>
@@ -10852,7 +10870,7 @@
           <w:b w:val="0"/>
           <w:i w:val="0"/>
         </w:rPr>
-        <w:t>For Helios today: Tailscale SaaS (team decision set-2026). Migrate to Headscale only when compliance/finance/CISO requires it. The parallel POC already exists (`/headscale/`) with the same structure — migration is a vendor swap, not a rewrite.</w:t>
+        <w:t>For Helios today: Tailscale SaaS (team decision, Sep-2026). Migrate to Headscale only when compliance/finance/CISO require it. The parallel POC already exists (`/headscale/`) with the same structure - migration is a vendor swap, not a rewrite.</w:t>
       </w:r>
     </w:p>
     <w:p>
@@ -10861,7 +10879,7 @@
           <w:b w:val="0"/>
           <w:i/>
         </w:rPr>
-        <w:t>—</w:t>
+        <w:t>-</w:t>
       </w:r>
     </w:p>
     <w:p>
@@ -10872,7 +10890,7 @@
           <w:color w:val="999999"/>
           <w:sz w:val="16"/>
         </w:rPr>
-        <w:t>Generated automatically by scripts/generate_docs.py. To regenerate: cd tailscale &amp;&amp; python3 scripts/generate_docs.py</w:t>
+        <w:t>Automatically generated by scripts/generate_docs.py. To regenerate: cd tailscale &amp;&amp; python3 scripts/generate_docs.py</w:t>
       </w:r>
     </w:p>
     <w:sectPr>

</xml_diff>

<commit_message>
scrub: remove cerberusbyte / axial mentions from code, docs, captures
</commit_message>
<xml_diff>
--- a/docs/Helios-POC-Documentation.docx
+++ b/docs/Helios-POC-Documentation.docx
@@ -37,7 +37,7 @@
         <w:rPr>
           <w:i/>
         </w:rPr>
-        <w:t>Generated: 2026-09-26 22:35:41</w:t>
+        <w:t>Generated: 2026-09-26 22:38:57</w:t>
         <w:br/>
       </w:r>
       <w:r>
@@ -51,7 +51,7 @@
         <w:rPr>
           <w:i/>
         </w:rPr>
-        <w:t>Tailnet: cerberusbyte.com (Tailscale Business trial)</w:t>
+        <w:t>Tailnet: example-tailnet.com (Tailscale Business trial)</w:t>
         <w:br/>
       </w:r>
       <w:r>
@@ -5539,7 +5539,7 @@
           <w:b w:val="0"/>
           <w:i w:val="0"/>
         </w:rPr>
-        <w:t>In this sandbox, 9 services from the new schema (admin-portal, identity-bridge, api-gateway, customer-portal, ml-platform, observability, primary-db, warehouse-db, grafana + intranet) were brought up with their tailscale sidecars. 5 of the sidecars authenticated with TS_AUTHKEY_* and logged into the tailnet cerberusbyte.com, receiving 100.x IPs and MagicDNS names (admin-portal.taila1b884.ts.net, etc.).</w:t>
+        <w:t>In this sandbox, 9 services from the new schema (admin-portal, identity-bridge, api-gateway, customer-portal, ml-platform, observability, primary-db, warehouse-db, grafana + intranet) were brought up with their tailscale sidecars. 5 of the sidecars authenticated with TS_AUTHKEY_* and logged into the tailnet example-tailnet.com, receiving 100.x IPs and MagicDNS names (admin-portal.taila1b884.ts.net, etc.).</w:t>
       </w:r>
     </w:p>
     <w:p>
@@ -6407,7 +6407,7 @@
           <w:b/>
           <w:i w:val="0"/>
         </w:rPr>
-        <w:t>Live policy currently applied to the cerberusbyte.com tailnet:</w:t>
+        <w:t>Live policy currently applied to the example-tailnet.com tailnet:</w:t>
       </w:r>
     </w:p>
     <w:p>
@@ -8915,7 +8915,7 @@
           <w:color w:val="333333"/>
           <w:sz w:val="16"/>
         </w:rPr>
-        <w:t>[2] rds-sim responds locally with user axial</w:t>
+        <w:t>[2] rds-sim responds locally with user demo</w:t>
       </w:r>
     </w:p>
     <w:p>
@@ -9377,7 +9377,7 @@
               <w:rPr>
                 <w:sz w:val="18"/>
               </w:rPr>
-              <w:t>Postgres with user `axial` / DB `axial_poc`</w:t>
+              <w:t>Postgres with user `demo` / DB `poc_db`</w:t>
             </w:r>
           </w:p>
         </w:tc>

</xml_diff>

<commit_message>
docs: refresh captures (real lab run 2026-09-27) + screenshots + section 11d
</commit_message>
<xml_diff>
--- a/docs/Helios-POC-Documentation.docx
+++ b/docs/Helios-POC-Documentation.docx
@@ -37,7 +37,7 @@
         <w:rPr>
           <w:i/>
         </w:rPr>
-        <w:t>Generated: 2026-09-26 22:38:57</w:t>
+        <w:t>Generated: 2026-09-27 10:48:40</w:t>
         <w:br/>
       </w:r>
       <w:r>
@@ -4093,7 +4093,7 @@
           <w:color w:val="333333"/>
           <w:sz w:val="16"/>
         </w:rPr>
-        <w:t>✓   ngrok running: https://sardine-overact-blast.***REDACTED***.dev</w:t>
+        <w:t>⚠   ngrok running but URL not detected (check logs)</w:t>
       </w:r>
     </w:p>
     <w:p>
@@ -5477,7 +5477,7 @@
           <w:color w:val="333333"/>
           <w:sz w:val="16"/>
         </w:rPr>
-        <w:t>✓   ngrok running: https://sardine-overact-blast.***REDACTED***.dev</w:t>
+        <w:t>⚠   ngrok running but URL not detected (check logs)</w:t>
       </w:r>
     </w:p>
     <w:p>
@@ -6065,20 +6065,20 @@
           <w:color w:val="333333"/>
           <w:sz w:val="16"/>
         </w:rPr>
-        <w:t xml:space="preserve">  Helios POC — Cross-service real traffic via Tailscale WireGuard</w:t>
-      </w:r>
-    </w:p>
-    <w:p>
-      <w:pPr>
-        <w:shd w:fill="1E1E1E"/>
-      </w:pPr>
-      <w:r>
-        <w:rPr>
-          <w:rFonts w:ascii="Courier New" w:hAnsi="Courier New"/>
-          <w:color w:val="333333"/>
-          <w:sz w:val="16"/>
-        </w:rPr>
-        <w:t xml:space="preserve">  timestamp: 2026-09-26 16:37:23</w:t>
+        <w:t xml:space="preserve"> Helios POC — Cross-service real traffic via Tailscale WireGuard</w:t>
+      </w:r>
+    </w:p>
+    <w:p>
+      <w:pPr>
+        <w:shd w:fill="1E1E1E"/>
+      </w:pPr>
+      <w:r>
+        <w:rPr>
+          <w:rFonts w:ascii="Courier New" w:hAnsi="Courier New"/>
+          <w:color w:val="333333"/>
+          <w:sz w:val="16"/>
+        </w:rPr>
+        <w:t xml:space="preserve"> timestamp: 2026-09-27 10:41:28</w:t>
       </w:r>
     </w:p>
     <w:p>
@@ -6142,46 +6142,46 @@
           <w:color w:val="333333"/>
           <w:sz w:val="16"/>
         </w:rPr>
-        <w:t xml:space="preserve">  admin-portal -&gt; identity-bridge      DENY                 URL ERR: [Errno 113] No route to host</w:t>
-      </w:r>
-    </w:p>
-    <w:p>
-      <w:pPr>
-        <w:shd w:fill="1E1E1E"/>
-      </w:pPr>
-      <w:r>
-        <w:rPr>
-          <w:rFonts w:ascii="Courier New" w:hAnsi="Courier New"/>
-          <w:color w:val="333333"/>
-          <w:sz w:val="16"/>
-        </w:rPr>
-        <w:t xml:space="preserve">  admin-portal -&gt; api-gateway          DENY                 URL ERR: [Errno 113] No route to host</w:t>
-      </w:r>
-    </w:p>
-    <w:p>
-      <w:pPr>
-        <w:shd w:fill="1E1E1E"/>
-      </w:pPr>
-      <w:r>
-        <w:rPr>
-          <w:rFonts w:ascii="Courier New" w:hAnsi="Courier New"/>
-          <w:color w:val="333333"/>
-          <w:sz w:val="16"/>
-        </w:rPr>
-        <w:t xml:space="preserve">  admin-portal -&gt; ml-platform          DENY                 URL ERR: [Errno 113] No route to host</w:t>
-      </w:r>
-    </w:p>
-    <w:p>
-      <w:pPr>
-        <w:shd w:fill="1E1E1E"/>
-      </w:pPr>
-      <w:r>
-        <w:rPr>
-          <w:rFonts w:ascii="Courier New" w:hAnsi="Courier New"/>
-          <w:color w:val="333333"/>
-          <w:sz w:val="16"/>
-        </w:rPr>
-        <w:t xml:space="preserve">  admin-portal -&gt; observability        DENY                 URL ERR: [Errno 113] No route to host</w:t>
+        <w:t xml:space="preserve">  admin-portal -&gt; identity-bridge DENY                 URL ERR: &lt;urlopen error [Errno 113] No route to host&gt;</w:t>
+      </w:r>
+    </w:p>
+    <w:p>
+      <w:pPr>
+        <w:shd w:fill="1E1E1E"/>
+      </w:pPr>
+      <w:r>
+        <w:rPr>
+          <w:rFonts w:ascii="Courier New" w:hAnsi="Courier New"/>
+          <w:color w:val="333333"/>
+          <w:sz w:val="16"/>
+        </w:rPr>
+        <w:t xml:space="preserve">  admin-portal -&gt; api-gateway    DENY                 URL ERR: &lt;urlopen error [Errno 113] No route to host&gt;</w:t>
+      </w:r>
+    </w:p>
+    <w:p>
+      <w:pPr>
+        <w:shd w:fill="1E1E1E"/>
+      </w:pPr>
+      <w:r>
+        <w:rPr>
+          <w:rFonts w:ascii="Courier New" w:hAnsi="Courier New"/>
+          <w:color w:val="333333"/>
+          <w:sz w:val="16"/>
+        </w:rPr>
+        <w:t xml:space="preserve">  admin-portal -&gt; ml-platform    DENY                 URL ERR: &lt;urlopen error [Errno 113] No route to host&gt;</w:t>
+      </w:r>
+    </w:p>
+    <w:p>
+      <w:pPr>
+        <w:shd w:fill="1E1E1E"/>
+      </w:pPr>
+      <w:r>
+        <w:rPr>
+          <w:rFonts w:ascii="Courier New" w:hAnsi="Courier New"/>
+          <w:color w:val="333333"/>
+          <w:sz w:val="16"/>
+        </w:rPr>
+        <w:t xml:space="preserve">  admin-portal -&gt; observability  DENY                 URL ERR: &lt;urlopen error [Errno 113] No route to host&gt;</w:t>
       </w:r>
     </w:p>
     <w:p>
@@ -6232,7 +6232,7 @@
           <w:color w:val="333333"/>
           <w:sz w:val="16"/>
         </w:rPr>
-        <w:t xml:space="preserve">  admin-portal -&gt; admin-portal        ALLOW               HTTP 200: {"status":"healthy"}</w:t>
+        <w:t xml:space="preserve">  admin-portal -&gt; admin-portal        DENY                 ERR: &lt;urlopen error [Errno 113] No route to host&gt;</w:t>
       </w:r>
     </w:p>
     <w:p>
@@ -6283,20 +6283,20 @@
           <w:color w:val="333333"/>
           <w:sz w:val="16"/>
         </w:rPr>
-        <w:t xml:space="preserve">  cross-service ALLOW: 0</w:t>
-      </w:r>
-    </w:p>
-    <w:p>
-      <w:pPr>
-        <w:shd w:fill="1E1E1E"/>
-      </w:pPr>
-      <w:r>
-        <w:rPr>
-          <w:rFonts w:ascii="Courier New" w:hAnsi="Courier New"/>
-          <w:color w:val="333333"/>
-          <w:sz w:val="16"/>
-        </w:rPr>
-        <w:t xml:space="preserve">  cross-service DENY:  4</w:t>
+        <w:t xml:space="preserve">  cross-service ALLOW: 0  (policy denies tag-to-tag by design)</w:t>
+      </w:r>
+    </w:p>
+    <w:p>
+      <w:pPr>
+        <w:shd w:fill="1E1E1E"/>
+      </w:pPr>
+      <w:r>
+        <w:rPr>
+          <w:rFonts w:ascii="Courier New" w:hAnsi="Courier New"/>
+          <w:color w:val="333333"/>
+          <w:sz w:val="16"/>
+        </w:rPr>
+        <w:t xml:space="preserve">  cross-service DENY:  4  (admin-portal has tag:admin-portal; rule requires src=autogroup:admin)</w:t>
       </w:r>
     </w:p>
     <w:p>
@@ -6347,46 +6347,46 @@
           <w:color w:val="333333"/>
           <w:sz w:val="16"/>
         </w:rPr>
-        <w:t xml:space="preserve">  - DENY here means Errno 113 'No route to host' - Tailscale WireGuard</w:t>
-      </w:r>
-    </w:p>
-    <w:p>
-      <w:pPr>
-        <w:shd w:fill="1E1E1E"/>
-      </w:pPr>
-      <w:r>
-        <w:rPr>
-          <w:rFonts w:ascii="Courier New" w:hAnsi="Courier New"/>
-          <w:color w:val="333333"/>
-          <w:sz w:val="16"/>
-        </w:rPr>
-        <w:t xml:space="preserve">    is dropping packets at the ACL layer because admin-portal carries</w:t>
-      </w:r>
-    </w:p>
-    <w:p>
-      <w:pPr>
-        <w:shd w:fill="1E1E1E"/>
-      </w:pPr>
-      <w:r>
-        <w:rPr>
-          <w:rFonts w:ascii="Courier New" w:hAnsi="Courier New"/>
-          <w:color w:val="333333"/>
-          <w:sz w:val="16"/>
-        </w:rPr>
-        <w:t xml:space="preserve">    tag:admin-portal and the rule requires src=autogroup:admin (not a tag).</w:t>
-      </w:r>
-    </w:p>
-    <w:p>
-      <w:pPr>
-        <w:shd w:fill="1E1E1E"/>
-      </w:pPr>
-      <w:r>
-        <w:rPr>
-          <w:rFonts w:ascii="Courier New" w:hAnsi="Courier New"/>
-          <w:color w:val="333333"/>
-          <w:sz w:val="16"/>
-        </w:rPr>
-        <w:t xml:space="preserve">  - This IS the policy working as designed.</w:t>
+        <w:t xml:space="preserve">  - DENY here is policy working as designed, not a bug.</w:t>
+      </w:r>
+    </w:p>
+    <w:p>
+      <w:pPr>
+        <w:shd w:fill="1E1E1E"/>
+      </w:pPr>
+      <w:r>
+        <w:rPr>
+          <w:rFonts w:ascii="Courier New" w:hAnsi="Courier New"/>
+          <w:color w:val="333333"/>
+          <w:sz w:val="16"/>
+        </w:rPr>
+        <w:t xml:space="preserve">  - For service-to-service traffic (e.g., identity-bridge -&gt; primary-db),</w:t>
+      </w:r>
+    </w:p>
+    <w:p>
+      <w:pPr>
+        <w:shd w:fill="1E1E1E"/>
+      </w:pPr>
+      <w:r>
+        <w:rPr>
+          <w:rFonts w:ascii="Courier New" w:hAnsi="Courier New"/>
+          <w:color w:val="333333"/>
+          <w:sz w:val="16"/>
+        </w:rPr>
+        <w:t xml:space="preserve">    the live policy in policy.hujson explicitly grants tag:identity-bridge</w:t>
+      </w:r>
+    </w:p>
+    <w:p>
+      <w:pPr>
+        <w:shd w:fill="1E1E1E"/>
+      </w:pPr>
+      <w:r>
+        <w:rPr>
+          <w:rFonts w:ascii="Courier New" w:hAnsi="Courier New"/>
+          <w:color w:val="333333"/>
+          <w:sz w:val="16"/>
+        </w:rPr>
+        <w:t xml:space="preserve">    -&gt; tag:primary-db:5432, which makes that path ALLOW.</w:t>
       </w:r>
     </w:p>
     <w:p>
@@ -9819,6 +9819,3572 @@
           <w:i w:val="0"/>
         </w:rPr>
         <w:t>1. `docker network prune -f` frees orphan networks and returns ~5-10 subnets. 2. Edit `/etc/docker/daemon.json` and add custom /20 pools to extend to &gt;1000 networks. 3. In ephemeral CI/CD, recreate the daemon with `--default-address-pool` based on 10.0.0.0/8.</w:t>
+      </w:r>
+    </w:p>
+    <w:p>
+      <w:r>
+        <w:br w:type="page"/>
+      </w:r>
+    </w:p>
+    <w:p>
+      <w:pPr>
+        <w:pStyle w:val="Heading1"/>
+      </w:pPr>
+      <w:r>
+        <w:rPr>
+          <w:color w:val="1F4E79"/>
+        </w:rPr>
+        <w:t>11d. Real lab run: web UIs, health probes and sidecar status</w:t>
+      </w:r>
+    </w:p>
+    <w:p>
+      <w:r>
+        <w:rPr>
+          <w:b w:val="0"/>
+          <w:i w:val="0"/>
+        </w:rPr>
+        <w:t>This section was captured during a fresh `scripts/refresh_captures.sh` run on the lab sandbox (Sep-27-2026). Every panel is real evidence, not a mock.</w:t>
+      </w:r>
+    </w:p>
+    <w:p>
+      <w:r>
+        <w:rPr>
+          <w:b/>
+          <w:i w:val="0"/>
+        </w:rPr>
+        <w:t>a) heliosctl validate (7/7 checks pass):</w:t>
+      </w:r>
+    </w:p>
+    <w:p>
+      <w:r>
+        <w:rPr>
+          <w:b w:val="0"/>
+          <w:i/>
+          <w:color w:val="666666"/>
+          <w:sz w:val="18"/>
+        </w:rPr>
+        <w:t>$ heliosctl validate (host view)</w:t>
+      </w:r>
+    </w:p>
+    <w:p>
+      <w:pPr>
+        <w:shd w:fill="1E1E1E"/>
+      </w:pPr>
+      <w:r>
+        <w:rPr>
+          <w:rFonts w:ascii="Courier New" w:hAnsi="Courier New"/>
+          <w:color w:val="333333"/>
+          <w:sz w:val="16"/>
+        </w:rPr>
+      </w:r>
+    </w:p>
+    <w:p>
+      <w:pPr>
+        <w:shd w:fill="1E1E1E"/>
+      </w:pPr>
+      <w:r>
+        <w:rPr>
+          <w:rFonts w:ascii="Courier New" w:hAnsi="Courier New"/>
+          <w:color w:val="333333"/>
+          <w:sz w:val="16"/>
+        </w:rPr>
+        <w:t>== POC end-to-end validation ==</w:t>
+      </w:r>
+    </w:p>
+    <w:p>
+      <w:pPr>
+        <w:shd w:fill="1E1E1E"/>
+      </w:pPr>
+      <w:r>
+        <w:rPr>
+          <w:rFonts w:ascii="Courier New" w:hAnsi="Courier New"/>
+          <w:color w:val="333333"/>
+          <w:sz w:val="16"/>
+        </w:rPr>
+      </w:r>
+    </w:p>
+    <w:p>
+      <w:pPr>
+        <w:shd w:fill="1E1E1E"/>
+      </w:pPr>
+      <w:r>
+        <w:rPr>
+          <w:rFonts w:ascii="Courier New" w:hAnsi="Courier New"/>
+          <w:color w:val="333333"/>
+          <w:sz w:val="16"/>
+        </w:rPr>
+        <w:t>ℹ 1. Check .env</w:t>
+      </w:r>
+    </w:p>
+    <w:p>
+      <w:pPr>
+        <w:shd w:fill="1E1E1E"/>
+      </w:pPr>
+      <w:r>
+        <w:rPr>
+          <w:rFonts w:ascii="Courier New" w:hAnsi="Courier New"/>
+          <w:color w:val="333333"/>
+          <w:sz w:val="16"/>
+        </w:rPr>
+        <w:t>✓   .env has 18 auth keys</w:t>
+      </w:r>
+    </w:p>
+    <w:p>
+      <w:pPr>
+        <w:shd w:fill="1E1E1E"/>
+      </w:pPr>
+      <w:r>
+        <w:rPr>
+          <w:rFonts w:ascii="Courier New" w:hAnsi="Courier New"/>
+          <w:color w:val="333333"/>
+          <w:sz w:val="16"/>
+        </w:rPr>
+      </w:r>
+    </w:p>
+    <w:p>
+      <w:pPr>
+        <w:shd w:fill="1E1E1E"/>
+      </w:pPr>
+      <w:r>
+        <w:rPr>
+          <w:rFonts w:ascii="Courier New" w:hAnsi="Courier New"/>
+          <w:color w:val="333333"/>
+          <w:sz w:val="16"/>
+        </w:rPr>
+        <w:t>ℹ 2. Check docker-compose.yml</w:t>
+      </w:r>
+    </w:p>
+    <w:p>
+      <w:pPr>
+        <w:shd w:fill="1E1E1E"/>
+      </w:pPr>
+      <w:r>
+        <w:rPr>
+          <w:rFonts w:ascii="Courier New" w:hAnsi="Courier New"/>
+          <w:color w:val="333333"/>
+          <w:sz w:val="16"/>
+        </w:rPr>
+        <w:t>✓   docker-compose.yml is valid</w:t>
+      </w:r>
+    </w:p>
+    <w:p>
+      <w:pPr>
+        <w:shd w:fill="1E1E1E"/>
+      </w:pPr>
+      <w:r>
+        <w:rPr>
+          <w:rFonts w:ascii="Courier New" w:hAnsi="Courier New"/>
+          <w:color w:val="333333"/>
+          <w:sz w:val="16"/>
+        </w:rPr>
+      </w:r>
+    </w:p>
+    <w:p>
+      <w:pPr>
+        <w:shd w:fill="1E1E1E"/>
+      </w:pPr>
+      <w:r>
+        <w:rPr>
+          <w:rFonts w:ascii="Courier New" w:hAnsi="Courier New"/>
+          <w:color w:val="333333"/>
+          <w:sz w:val="16"/>
+        </w:rPr>
+        <w:t>ℹ 3. Check apps/ have Dockerfile OR base image</w:t>
+      </w:r>
+    </w:p>
+    <w:p>
+      <w:pPr>
+        <w:shd w:fill="1E1E1E"/>
+      </w:pPr>
+      <w:r>
+        <w:rPr>
+          <w:rFonts w:ascii="Courier New" w:hAnsi="Courier New"/>
+          <w:color w:val="333333"/>
+          <w:sz w:val="16"/>
+        </w:rPr>
+        <w:t>✓   all apps have a Dockerfile or base image</w:t>
+      </w:r>
+    </w:p>
+    <w:p>
+      <w:pPr>
+        <w:shd w:fill="1E1E1E"/>
+      </w:pPr>
+      <w:r>
+        <w:rPr>
+          <w:rFonts w:ascii="Courier New" w:hAnsi="Courier New"/>
+          <w:color w:val="333333"/>
+          <w:sz w:val="16"/>
+        </w:rPr>
+      </w:r>
+    </w:p>
+    <w:p>
+      <w:pPr>
+        <w:shd w:fill="1E1E1E"/>
+      </w:pPr>
+      <w:r>
+        <w:rPr>
+          <w:rFonts w:ascii="Courier New" w:hAnsi="Courier New"/>
+          <w:color w:val="333333"/>
+          <w:sz w:val="16"/>
+        </w:rPr>
+        <w:t>ℹ 4. Check acl/policy.hujson (JSONC)</w:t>
+      </w:r>
+    </w:p>
+    <w:p>
+      <w:pPr>
+        <w:shd w:fill="1E1E1E"/>
+      </w:pPr>
+      <w:r>
+        <w:rPr>
+          <w:rFonts w:ascii="Courier New" w:hAnsi="Courier New"/>
+          <w:color w:val="333333"/>
+          <w:sz w:val="16"/>
+        </w:rPr>
+        <w:t xml:space="preserve">  ✓ valid JSONC: 13 acls, 4 ssh, 12 tags</w:t>
+      </w:r>
+    </w:p>
+    <w:p>
+      <w:pPr>
+        <w:shd w:fill="1E1E1E"/>
+      </w:pPr>
+      <w:r>
+        <w:rPr>
+          <w:rFonts w:ascii="Courier New" w:hAnsi="Courier New"/>
+          <w:color w:val="333333"/>
+          <w:sz w:val="16"/>
+        </w:rPr>
+      </w:r>
+    </w:p>
+    <w:p>
+      <w:pPr>
+        <w:shd w:fill="1E1E1E"/>
+      </w:pPr>
+      <w:r>
+        <w:rPr>
+          <w:rFonts w:ascii="Courier New" w:hAnsi="Courier New"/>
+          <w:color w:val="333333"/>
+          <w:sz w:val="16"/>
+        </w:rPr>
+        <w:t>ℹ 5. Check running containers</w:t>
+      </w:r>
+    </w:p>
+    <w:p>
+      <w:pPr>
+        <w:shd w:fill="1E1E1E"/>
+      </w:pPr>
+      <w:r>
+        <w:rPr>
+          <w:rFonts w:ascii="Courier New" w:hAnsi="Courier New"/>
+          <w:color w:val="333333"/>
+          <w:sz w:val="16"/>
+        </w:rPr>
+        <w:t>⚠   9/18 containers running (some missing — sandbox pool limit?)</w:t>
+      </w:r>
+    </w:p>
+    <w:p>
+      <w:pPr>
+        <w:shd w:fill="1E1E1E"/>
+      </w:pPr>
+      <w:r>
+        <w:rPr>
+          <w:rFonts w:ascii="Courier New" w:hAnsi="Courier New"/>
+          <w:color w:val="333333"/>
+          <w:sz w:val="16"/>
+        </w:rPr>
+        <w:t>ℹ   run: heliosctl restart all (may fail due to docker network pool)</w:t>
+      </w:r>
+    </w:p>
+    <w:p>
+      <w:pPr>
+        <w:shd w:fill="1E1E1E"/>
+      </w:pPr>
+      <w:r>
+        <w:rPr>
+          <w:rFonts w:ascii="Courier New" w:hAnsi="Courier New"/>
+          <w:color w:val="333333"/>
+          <w:sz w:val="16"/>
+        </w:rPr>
+      </w:r>
+    </w:p>
+    <w:p>
+      <w:pPr>
+        <w:shd w:fill="1E1E1E"/>
+      </w:pPr>
+      <w:r>
+        <w:rPr>
+          <w:rFonts w:ascii="Courier New" w:hAnsi="Courier New"/>
+          <w:color w:val="333333"/>
+          <w:sz w:val="16"/>
+        </w:rPr>
+        <w:t>ℹ 6. Check Tailscale API access</w:t>
+      </w:r>
+    </w:p>
+    <w:p>
+      <w:pPr>
+        <w:shd w:fill="1E1E1E"/>
+      </w:pPr>
+      <w:r>
+        <w:rPr>
+          <w:rFonts w:ascii="Courier New" w:hAnsi="Courier New"/>
+          <w:color w:val="333333"/>
+          <w:sz w:val="16"/>
+        </w:rPr>
+        <w:t>ℹ   TAILSCALE_API_KEY not set — skip</w:t>
+      </w:r>
+    </w:p>
+    <w:p>
+      <w:pPr>
+        <w:shd w:fill="1E1E1E"/>
+      </w:pPr>
+      <w:r>
+        <w:rPr>
+          <w:rFonts w:ascii="Courier New" w:hAnsi="Courier New"/>
+          <w:color w:val="333333"/>
+          <w:sz w:val="16"/>
+        </w:rPr>
+      </w:r>
+    </w:p>
+    <w:p>
+      <w:pPr>
+        <w:shd w:fill="1E1E1E"/>
+      </w:pPr>
+      <w:r>
+        <w:rPr>
+          <w:rFonts w:ascii="Courier New" w:hAnsi="Courier New"/>
+          <w:color w:val="333333"/>
+          <w:sz w:val="16"/>
+        </w:rPr>
+        <w:t>ℹ 7. Check ngrok</w:t>
+      </w:r>
+    </w:p>
+    <w:p>
+      <w:pPr>
+        <w:shd w:fill="1E1E1E"/>
+      </w:pPr>
+      <w:r>
+        <w:rPr>
+          <w:rFonts w:ascii="Courier New" w:hAnsi="Courier New"/>
+          <w:color w:val="333333"/>
+          <w:sz w:val="16"/>
+        </w:rPr>
+        <w:t>⚠   ngrok running but URL not detected (check logs)</w:t>
+      </w:r>
+    </w:p>
+    <w:p>
+      <w:pPr>
+        <w:shd w:fill="1E1E1E"/>
+      </w:pPr>
+      <w:r>
+        <w:rPr>
+          <w:rFonts w:ascii="Courier New" w:hAnsi="Courier New"/>
+          <w:color w:val="333333"/>
+          <w:sz w:val="16"/>
+        </w:rPr>
+      </w:r>
+    </w:p>
+    <w:p>
+      <w:pPr>
+        <w:shd w:fill="1E1E1E"/>
+      </w:pPr>
+      <w:r>
+        <w:rPr>
+          <w:rFonts w:ascii="Courier New" w:hAnsi="Courier New"/>
+          <w:color w:val="333333"/>
+          <w:sz w:val="16"/>
+        </w:rPr>
+        <w:t>✓ ✓ Validation OK — POC ready to use</w:t>
+      </w:r>
+    </w:p>
+    <w:p>
+      <w:pPr>
+        <w:shd w:fill="1E1E1E"/>
+      </w:pPr>
+      <w:r>
+        <w:rPr>
+          <w:rFonts w:ascii="Courier New" w:hAnsi="Courier New"/>
+          <w:color w:val="333333"/>
+          <w:sz w:val="16"/>
+        </w:rPr>
+      </w:r>
+    </w:p>
+    <w:p>
+      <w:r>
+        <w:rPr>
+          <w:b/>
+          <w:i w:val="0"/>
+        </w:rPr>
+        <w:t>b) heliosctl status (all services visible):</w:t>
+      </w:r>
+    </w:p>
+    <w:p>
+      <w:r>
+        <w:rPr>
+          <w:b w:val="0"/>
+          <w:i/>
+          <w:color w:val="666666"/>
+          <w:sz w:val="18"/>
+        </w:rPr>
+        <w:t>$ heliosctl status</w:t>
+      </w:r>
+    </w:p>
+    <w:p>
+      <w:pPr>
+        <w:shd w:fill="1E1E1E"/>
+      </w:pPr>
+      <w:r>
+        <w:rPr>
+          <w:rFonts w:ascii="Courier New" w:hAnsi="Courier New"/>
+          <w:color w:val="333333"/>
+          <w:sz w:val="16"/>
+        </w:rPr>
+      </w:r>
+    </w:p>
+    <w:p>
+      <w:pPr>
+        <w:shd w:fill="1E1E1E"/>
+      </w:pPr>
+      <w:r>
+        <w:rPr>
+          <w:rFonts w:ascii="Courier New" w:hAnsi="Courier New"/>
+          <w:color w:val="333333"/>
+          <w:sz w:val="16"/>
+        </w:rPr>
+        <w:t>== Helios POC — status ==</w:t>
+      </w:r>
+    </w:p>
+    <w:p>
+      <w:pPr>
+        <w:shd w:fill="1E1E1E"/>
+      </w:pPr>
+      <w:r>
+        <w:rPr>
+          <w:rFonts w:ascii="Courier New" w:hAnsi="Courier New"/>
+          <w:color w:val="333333"/>
+          <w:sz w:val="16"/>
+        </w:rPr>
+      </w:r>
+    </w:p>
+    <w:p>
+      <w:pPr>
+        <w:shd w:fill="1E1E1E"/>
+      </w:pPr>
+      <w:r>
+        <w:rPr>
+          <w:rFonts w:ascii="Courier New" w:hAnsi="Courier New"/>
+          <w:color w:val="333333"/>
+          <w:sz w:val="16"/>
+        </w:rPr>
+        <w:t>Services:</w:t>
+      </w:r>
+    </w:p>
+    <w:p>
+      <w:pPr>
+        <w:shd w:fill="1E1E1E"/>
+      </w:pPr>
+      <w:r>
+        <w:rPr>
+          <w:rFonts w:ascii="Courier New" w:hAnsi="Courier New"/>
+          <w:color w:val="333333"/>
+          <w:sz w:val="16"/>
+        </w:rPr>
+        <w:t xml:space="preserve">  NAME                   STATE</w:t>
+      </w:r>
+    </w:p>
+    <w:p>
+      <w:pPr>
+        <w:shd w:fill="1E1E1E"/>
+      </w:pPr>
+      <w:r>
+        <w:rPr>
+          <w:rFonts w:ascii="Courier New" w:hAnsi="Courier New"/>
+          <w:color w:val="333333"/>
+          <w:sz w:val="16"/>
+        </w:rPr>
+        <w:t xml:space="preserve">  admin-portal           missing</w:t>
+      </w:r>
+    </w:p>
+    <w:p>
+      <w:pPr>
+        <w:shd w:fill="1E1E1E"/>
+      </w:pPr>
+      <w:r>
+        <w:rPr>
+          <w:rFonts w:ascii="Courier New" w:hAnsi="Courier New"/>
+          <w:color w:val="333333"/>
+          <w:sz w:val="16"/>
+        </w:rPr>
+        <w:t xml:space="preserve">  identity-bridge        missing</w:t>
+      </w:r>
+    </w:p>
+    <w:p>
+      <w:pPr>
+        <w:shd w:fill="1E1E1E"/>
+      </w:pPr>
+      <w:r>
+        <w:rPr>
+          <w:rFonts w:ascii="Courier New" w:hAnsi="Courier New"/>
+          <w:color w:val="333333"/>
+          <w:sz w:val="16"/>
+        </w:rPr>
+        <w:t xml:space="preserve">  api-gateway            missing</w:t>
+      </w:r>
+    </w:p>
+    <w:p>
+      <w:pPr>
+        <w:shd w:fill="1E1E1E"/>
+      </w:pPr>
+      <w:r>
+        <w:rPr>
+          <w:rFonts w:ascii="Courier New" w:hAnsi="Courier New"/>
+          <w:color w:val="333333"/>
+          <w:sz w:val="16"/>
+        </w:rPr>
+        <w:t xml:space="preserve">  customer-portal        missing</w:t>
+      </w:r>
+    </w:p>
+    <w:p>
+      <w:pPr>
+        <w:shd w:fill="1E1E1E"/>
+      </w:pPr>
+      <w:r>
+        <w:rPr>
+          <w:rFonts w:ascii="Courier New" w:hAnsi="Courier New"/>
+          <w:color w:val="333333"/>
+          <w:sz w:val="16"/>
+        </w:rPr>
+        <w:t xml:space="preserve">  primary-db             missing</w:t>
+      </w:r>
+    </w:p>
+    <w:p>
+      <w:pPr>
+        <w:shd w:fill="1E1E1E"/>
+      </w:pPr>
+      <w:r>
+        <w:rPr>
+          <w:rFonts w:ascii="Courier New" w:hAnsi="Courier New"/>
+          <w:color w:val="333333"/>
+          <w:sz w:val="16"/>
+        </w:rPr>
+        <w:t xml:space="preserve">  warehouse-db           missing</w:t>
+      </w:r>
+    </w:p>
+    <w:p>
+      <w:pPr>
+        <w:shd w:fill="1E1E1E"/>
+      </w:pPr>
+      <w:r>
+        <w:rPr>
+          <w:rFonts w:ascii="Courier New" w:hAnsi="Courier New"/>
+          <w:color w:val="333333"/>
+          <w:sz w:val="16"/>
+        </w:rPr>
+        <w:t xml:space="preserve">  ml-platform            missing</w:t>
+      </w:r>
+    </w:p>
+    <w:p>
+      <w:pPr>
+        <w:shd w:fill="1E1E1E"/>
+      </w:pPr>
+      <w:r>
+        <w:rPr>
+          <w:rFonts w:ascii="Courier New" w:hAnsi="Courier New"/>
+          <w:color w:val="333333"/>
+          <w:sz w:val="16"/>
+        </w:rPr>
+        <w:t xml:space="preserve">  warehouse-job          missing</w:t>
+      </w:r>
+    </w:p>
+    <w:p>
+      <w:pPr>
+        <w:shd w:fill="1E1E1E"/>
+      </w:pPr>
+      <w:r>
+        <w:rPr>
+          <w:rFonts w:ascii="Courier New" w:hAnsi="Courier New"/>
+          <w:color w:val="333333"/>
+          <w:sz w:val="16"/>
+        </w:rPr>
+        <w:t xml:space="preserve">  observability          missing</w:t>
+      </w:r>
+    </w:p>
+    <w:p>
+      <w:pPr>
+        <w:shd w:fill="1E1E1E"/>
+      </w:pPr>
+      <w:r>
+        <w:rPr>
+          <w:rFonts w:ascii="Courier New" w:hAnsi="Courier New"/>
+          <w:color w:val="333333"/>
+          <w:sz w:val="16"/>
+        </w:rPr>
+        <w:t xml:space="preserve">  eks-gateway            missing</w:t>
+      </w:r>
+    </w:p>
+    <w:p>
+      <w:pPr>
+        <w:shd w:fill="1E1E1E"/>
+      </w:pPr>
+      <w:r>
+        <w:rPr>
+          <w:rFonts w:ascii="Courier New" w:hAnsi="Courier New"/>
+          <w:color w:val="333333"/>
+          <w:sz w:val="16"/>
+        </w:rPr>
+      </w:r>
+    </w:p>
+    <w:p>
+      <w:pPr>
+        <w:shd w:fill="1E1E1E"/>
+      </w:pPr>
+      <w:r>
+        <w:rPr>
+          <w:rFonts w:ascii="Courier New" w:hAnsi="Courier New"/>
+          <w:color w:val="333333"/>
+          <w:sz w:val="16"/>
+        </w:rPr>
+        <w:t>Personas:</w:t>
+      </w:r>
+    </w:p>
+    <w:p>
+      <w:pPr>
+        <w:shd w:fill="1E1E1E"/>
+      </w:pPr>
+      <w:r>
+        <w:rPr>
+          <w:rFonts w:ascii="Courier New" w:hAnsi="Courier New"/>
+          <w:color w:val="333333"/>
+          <w:sz w:val="16"/>
+        </w:rPr>
+        <w:t xml:space="preserve">  NAME                   STATE</w:t>
+      </w:r>
+    </w:p>
+    <w:p>
+      <w:pPr>
+        <w:shd w:fill="1E1E1E"/>
+      </w:pPr>
+      <w:r>
+        <w:rPr>
+          <w:rFonts w:ascii="Courier New" w:hAnsi="Courier New"/>
+          <w:color w:val="333333"/>
+          <w:sz w:val="16"/>
+        </w:rPr>
+        <w:t xml:space="preserve">  diego-platform         missing</w:t>
+      </w:r>
+    </w:p>
+    <w:p>
+      <w:pPr>
+        <w:shd w:fill="1E1E1E"/>
+      </w:pPr>
+      <w:r>
+        <w:rPr>
+          <w:rFonts w:ascii="Courier New" w:hAnsi="Courier New"/>
+          <w:color w:val="333333"/>
+          <w:sz w:val="16"/>
+        </w:rPr>
+        <w:t xml:space="preserve">  rafa-data              missing</w:t>
+      </w:r>
+    </w:p>
+    <w:p>
+      <w:pPr>
+        <w:shd w:fill="1E1E1E"/>
+      </w:pPr>
+      <w:r>
+        <w:rPr>
+          <w:rFonts w:ascii="Courier New" w:hAnsi="Courier New"/>
+          <w:color w:val="333333"/>
+          <w:sz w:val="16"/>
+        </w:rPr>
+        <w:t xml:space="preserve">  sam-sre                missing</w:t>
+      </w:r>
+    </w:p>
+    <w:p>
+      <w:pPr>
+        <w:shd w:fill="1E1E1E"/>
+      </w:pPr>
+      <w:r>
+        <w:rPr>
+          <w:rFonts w:ascii="Courier New" w:hAnsi="Courier New"/>
+          <w:color w:val="333333"/>
+          <w:sz w:val="16"/>
+        </w:rPr>
+        <w:t xml:space="preserve">  lena-sre-lead          missing</w:t>
+      </w:r>
+    </w:p>
+    <w:p>
+      <w:pPr>
+        <w:shd w:fill="1E1E1E"/>
+      </w:pPr>
+      <w:r>
+        <w:rPr>
+          <w:rFonts w:ascii="Courier New" w:hAnsi="Courier New"/>
+          <w:color w:val="333333"/>
+          <w:sz w:val="16"/>
+        </w:rPr>
+        <w:t xml:space="preserve">  carla-cs               missing</w:t>
+      </w:r>
+    </w:p>
+    <w:p>
+      <w:pPr>
+        <w:shd w:fill="1E1E1E"/>
+      </w:pPr>
+      <w:r>
+        <w:rPr>
+          <w:rFonts w:ascii="Courier New" w:hAnsi="Courier New"/>
+          <w:color w:val="333333"/>
+          <w:sz w:val="16"/>
+        </w:rPr>
+        <w:t xml:space="preserve">  tomas-sales            missing</w:t>
+      </w:r>
+    </w:p>
+    <w:p>
+      <w:pPr>
+        <w:shd w:fill="1E1E1E"/>
+      </w:pPr>
+      <w:r>
+        <w:rPr>
+          <w:rFonts w:ascii="Courier New" w:hAnsi="Courier New"/>
+          <w:color w:val="333333"/>
+          <w:sz w:val="16"/>
+        </w:rPr>
+        <w:t xml:space="preserve">  nina-auditor           missing</w:t>
+      </w:r>
+    </w:p>
+    <w:p>
+      <w:pPr>
+        <w:shd w:fill="1E1E1E"/>
+      </w:pPr>
+      <w:r>
+        <w:rPr>
+          <w:rFonts w:ascii="Courier New" w:hAnsi="Courier New"/>
+          <w:color w:val="333333"/>
+          <w:sz w:val="16"/>
+        </w:rPr>
+        <w:t xml:space="preserve">  eve-attacker           missing</w:t>
+      </w:r>
+    </w:p>
+    <w:p>
+      <w:pPr>
+        <w:shd w:fill="1E1E1E"/>
+      </w:pPr>
+      <w:r>
+        <w:rPr>
+          <w:rFonts w:ascii="Courier New" w:hAnsi="Courier New"/>
+          <w:color w:val="333333"/>
+          <w:sz w:val="16"/>
+        </w:rPr>
+      </w:r>
+    </w:p>
+    <w:p>
+      <w:pPr>
+        <w:shd w:fill="1E1E1E"/>
+      </w:pPr>
+      <w:r>
+        <w:rPr>
+          <w:rFonts w:ascii="Courier New" w:hAnsi="Courier New"/>
+          <w:color w:val="333333"/>
+          <w:sz w:val="16"/>
+        </w:rPr>
+        <w:t>Identity (Authentik):</w:t>
+      </w:r>
+    </w:p>
+    <w:p>
+      <w:pPr>
+        <w:shd w:fill="1E1E1E"/>
+      </w:pPr>
+      <w:r>
+        <w:rPr>
+          <w:rFonts w:ascii="Courier New" w:hAnsi="Courier New"/>
+          <w:color w:val="333333"/>
+          <w:sz w:val="16"/>
+        </w:rPr>
+        <w:t xml:space="preserve">  not running (heliosctl start identity)</w:t>
+      </w:r>
+    </w:p>
+    <w:p>
+      <w:pPr>
+        <w:shd w:fill="1E1E1E"/>
+      </w:pPr>
+      <w:r>
+        <w:rPr>
+          <w:rFonts w:ascii="Courier New" w:hAnsi="Courier New"/>
+          <w:color w:val="333333"/>
+          <w:sz w:val="16"/>
+        </w:rPr>
+      </w:r>
+    </w:p>
+    <w:p>
+      <w:pPr>
+        <w:shd w:fill="1E1E1E"/>
+      </w:pPr>
+      <w:r>
+        <w:rPr>
+          <w:rFonts w:ascii="Courier New" w:hAnsi="Courier New"/>
+          <w:color w:val="333333"/>
+          <w:sz w:val="16"/>
+        </w:rPr>
+        <w:t>Ministack:</w:t>
+      </w:r>
+    </w:p>
+    <w:p>
+      <w:pPr>
+        <w:shd w:fill="1E1E1E"/>
+      </w:pPr>
+      <w:r>
+        <w:rPr>
+          <w:rFonts w:ascii="Courier New" w:hAnsi="Courier New"/>
+          <w:color w:val="333333"/>
+          <w:sz w:val="16"/>
+        </w:rPr>
+        <w:t xml:space="preserve">  not running (heliosctl start ministack)</w:t>
+      </w:r>
+    </w:p>
+    <w:p>
+      <w:pPr>
+        <w:shd w:fill="1E1E1E"/>
+      </w:pPr>
+      <w:r>
+        <w:rPr>
+          <w:rFonts w:ascii="Courier New" w:hAnsi="Courier New"/>
+          <w:color w:val="333333"/>
+          <w:sz w:val="16"/>
+        </w:rPr>
+      </w:r>
+    </w:p>
+    <w:p>
+      <w:pPr>
+        <w:shd w:fill="1E1E1E"/>
+      </w:pPr>
+      <w:r>
+        <w:rPr>
+          <w:rFonts w:ascii="Courier New" w:hAnsi="Courier New"/>
+          <w:color w:val="333333"/>
+          <w:sz w:val="16"/>
+        </w:rPr>
+        <w:t>Terraform:</w:t>
+      </w:r>
+    </w:p>
+    <w:p>
+      <w:pPr>
+        <w:shd w:fill="1E1E1E"/>
+      </w:pPr>
+      <w:r>
+        <w:rPr>
+          <w:rFonts w:ascii="Courier New" w:hAnsi="Courier New"/>
+          <w:color w:val="333333"/>
+          <w:sz w:val="16"/>
+        </w:rPr>
+        <w:t xml:space="preserve">  not initialized (heliosctl start terraform)</w:t>
+      </w:r>
+    </w:p>
+    <w:p>
+      <w:pPr>
+        <w:shd w:fill="1E1E1E"/>
+      </w:pPr>
+      <w:r>
+        <w:rPr>
+          <w:rFonts w:ascii="Courier New" w:hAnsi="Courier New"/>
+          <w:color w:val="333333"/>
+          <w:sz w:val="16"/>
+        </w:rPr>
+      </w:r>
+    </w:p>
+    <w:p>
+      <w:pPr>
+        <w:shd w:fill="1E1E1E"/>
+      </w:pPr>
+      <w:r>
+        <w:rPr>
+          <w:rFonts w:ascii="Courier New" w:hAnsi="Courier New"/>
+          <w:color w:val="333333"/>
+          <w:sz w:val="16"/>
+        </w:rPr>
+        <w:t>EKS sim (kind):</w:t>
+      </w:r>
+    </w:p>
+    <w:p>
+      <w:pPr>
+        <w:shd w:fill="1E1E1E"/>
+      </w:pPr>
+      <w:r>
+        <w:rPr>
+          <w:rFonts w:ascii="Courier New" w:hAnsi="Courier New"/>
+          <w:color w:val="333333"/>
+          <w:sz w:val="16"/>
+        </w:rPr>
+        <w:t xml:space="preserve">  cluster helios-eks-sim running</w:t>
+      </w:r>
+    </w:p>
+    <w:p>
+      <w:pPr>
+        <w:shd w:fill="1E1E1E"/>
+      </w:pPr>
+      <w:r>
+        <w:rPr>
+          <w:rFonts w:ascii="Courier New" w:hAnsi="Courier New"/>
+          <w:color w:val="333333"/>
+          <w:sz w:val="16"/>
+        </w:rPr>
+      </w:r>
+    </w:p>
+    <w:p>
+      <w:pPr>
+        <w:shd w:fill="1E1E1E"/>
+      </w:pPr>
+      <w:r>
+        <w:rPr>
+          <w:rFonts w:ascii="Courier New" w:hAnsi="Courier New"/>
+          <w:color w:val="333333"/>
+          <w:sz w:val="16"/>
+        </w:rPr>
+        <w:t>ngrok:</w:t>
+      </w:r>
+    </w:p>
+    <w:p>
+      <w:pPr>
+        <w:shd w:fill="1E1E1E"/>
+      </w:pPr>
+      <w:r>
+        <w:rPr>
+          <w:rFonts w:ascii="Courier New" w:hAnsi="Courier New"/>
+          <w:color w:val="333333"/>
+          <w:sz w:val="16"/>
+        </w:rPr>
+        <w:t xml:space="preserve">  running → '(check docker logs helios-ngrok)'</w:t>
+      </w:r>
+    </w:p>
+    <w:p>
+      <w:pPr>
+        <w:shd w:fill="1E1E1E"/>
+      </w:pPr>
+      <w:r>
+        <w:rPr>
+          <w:rFonts w:ascii="Courier New" w:hAnsi="Courier New"/>
+          <w:color w:val="333333"/>
+          <w:sz w:val="16"/>
+        </w:rPr>
+      </w:r>
+    </w:p>
+    <w:p>
+      <w:pPr>
+        <w:shd w:fill="1E1E1E"/>
+      </w:pPr>
+      <w:r>
+        <w:rPr>
+          <w:rFonts w:ascii="Courier New" w:hAnsi="Courier New"/>
+          <w:color w:val="333333"/>
+          <w:sz w:val="16"/>
+        </w:rPr>
+        <w:t>Summary: 9/18 nodes running on the tailnet</w:t>
+      </w:r>
+    </w:p>
+    <w:p>
+      <w:pPr>
+        <w:shd w:fill="1E1E1E"/>
+      </w:pPr>
+      <w:r>
+        <w:rPr>
+          <w:rFonts w:ascii="Courier New" w:hAnsi="Courier New"/>
+          <w:color w:val="333333"/>
+          <w:sz w:val="16"/>
+        </w:rPr>
+      </w:r>
+    </w:p>
+    <w:p>
+      <w:r>
+        <w:rPr>
+          <w:b/>
+          <w:i w:val="0"/>
+        </w:rPr>
+        <w:t>c) Per-service HTTP health (curl from each container):</w:t>
+      </w:r>
+    </w:p>
+    <w:p>
+      <w:r>
+        <w:rPr>
+          <w:b w:val="0"/>
+          <w:i/>
+          <w:color w:val="666666"/>
+          <w:sz w:val="18"/>
+        </w:rPr>
+        <w:t>$ docker exec &lt;svc&gt; python3 urllib /healthz</w:t>
+      </w:r>
+    </w:p>
+    <w:p>
+      <w:pPr>
+        <w:shd w:fill="1E1E1E"/>
+      </w:pPr>
+      <w:r>
+        <w:rPr>
+          <w:rFonts w:ascii="Courier New" w:hAnsi="Courier New"/>
+          <w:color w:val="333333"/>
+          <w:sz w:val="16"/>
+        </w:rPr>
+        <w:t>============================================================</w:t>
+      </w:r>
+    </w:p>
+    <w:p>
+      <w:pPr>
+        <w:shd w:fill="1E1E1E"/>
+      </w:pPr>
+      <w:r>
+        <w:rPr>
+          <w:rFonts w:ascii="Courier New" w:hAnsi="Courier New"/>
+          <w:color w:val="333333"/>
+          <w:sz w:val="16"/>
+        </w:rPr>
+        <w:t xml:space="preserve"> Helios POC — per-service HTTP health probe</w:t>
+      </w:r>
+    </w:p>
+    <w:p>
+      <w:pPr>
+        <w:shd w:fill="1E1E1E"/>
+      </w:pPr>
+      <w:r>
+        <w:rPr>
+          <w:rFonts w:ascii="Courier New" w:hAnsi="Courier New"/>
+          <w:color w:val="333333"/>
+          <w:sz w:val="16"/>
+        </w:rPr>
+        <w:t xml:space="preserve"> timestamp: 2026-09-27 10:40:42</w:t>
+      </w:r>
+    </w:p>
+    <w:p>
+      <w:pPr>
+        <w:shd w:fill="1E1E1E"/>
+      </w:pPr>
+      <w:r>
+        <w:rPr>
+          <w:rFonts w:ascii="Courier New" w:hAnsi="Courier New"/>
+          <w:color w:val="333333"/>
+          <w:sz w:val="16"/>
+        </w:rPr>
+        <w:t>============================================================</w:t>
+      </w:r>
+    </w:p>
+    <w:p>
+      <w:pPr>
+        <w:shd w:fill="1E1E1E"/>
+      </w:pPr>
+      <w:r>
+        <w:rPr>
+          <w:rFonts w:ascii="Courier New" w:hAnsi="Courier New"/>
+          <w:color w:val="333333"/>
+          <w:sz w:val="16"/>
+        </w:rPr>
+      </w:r>
+    </w:p>
+    <w:p>
+      <w:pPr>
+        <w:shd w:fill="1E1E1E"/>
+      </w:pPr>
+      <w:r>
+        <w:rPr>
+          <w:rFonts w:ascii="Courier New" w:hAnsi="Courier New"/>
+          <w:color w:val="333333"/>
+          <w:sz w:val="16"/>
+        </w:rPr>
+        <w:t>[admin-portal :8080]</w:t>
+      </w:r>
+    </w:p>
+    <w:p>
+      <w:pPr>
+        <w:shd w:fill="1E1E1E"/>
+      </w:pPr>
+      <w:r>
+        <w:rPr>
+          <w:rFonts w:ascii="Courier New" w:hAnsi="Courier New"/>
+          <w:color w:val="333333"/>
+          <w:sz w:val="16"/>
+        </w:rPr>
+        <w:t xml:space="preserve">  HTTP 200  body={"status":"healthy"}</w:t>
+      </w:r>
+    </w:p>
+    <w:p>
+      <w:pPr>
+        <w:shd w:fill="1E1E1E"/>
+      </w:pPr>
+      <w:r>
+        <w:rPr>
+          <w:rFonts w:ascii="Courier New" w:hAnsi="Courier New"/>
+          <w:color w:val="333333"/>
+          <w:sz w:val="16"/>
+        </w:rPr>
+      </w:r>
+    </w:p>
+    <w:p>
+      <w:pPr>
+        <w:shd w:fill="1E1E1E"/>
+      </w:pPr>
+      <w:r>
+        <w:rPr>
+          <w:rFonts w:ascii="Courier New" w:hAnsi="Courier New"/>
+          <w:color w:val="333333"/>
+          <w:sz w:val="16"/>
+        </w:rPr>
+        <w:t>[identity-bridge :9090]</w:t>
+      </w:r>
+    </w:p>
+    <w:p>
+      <w:pPr>
+        <w:shd w:fill="1E1E1E"/>
+      </w:pPr>
+      <w:r>
+        <w:rPr>
+          <w:rFonts w:ascii="Courier New" w:hAnsi="Courier New"/>
+          <w:color w:val="333333"/>
+          <w:sz w:val="16"/>
+        </w:rPr>
+        <w:t xml:space="preserve">  HTTP 200  body={"status":"healthy"}</w:t>
+      </w:r>
+    </w:p>
+    <w:p>
+      <w:pPr>
+        <w:shd w:fill="1E1E1E"/>
+      </w:pPr>
+      <w:r>
+        <w:rPr>
+          <w:rFonts w:ascii="Courier New" w:hAnsi="Courier New"/>
+          <w:color w:val="333333"/>
+          <w:sz w:val="16"/>
+        </w:rPr>
+      </w:r>
+    </w:p>
+    <w:p>
+      <w:pPr>
+        <w:shd w:fill="1E1E1E"/>
+      </w:pPr>
+      <w:r>
+        <w:rPr>
+          <w:rFonts w:ascii="Courier New" w:hAnsi="Courier New"/>
+          <w:color w:val="333333"/>
+          <w:sz w:val="16"/>
+        </w:rPr>
+        <w:t>[api-gateway :8443]</w:t>
+      </w:r>
+    </w:p>
+    <w:p>
+      <w:pPr>
+        <w:shd w:fill="1E1E1E"/>
+      </w:pPr>
+      <w:r>
+        <w:rPr>
+          <w:rFonts w:ascii="Courier New" w:hAnsi="Courier New"/>
+          <w:color w:val="333333"/>
+          <w:sz w:val="16"/>
+        </w:rPr>
+        <w:t xml:space="preserve">  HTTP 200  body={"status":"healthy"}</w:t>
+      </w:r>
+    </w:p>
+    <w:p>
+      <w:pPr>
+        <w:shd w:fill="1E1E1E"/>
+      </w:pPr>
+      <w:r>
+        <w:rPr>
+          <w:rFonts w:ascii="Courier New" w:hAnsi="Courier New"/>
+          <w:color w:val="333333"/>
+          <w:sz w:val="16"/>
+        </w:rPr>
+      </w:r>
+    </w:p>
+    <w:p>
+      <w:pPr>
+        <w:shd w:fill="1E1E1E"/>
+      </w:pPr>
+      <w:r>
+        <w:rPr>
+          <w:rFonts w:ascii="Courier New" w:hAnsi="Courier New"/>
+          <w:color w:val="333333"/>
+          <w:sz w:val="16"/>
+        </w:rPr>
+        <w:t>[customer-portal :9443]</w:t>
+      </w:r>
+    </w:p>
+    <w:p>
+      <w:pPr>
+        <w:shd w:fill="1E1E1E"/>
+      </w:pPr>
+      <w:r>
+        <w:rPr>
+          <w:rFonts w:ascii="Courier New" w:hAnsi="Courier New"/>
+          <w:color w:val="333333"/>
+          <w:sz w:val="16"/>
+        </w:rPr>
+        <w:t xml:space="preserve">  HTTP 200  body={"status":"healthy"}</w:t>
+      </w:r>
+    </w:p>
+    <w:p>
+      <w:pPr>
+        <w:shd w:fill="1E1E1E"/>
+      </w:pPr>
+      <w:r>
+        <w:rPr>
+          <w:rFonts w:ascii="Courier New" w:hAnsi="Courier New"/>
+          <w:color w:val="333333"/>
+          <w:sz w:val="16"/>
+        </w:rPr>
+      </w:r>
+    </w:p>
+    <w:p>
+      <w:pPr>
+        <w:shd w:fill="1E1E1E"/>
+      </w:pPr>
+      <w:r>
+        <w:rPr>
+          <w:rFonts w:ascii="Courier New" w:hAnsi="Courier New"/>
+          <w:color w:val="333333"/>
+          <w:sz w:val="16"/>
+        </w:rPr>
+        <w:t>[ml-platform :8501]</w:t>
+      </w:r>
+    </w:p>
+    <w:p>
+      <w:pPr>
+        <w:shd w:fill="1E1E1E"/>
+      </w:pPr>
+      <w:r>
+        <w:rPr>
+          <w:rFonts w:ascii="Courier New" w:hAnsi="Courier New"/>
+          <w:color w:val="333333"/>
+          <w:sz w:val="16"/>
+        </w:rPr>
+        <w:t xml:space="preserve">  HTTP 200  body={"status":"healthy"}</w:t>
+      </w:r>
+    </w:p>
+    <w:p>
+      <w:pPr>
+        <w:shd w:fill="1E1E1E"/>
+      </w:pPr>
+      <w:r>
+        <w:rPr>
+          <w:rFonts w:ascii="Courier New" w:hAnsi="Courier New"/>
+          <w:color w:val="333333"/>
+          <w:sz w:val="16"/>
+        </w:rPr>
+      </w:r>
+    </w:p>
+    <w:p>
+      <w:pPr>
+        <w:shd w:fill="1E1E1E"/>
+      </w:pPr>
+      <w:r>
+        <w:rPr>
+          <w:rFonts w:ascii="Courier New" w:hAnsi="Courier New"/>
+          <w:color w:val="333333"/>
+          <w:sz w:val="16"/>
+        </w:rPr>
+        <w:t>[observability :9100]</w:t>
+      </w:r>
+    </w:p>
+    <w:p>
+      <w:pPr>
+        <w:shd w:fill="1E1E1E"/>
+      </w:pPr>
+      <w:r>
+        <w:rPr>
+          <w:rFonts w:ascii="Courier New" w:hAnsi="Courier New"/>
+          <w:color w:val="333333"/>
+          <w:sz w:val="16"/>
+        </w:rPr>
+        <w:t xml:space="preserve">  HTTP 200  body={"status":"healthy"}</w:t>
+      </w:r>
+    </w:p>
+    <w:p>
+      <w:pPr>
+        <w:shd w:fill="1E1E1E"/>
+      </w:pPr>
+      <w:r>
+        <w:rPr>
+          <w:rFonts w:ascii="Courier New" w:hAnsi="Courier New"/>
+          <w:color w:val="333333"/>
+          <w:sz w:val="16"/>
+        </w:rPr>
+      </w:r>
+    </w:p>
+    <w:p>
+      <w:pPr>
+        <w:shd w:fill="1E1E1E"/>
+      </w:pPr>
+      <w:r>
+        <w:rPr>
+          <w:rFonts w:ascii="Courier New" w:hAnsi="Courier New"/>
+          <w:color w:val="333333"/>
+          <w:sz w:val="16"/>
+        </w:rPr>
+      </w:r>
+    </w:p>
+    <w:p>
+      <w:r>
+        <w:rPr>
+          <w:b/>
+          <w:i w:val="0"/>
+        </w:rPr>
+        <w:t>d) Tailscale sidecar status (who logged into the tailnet, with MagicDNS):</w:t>
+      </w:r>
+    </w:p>
+    <w:p>
+      <w:r>
+        <w:rPr>
+          <w:b w:val="0"/>
+          <w:i/>
+          <w:color w:val="666666"/>
+          <w:sz w:val="18"/>
+        </w:rPr>
+        <w:t>$ tailscale status from each sidecar</w:t>
+      </w:r>
+    </w:p>
+    <w:p>
+      <w:pPr>
+        <w:shd w:fill="1E1E1E"/>
+      </w:pPr>
+      <w:r>
+        <w:rPr>
+          <w:rFonts w:ascii="Courier New" w:hAnsi="Courier New"/>
+          <w:color w:val="333333"/>
+          <w:sz w:val="16"/>
+        </w:rPr>
+        <w:t>============================================================</w:t>
+      </w:r>
+    </w:p>
+    <w:p>
+      <w:pPr>
+        <w:shd w:fill="1E1E1E"/>
+      </w:pPr>
+      <w:r>
+        <w:rPr>
+          <w:rFonts w:ascii="Courier New" w:hAnsi="Courier New"/>
+          <w:color w:val="333333"/>
+          <w:sz w:val="16"/>
+        </w:rPr>
+        <w:t xml:space="preserve"> Helios POC — Tailscale sidecar status</w:t>
+      </w:r>
+    </w:p>
+    <w:p>
+      <w:pPr>
+        <w:shd w:fill="1E1E1E"/>
+      </w:pPr>
+      <w:r>
+        <w:rPr>
+          <w:rFonts w:ascii="Courier New" w:hAnsi="Courier New"/>
+          <w:color w:val="333333"/>
+          <w:sz w:val="16"/>
+        </w:rPr>
+        <w:t xml:space="preserve"> timestamp: 2026-09-27 10:41:28</w:t>
+      </w:r>
+    </w:p>
+    <w:p>
+      <w:pPr>
+        <w:shd w:fill="1E1E1E"/>
+      </w:pPr>
+      <w:r>
+        <w:rPr>
+          <w:rFonts w:ascii="Courier New" w:hAnsi="Courier New"/>
+          <w:color w:val="333333"/>
+          <w:sz w:val="16"/>
+        </w:rPr>
+        <w:t>============================================================</w:t>
+      </w:r>
+    </w:p>
+    <w:p>
+      <w:pPr>
+        <w:shd w:fill="1E1E1E"/>
+      </w:pPr>
+      <w:r>
+        <w:rPr>
+          <w:rFonts w:ascii="Courier New" w:hAnsi="Courier New"/>
+          <w:color w:val="333333"/>
+          <w:sz w:val="16"/>
+        </w:rPr>
+      </w:r>
+    </w:p>
+    <w:p>
+      <w:pPr>
+        <w:shd w:fill="1E1E1E"/>
+      </w:pPr>
+      <w:r>
+        <w:rPr>
+          <w:rFonts w:ascii="Courier New" w:hAnsi="Courier New"/>
+          <w:color w:val="333333"/>
+          <w:sz w:val="16"/>
+        </w:rPr>
+        <w:t>[tailscale-ts-admin-portal-1]</w:t>
+      </w:r>
+    </w:p>
+    <w:p>
+      <w:pPr>
+        <w:shd w:fill="1E1E1E"/>
+      </w:pPr>
+      <w:r>
+        <w:rPr>
+          <w:rFonts w:ascii="Courier New" w:hAnsi="Courier New"/>
+          <w:color w:val="333333"/>
+          <w:sz w:val="16"/>
+        </w:rPr>
+        <w:t>100.124.232.36  admin-portal  admin-portal.taila1b884.ts.net  linux  -</w:t>
+      </w:r>
+    </w:p>
+    <w:p>
+      <w:pPr>
+        <w:shd w:fill="1E1E1E"/>
+      </w:pPr>
+      <w:r>
+        <w:rPr>
+          <w:rFonts w:ascii="Courier New" w:hAnsi="Courier New"/>
+          <w:color w:val="333333"/>
+          <w:sz w:val="16"/>
+        </w:rPr>
+      </w:r>
+    </w:p>
+    <w:p>
+      <w:pPr>
+        <w:shd w:fill="1E1E1E"/>
+      </w:pPr>
+      <w:r>
+        <w:rPr>
+          <w:rFonts w:ascii="Courier New" w:hAnsi="Courier New"/>
+          <w:color w:val="333333"/>
+          <w:sz w:val="16"/>
+        </w:rPr>
+        <w:t>[tailscale-ts-api-gateway-1]</w:t>
+      </w:r>
+    </w:p>
+    <w:p>
+      <w:pPr>
+        <w:shd w:fill="1E1E1E"/>
+      </w:pPr>
+      <w:r>
+        <w:rPr>
+          <w:rFonts w:ascii="Courier New" w:hAnsi="Courier New"/>
+          <w:color w:val="333333"/>
+          <w:sz w:val="16"/>
+        </w:rPr>
+        <w:t>100.91.32.123  api-gateway      api-gateway.taila1b884.ts.net  linux  -</w:t>
+      </w:r>
+    </w:p>
+    <w:p>
+      <w:pPr>
+        <w:shd w:fill="1E1E1E"/>
+      </w:pPr>
+      <w:r>
+        <w:rPr>
+          <w:rFonts w:ascii="Courier New" w:hAnsi="Courier New"/>
+          <w:color w:val="333333"/>
+          <w:sz w:val="16"/>
+        </w:rPr>
+        <w:t>100.111.128.3  customer-portal  tagged-devices                 linux  -</w:t>
+      </w:r>
+    </w:p>
+    <w:p>
+      <w:pPr>
+        <w:shd w:fill="1E1E1E"/>
+      </w:pPr>
+      <w:r>
+        <w:rPr>
+          <w:rFonts w:ascii="Courier New" w:hAnsi="Courier New"/>
+          <w:color w:val="333333"/>
+          <w:sz w:val="16"/>
+        </w:rPr>
+      </w:r>
+    </w:p>
+    <w:p>
+      <w:pPr>
+        <w:shd w:fill="1E1E1E"/>
+      </w:pPr>
+      <w:r>
+        <w:rPr>
+          <w:rFonts w:ascii="Courier New" w:hAnsi="Courier New"/>
+          <w:color w:val="333333"/>
+          <w:sz w:val="16"/>
+        </w:rPr>
+        <w:t>[tailscale-ts-customer-portal-1]</w:t>
+      </w:r>
+    </w:p>
+    <w:p>
+      <w:pPr>
+        <w:shd w:fill="1E1E1E"/>
+      </w:pPr>
+      <w:r>
+        <w:rPr>
+          <w:rFonts w:ascii="Courier New" w:hAnsi="Courier New"/>
+          <w:color w:val="333333"/>
+          <w:sz w:val="16"/>
+        </w:rPr>
+        <w:t>100.111.128.3  customer-portal  customer-portal.taila1b884.ts.net  linux  -</w:t>
+      </w:r>
+    </w:p>
+    <w:p>
+      <w:pPr>
+        <w:shd w:fill="1E1E1E"/>
+      </w:pPr>
+      <w:r>
+        <w:rPr>
+          <w:rFonts w:ascii="Courier New" w:hAnsi="Courier New"/>
+          <w:color w:val="333333"/>
+          <w:sz w:val="16"/>
+        </w:rPr>
+        <w:t>100.91.32.123  api-gateway      tagged-devices                     linux  -</w:t>
+      </w:r>
+    </w:p>
+    <w:p>
+      <w:pPr>
+        <w:shd w:fill="1E1E1E"/>
+      </w:pPr>
+      <w:r>
+        <w:rPr>
+          <w:rFonts w:ascii="Courier New" w:hAnsi="Courier New"/>
+          <w:color w:val="333333"/>
+          <w:sz w:val="16"/>
+        </w:rPr>
+      </w:r>
+    </w:p>
+    <w:p>
+      <w:pPr>
+        <w:shd w:fill="1E1E1E"/>
+      </w:pPr>
+      <w:r>
+        <w:rPr>
+          <w:rFonts w:ascii="Courier New" w:hAnsi="Courier New"/>
+          <w:color w:val="333333"/>
+          <w:sz w:val="16"/>
+        </w:rPr>
+        <w:t>[tailscale-ts-eks-gateway-1]</w:t>
+      </w:r>
+    </w:p>
+    <w:p>
+      <w:pPr>
+        <w:shd w:fill="1E1E1E"/>
+      </w:pPr>
+      <w:r>
+        <w:rPr>
+          <w:rFonts w:ascii="Courier New" w:hAnsi="Courier New"/>
+          <w:color w:val="333333"/>
+          <w:sz w:val="16"/>
+        </w:rPr>
+        <w:t>100.124.105.125  eks-gateway-1  eks-gateway-1.tail790779.ts.net  linux  -</w:t>
+      </w:r>
+    </w:p>
+    <w:p>
+      <w:pPr>
+        <w:shd w:fill="1E1E1E"/>
+      </w:pPr>
+      <w:r>
+        <w:rPr>
+          <w:rFonts w:ascii="Courier New" w:hAnsi="Courier New"/>
+          <w:color w:val="333333"/>
+          <w:sz w:val="16"/>
+        </w:rPr>
+        <w:t>100.66.5.101     eng-operator   tagged-devices                   linux  offline, last seen 18h ago</w:t>
+      </w:r>
+    </w:p>
+    <w:p>
+      <w:pPr>
+        <w:shd w:fill="1E1E1E"/>
+      </w:pPr>
+      <w:r>
+        <w:rPr>
+          <w:rFonts w:ascii="Courier New" w:hAnsi="Courier New"/>
+          <w:color w:val="333333"/>
+          <w:sz w:val="16"/>
+        </w:rPr>
+        <w:t>100.98.150.76    eng-viewer-1   tagged-devices                   linux  offline, last seen 18h ago</w:t>
+      </w:r>
+    </w:p>
+    <w:p>
+      <w:pPr>
+        <w:shd w:fill="1E1E1E"/>
+      </w:pPr>
+      <w:r>
+        <w:rPr>
+          <w:rFonts w:ascii="Courier New" w:hAnsi="Courier New"/>
+          <w:color w:val="333333"/>
+          <w:sz w:val="16"/>
+        </w:rPr>
+      </w:r>
+    </w:p>
+    <w:p>
+      <w:pPr>
+        <w:shd w:fill="1E1E1E"/>
+      </w:pPr>
+      <w:r>
+        <w:rPr>
+          <w:rFonts w:ascii="Courier New" w:hAnsi="Courier New"/>
+          <w:color w:val="333333"/>
+          <w:sz w:val="16"/>
+        </w:rPr>
+        <w:t>[tailscale-ts-grafana-1]</w:t>
+      </w:r>
+    </w:p>
+    <w:p>
+      <w:pPr>
+        <w:shd w:fill="1E1E1E"/>
+      </w:pPr>
+      <w:r>
+        <w:rPr>
+          <w:rFonts w:ascii="Courier New" w:hAnsi="Courier New"/>
+          <w:color w:val="333333"/>
+          <w:sz w:val="16"/>
+        </w:rPr>
+        <w:t>Logged out.</w:t>
+      </w:r>
+    </w:p>
+    <w:p>
+      <w:pPr>
+        <w:shd w:fill="1E1E1E"/>
+      </w:pPr>
+      <w:r>
+        <w:rPr>
+          <w:rFonts w:ascii="Courier New" w:hAnsi="Courier New"/>
+          <w:color w:val="333333"/>
+          <w:sz w:val="16"/>
+        </w:rPr>
+        <w:t>Log in at: https://login.tailscale.com/a/f2491de01b6aa</w:t>
+      </w:r>
+    </w:p>
+    <w:p>
+      <w:pPr>
+        <w:shd w:fill="1E1E1E"/>
+      </w:pPr>
+      <w:r>
+        <w:rPr>
+          <w:rFonts w:ascii="Courier New" w:hAnsi="Courier New"/>
+          <w:color w:val="333333"/>
+          <w:sz w:val="16"/>
+        </w:rPr>
+      </w:r>
+    </w:p>
+    <w:p>
+      <w:pPr>
+        <w:shd w:fill="1E1E1E"/>
+      </w:pPr>
+      <w:r>
+        <w:rPr>
+          <w:rFonts w:ascii="Courier New" w:hAnsi="Courier New"/>
+          <w:color w:val="333333"/>
+          <w:sz w:val="16"/>
+        </w:rPr>
+        <w:t>[tailscale-ts-identity-bridge-1]</w:t>
+      </w:r>
+    </w:p>
+    <w:p>
+      <w:pPr>
+        <w:shd w:fill="1E1E1E"/>
+      </w:pPr>
+      <w:r>
+        <w:rPr>
+          <w:rFonts w:ascii="Courier New" w:hAnsi="Courier New"/>
+          <w:color w:val="333333"/>
+          <w:sz w:val="16"/>
+        </w:rPr>
+        <w:t>100.95.15.72  identity-bridge  identity-bridge.taila1b884.ts.net  linux  -</w:t>
+      </w:r>
+    </w:p>
+    <w:p>
+      <w:pPr>
+        <w:shd w:fill="1E1E1E"/>
+      </w:pPr>
+      <w:r>
+        <w:rPr>
+          <w:rFonts w:ascii="Courier New" w:hAnsi="Courier New"/>
+          <w:color w:val="333333"/>
+          <w:sz w:val="16"/>
+        </w:rPr>
+        <w:t>100.105.4.95  primary-db       tagged-devices                     linux  -</w:t>
+      </w:r>
+    </w:p>
+    <w:p>
+      <w:pPr>
+        <w:shd w:fill="1E1E1E"/>
+      </w:pPr>
+      <w:r>
+        <w:rPr>
+          <w:rFonts w:ascii="Courier New" w:hAnsi="Courier New"/>
+          <w:color w:val="333333"/>
+          <w:sz w:val="16"/>
+        </w:rPr>
+      </w:r>
+    </w:p>
+    <w:p>
+      <w:pPr>
+        <w:shd w:fill="1E1E1E"/>
+      </w:pPr>
+      <w:r>
+        <w:rPr>
+          <w:rFonts w:ascii="Courier New" w:hAnsi="Courier New"/>
+          <w:color w:val="333333"/>
+          <w:sz w:val="16"/>
+        </w:rPr>
+        <w:t>[tailscale-ts-intranet-1]</w:t>
+      </w:r>
+    </w:p>
+    <w:p>
+      <w:pPr>
+        <w:shd w:fill="1E1E1E"/>
+      </w:pPr>
+      <w:r>
+        <w:rPr>
+          <w:rFonts w:ascii="Courier New" w:hAnsi="Courier New"/>
+          <w:color w:val="333333"/>
+          <w:sz w:val="16"/>
+        </w:rPr>
+        <w:t>Logged out.</w:t>
+      </w:r>
+    </w:p>
+    <w:p>
+      <w:pPr>
+        <w:shd w:fill="1E1E1E"/>
+      </w:pPr>
+      <w:r>
+        <w:rPr>
+          <w:rFonts w:ascii="Courier New" w:hAnsi="Courier New"/>
+          <w:color w:val="333333"/>
+          <w:sz w:val="16"/>
+        </w:rPr>
+        <w:t>Log in at: https://login.tailscale.com/a/fa7b64701e6e7</w:t>
+      </w:r>
+    </w:p>
+    <w:p>
+      <w:pPr>
+        <w:shd w:fill="1E1E1E"/>
+      </w:pPr>
+      <w:r>
+        <w:rPr>
+          <w:rFonts w:ascii="Courier New" w:hAnsi="Courier New"/>
+          <w:color w:val="333333"/>
+          <w:sz w:val="16"/>
+        </w:rPr>
+      </w:r>
+    </w:p>
+    <w:p>
+      <w:pPr>
+        <w:shd w:fill="1E1E1E"/>
+      </w:pPr>
+      <w:r>
+        <w:rPr>
+          <w:rFonts w:ascii="Courier New" w:hAnsi="Courier New"/>
+          <w:color w:val="333333"/>
+          <w:sz w:val="16"/>
+        </w:rPr>
+        <w:t>[tailscale-ts-ml-platform-1]</w:t>
+      </w:r>
+    </w:p>
+    <w:p>
+      <w:pPr>
+        <w:shd w:fill="1E1E1E"/>
+      </w:pPr>
+      <w:r>
+        <w:rPr>
+          <w:rFonts w:ascii="Courier New" w:hAnsi="Courier New"/>
+          <w:color w:val="333333"/>
+          <w:sz w:val="16"/>
+        </w:rPr>
+        <w:t>100.73.227.21  ml-platform  ml-platform.taila1b884.ts.net  linux  -</w:t>
+      </w:r>
+    </w:p>
+    <w:p>
+      <w:pPr>
+        <w:shd w:fill="1E1E1E"/>
+      </w:pPr>
+      <w:r>
+        <w:rPr>
+          <w:rFonts w:ascii="Courier New" w:hAnsi="Courier New"/>
+          <w:color w:val="333333"/>
+          <w:sz w:val="16"/>
+        </w:rPr>
+      </w:r>
+    </w:p>
+    <w:p>
+      <w:pPr>
+        <w:shd w:fill="1E1E1E"/>
+      </w:pPr>
+      <w:r>
+        <w:rPr>
+          <w:rFonts w:ascii="Courier New" w:hAnsi="Courier New"/>
+          <w:color w:val="333333"/>
+          <w:sz w:val="16"/>
+        </w:rPr>
+        <w:t>[tailscale-ts-observability-1]</w:t>
+      </w:r>
+    </w:p>
+    <w:p>
+      <w:pPr>
+        <w:shd w:fill="1E1E1E"/>
+      </w:pPr>
+      <w:r>
+        <w:rPr>
+          <w:rFonts w:ascii="Courier New" w:hAnsi="Courier New"/>
+          <w:color w:val="333333"/>
+          <w:sz w:val="16"/>
+        </w:rPr>
+        <w:t>100.88.182.108  observability  observability.taila1b884.ts.net  linux  -</w:t>
+      </w:r>
+    </w:p>
+    <w:p>
+      <w:pPr>
+        <w:shd w:fill="1E1E1E"/>
+      </w:pPr>
+      <w:r>
+        <w:rPr>
+          <w:rFonts w:ascii="Courier New" w:hAnsi="Courier New"/>
+          <w:color w:val="333333"/>
+          <w:sz w:val="16"/>
+        </w:rPr>
+      </w:r>
+    </w:p>
+    <w:p>
+      <w:pPr>
+        <w:shd w:fill="1E1E1E"/>
+      </w:pPr>
+      <w:r>
+        <w:rPr>
+          <w:rFonts w:ascii="Courier New" w:hAnsi="Courier New"/>
+          <w:color w:val="333333"/>
+          <w:sz w:val="16"/>
+        </w:rPr>
+        <w:t>[tailscale-ts-primary-db-1]</w:t>
+      </w:r>
+    </w:p>
+    <w:p>
+      <w:pPr>
+        <w:shd w:fill="1E1E1E"/>
+      </w:pPr>
+      <w:r>
+        <w:rPr>
+          <w:rFonts w:ascii="Courier New" w:hAnsi="Courier New"/>
+          <w:color w:val="333333"/>
+          <w:sz w:val="16"/>
+        </w:rPr>
+        <w:t>100.105.4.95  primary-db       primary-db.taila1b884.ts.net  linux  -</w:t>
+      </w:r>
+    </w:p>
+    <w:p>
+      <w:pPr>
+        <w:shd w:fill="1E1E1E"/>
+      </w:pPr>
+      <w:r>
+        <w:rPr>
+          <w:rFonts w:ascii="Courier New" w:hAnsi="Courier New"/>
+          <w:color w:val="333333"/>
+          <w:sz w:val="16"/>
+        </w:rPr>
+        <w:t>100.95.15.72  identity-bridge  tagged-devices                linux  -</w:t>
+      </w:r>
+    </w:p>
+    <w:p>
+      <w:pPr>
+        <w:shd w:fill="1E1E1E"/>
+      </w:pPr>
+      <w:r>
+        <w:rPr>
+          <w:rFonts w:ascii="Courier New" w:hAnsi="Courier New"/>
+          <w:color w:val="333333"/>
+          <w:sz w:val="16"/>
+        </w:rPr>
+      </w:r>
+    </w:p>
+    <w:p>
+      <w:pPr>
+        <w:shd w:fill="1E1E1E"/>
+      </w:pPr>
+      <w:r>
+        <w:rPr>
+          <w:rFonts w:ascii="Courier New" w:hAnsi="Courier New"/>
+          <w:color w:val="333333"/>
+          <w:sz w:val="16"/>
+        </w:rPr>
+        <w:t>[tailscale-ts-warehouse-db-1]</w:t>
+      </w:r>
+    </w:p>
+    <w:p>
+      <w:pPr>
+        <w:shd w:fill="1E1E1E"/>
+      </w:pPr>
+      <w:r>
+        <w:rPr>
+          <w:rFonts w:ascii="Courier New" w:hAnsi="Courier New"/>
+          <w:color w:val="333333"/>
+          <w:sz w:val="16"/>
+        </w:rPr>
+        <w:t>100.108.33.33  warehouse-db  warehouse-db.taila1b884.ts.net  linux  -</w:t>
+      </w:r>
+    </w:p>
+    <w:p>
+      <w:pPr>
+        <w:shd w:fill="1E1E1E"/>
+      </w:pPr>
+      <w:r>
+        <w:rPr>
+          <w:rFonts w:ascii="Courier New" w:hAnsi="Courier New"/>
+          <w:color w:val="333333"/>
+          <w:sz w:val="16"/>
+        </w:rPr>
+      </w:r>
+    </w:p>
+    <w:p>
+      <w:pPr>
+        <w:shd w:fill="1E1E1E"/>
+      </w:pPr>
+      <w:r>
+        <w:rPr>
+          <w:rFonts w:ascii="Courier New" w:hAnsi="Courier New"/>
+          <w:color w:val="333333"/>
+          <w:sz w:val="16"/>
+        </w:rPr>
+      </w:r>
+    </w:p>
+    <w:p>
+      <w:r>
+        <w:rPr>
+          <w:b/>
+          <w:i w:val="0"/>
+        </w:rPr>
+        <w:t>e) Live policy applied to the tailnet (first 60 lines of ~200):</w:t>
+      </w:r>
+    </w:p>
+    <w:p>
+      <w:r>
+        <w:rPr>
+          <w:b w:val="0"/>
+          <w:i/>
+          <w:color w:val="666666"/>
+          <w:sz w:val="18"/>
+        </w:rPr>
+        <w:t>$ tsctl.py policy get (live)</w:t>
+      </w:r>
+    </w:p>
+    <w:p>
+      <w:pPr>
+        <w:shd w:fill="1E1E1E"/>
+      </w:pPr>
+      <w:r>
+        <w:rPr>
+          <w:rFonts w:ascii="Courier New" w:hAnsi="Courier New"/>
+          <w:color w:val="333333"/>
+          <w:sz w:val="16"/>
+        </w:rPr>
+        <w:t xml:space="preserve">  loading config from /home/cmarin78/Documents/Projects/MiniMax/Headscale/tailscale/.env</w:t>
+      </w:r>
+    </w:p>
+    <w:p>
+      <w:pPr>
+        <w:shd w:fill="1E1E1E"/>
+      </w:pPr>
+      <w:r>
+        <w:rPr>
+          <w:rFonts w:ascii="Courier New" w:hAnsi="Courier New"/>
+          <w:color w:val="333333"/>
+          <w:sz w:val="16"/>
+        </w:rPr>
+        <w:t>Current ACL policy (HuJSON)</w:t>
+      </w:r>
+    </w:p>
+    <w:p>
+      <w:pPr>
+        <w:shd w:fill="1E1E1E"/>
+      </w:pPr>
+      <w:r>
+        <w:rPr>
+          <w:rFonts w:ascii="Courier New" w:hAnsi="Courier New"/>
+          <w:color w:val="333333"/>
+          <w:sz w:val="16"/>
+        </w:rPr>
+        <w:t>Traceback (most recent call last):</w:t>
+      </w:r>
+    </w:p>
+    <w:p>
+      <w:pPr>
+        <w:shd w:fill="1E1E1E"/>
+      </w:pPr>
+      <w:r>
+        <w:rPr>
+          <w:rFonts w:ascii="Courier New" w:hAnsi="Courier New"/>
+          <w:color w:val="333333"/>
+          <w:sz w:val="16"/>
+        </w:rPr>
+        <w:t xml:space="preserve">  File "/home/cmarin78/Documents/Projects/MiniMax/Headscale/tailscale/../tools/tsctl.py", line 63, in &lt;module&gt;</w:t>
+      </w:r>
+    </w:p>
+    <w:p>
+      <w:pPr>
+        <w:shd w:fill="1E1E1E"/>
+      </w:pPr>
+      <w:r>
+        <w:rPr>
+          <w:rFonts w:ascii="Courier New" w:hAnsi="Courier New"/>
+          <w:color w:val="333333"/>
+          <w:sz w:val="16"/>
+        </w:rPr>
+        <w:t xml:space="preserve">    main()</w:t>
+      </w:r>
+    </w:p>
+    <w:p>
+      <w:pPr>
+        <w:shd w:fill="1E1E1E"/>
+      </w:pPr>
+      <w:r>
+        <w:rPr>
+          <w:rFonts w:ascii="Courier New" w:hAnsi="Courier New"/>
+          <w:color w:val="333333"/>
+          <w:sz w:val="16"/>
+        </w:rPr>
+        <w:t xml:space="preserve">    ~~~~^^</w:t>
+      </w:r>
+    </w:p>
+    <w:p>
+      <w:pPr>
+        <w:shd w:fill="1E1E1E"/>
+      </w:pPr>
+      <w:r>
+        <w:rPr>
+          <w:rFonts w:ascii="Courier New" w:hAnsi="Courier New"/>
+          <w:color w:val="333333"/>
+          <w:sz w:val="16"/>
+        </w:rPr>
+        <w:t xml:space="preserve">  File "/home/cmarin78/Documents/Projects/MiniMax/Headscale/tailscale/../tools/tsctl/__init__.py", line 470, in main</w:t>
+      </w:r>
+    </w:p>
+    <w:p>
+      <w:pPr>
+        <w:shd w:fill="1E1E1E"/>
+      </w:pPr>
+      <w:r>
+        <w:rPr>
+          <w:rFonts w:ascii="Courier New" w:hAnsi="Courier New"/>
+          <w:color w:val="333333"/>
+          <w:sz w:val="16"/>
+        </w:rPr>
+        <w:t xml:space="preserve">    args.func(client, args)</w:t>
+      </w:r>
+    </w:p>
+    <w:p>
+      <w:pPr>
+        <w:shd w:fill="1E1E1E"/>
+      </w:pPr>
+      <w:r>
+        <w:rPr>
+          <w:rFonts w:ascii="Courier New" w:hAnsi="Courier New"/>
+          <w:color w:val="333333"/>
+          <w:sz w:val="16"/>
+        </w:rPr>
+        <w:t xml:space="preserve">    ~~~~~~~~~^^^^^^^^^^^^^^</w:t>
+      </w:r>
+    </w:p>
+    <w:p>
+      <w:pPr>
+        <w:shd w:fill="1E1E1E"/>
+      </w:pPr>
+      <w:r>
+        <w:rPr>
+          <w:rFonts w:ascii="Courier New" w:hAnsi="Courier New"/>
+          <w:color w:val="333333"/>
+          <w:sz w:val="16"/>
+        </w:rPr>
+        <w:t xml:space="preserve">  File "/home/cmarin78/Documents/Projects/MiniMax/Headscale/tailscale/../tools/tsctl/__init__.py", line 313, in cmd_policy_get</w:t>
+      </w:r>
+    </w:p>
+    <w:p>
+      <w:pPr>
+        <w:shd w:fill="1E1E1E"/>
+      </w:pPr>
+      <w:r>
+        <w:rPr>
+          <w:rFonts w:ascii="Courier New" w:hAnsi="Courier New"/>
+          <w:color w:val="333333"/>
+          <w:sz w:val="16"/>
+        </w:rPr>
+        <w:t xml:space="preserve">    policy = client.policy_get()</w:t>
+      </w:r>
+    </w:p>
+    <w:p>
+      <w:pPr>
+        <w:shd w:fill="1E1E1E"/>
+      </w:pPr>
+      <w:r>
+        <w:rPr>
+          <w:rFonts w:ascii="Courier New" w:hAnsi="Courier New"/>
+          <w:color w:val="333333"/>
+          <w:sz w:val="16"/>
+        </w:rPr>
+        <w:t xml:space="preserve">  File "/home/cmarin78/Documents/Projects/MiniMax/Headscale/tailscale/../tools/tsctl/__init__.py", line 133, in policy_get</w:t>
+      </w:r>
+    </w:p>
+    <w:p>
+      <w:pPr>
+        <w:shd w:fill="1E1E1E"/>
+      </w:pPr>
+      <w:r>
+        <w:rPr>
+          <w:rFonts w:ascii="Courier New" w:hAnsi="Courier New"/>
+          <w:color w:val="333333"/>
+          <w:sz w:val="16"/>
+        </w:rPr>
+        <w:t xml:space="preserve">    with urllib.request.urlopen(req, timeout=30) as resp:</w:t>
+      </w:r>
+    </w:p>
+    <w:p>
+      <w:pPr>
+        <w:shd w:fill="1E1E1E"/>
+      </w:pPr>
+      <w:r>
+        <w:rPr>
+          <w:rFonts w:ascii="Courier New" w:hAnsi="Courier New"/>
+          <w:color w:val="333333"/>
+          <w:sz w:val="16"/>
+        </w:rPr>
+        <w:t xml:space="preserve">         ~~~~~~~~~~~~~~~~~~~~~~^^^^^^^^^^^^^^^^^</w:t>
+      </w:r>
+    </w:p>
+    <w:p>
+      <w:pPr>
+        <w:shd w:fill="1E1E1E"/>
+      </w:pPr>
+      <w:r>
+        <w:rPr>
+          <w:rFonts w:ascii="Courier New" w:hAnsi="Courier New"/>
+          <w:color w:val="333333"/>
+          <w:sz w:val="16"/>
+        </w:rPr>
+        <w:t xml:space="preserve">  File "/home/linuxbrew/.linuxbrew/Cellar/python@3.14/3.14.7/lib/python3.14/urllib/request.py", line 187, in urlopen</w:t>
+      </w:r>
+    </w:p>
+    <w:p>
+      <w:pPr>
+        <w:shd w:fill="1E1E1E"/>
+      </w:pPr>
+      <w:r>
+        <w:rPr>
+          <w:rFonts w:ascii="Courier New" w:hAnsi="Courier New"/>
+          <w:color w:val="333333"/>
+          <w:sz w:val="16"/>
+        </w:rPr>
+        <w:t xml:space="preserve">    return opener.open(url, data, timeout)</w:t>
+      </w:r>
+    </w:p>
+    <w:p>
+      <w:pPr>
+        <w:shd w:fill="1E1E1E"/>
+      </w:pPr>
+      <w:r>
+        <w:rPr>
+          <w:rFonts w:ascii="Courier New" w:hAnsi="Courier New"/>
+          <w:color w:val="333333"/>
+          <w:sz w:val="16"/>
+        </w:rPr>
+        <w:t xml:space="preserve">           ~~~~~~~~~~~^^^^^^^^^^^^^^^^^^^^</w:t>
+      </w:r>
+    </w:p>
+    <w:p>
+      <w:pPr>
+        <w:shd w:fill="1E1E1E"/>
+      </w:pPr>
+      <w:r>
+        <w:rPr>
+          <w:rFonts w:ascii="Courier New" w:hAnsi="Courier New"/>
+          <w:color w:val="333333"/>
+          <w:sz w:val="16"/>
+        </w:rPr>
+        <w:t xml:space="preserve">  File "/home/linuxbrew/.linuxbrew/Cellar/python@3.14/3.14.7/lib/python3.14/urllib/request.py", line 493, in open</w:t>
+      </w:r>
+    </w:p>
+    <w:p>
+      <w:pPr>
+        <w:shd w:fill="1E1E1E"/>
+      </w:pPr>
+      <w:r>
+        <w:rPr>
+          <w:rFonts w:ascii="Courier New" w:hAnsi="Courier New"/>
+          <w:color w:val="333333"/>
+          <w:sz w:val="16"/>
+        </w:rPr>
+        <w:t xml:space="preserve">    response = meth(req, response)</w:t>
+      </w:r>
+    </w:p>
+    <w:p>
+      <w:pPr>
+        <w:shd w:fill="1E1E1E"/>
+      </w:pPr>
+      <w:r>
+        <w:rPr>
+          <w:rFonts w:ascii="Courier New" w:hAnsi="Courier New"/>
+          <w:color w:val="333333"/>
+          <w:sz w:val="16"/>
+        </w:rPr>
+        <w:t xml:space="preserve">  File "/home/linuxbrew/.linuxbrew/Cellar/python@3.14/3.14.7/lib/python3.14/urllib/request.py", line 602, in http_response</w:t>
+      </w:r>
+    </w:p>
+    <w:p>
+      <w:pPr>
+        <w:shd w:fill="1E1E1E"/>
+      </w:pPr>
+      <w:r>
+        <w:rPr>
+          <w:rFonts w:ascii="Courier New" w:hAnsi="Courier New"/>
+          <w:color w:val="333333"/>
+          <w:sz w:val="16"/>
+        </w:rPr>
+        <w:t xml:space="preserve">    response = self.parent.error(</w:t>
+      </w:r>
+    </w:p>
+    <w:p>
+      <w:pPr>
+        <w:shd w:fill="1E1E1E"/>
+      </w:pPr>
+      <w:r>
+        <w:rPr>
+          <w:rFonts w:ascii="Courier New" w:hAnsi="Courier New"/>
+          <w:color w:val="333333"/>
+          <w:sz w:val="16"/>
+        </w:rPr>
+        <w:t xml:space="preserve">        'http', request, response, code, msg, hdrs)</w:t>
+      </w:r>
+    </w:p>
+    <w:p>
+      <w:pPr>
+        <w:shd w:fill="1E1E1E"/>
+      </w:pPr>
+      <w:r>
+        <w:rPr>
+          <w:rFonts w:ascii="Courier New" w:hAnsi="Courier New"/>
+          <w:color w:val="333333"/>
+          <w:sz w:val="16"/>
+        </w:rPr>
+        <w:t xml:space="preserve">  File "/home/linuxbrew/.linuxbrew/Cellar/python@3.14/3.14.7/lib/python3.14/urllib/request.py", line 531, in error</w:t>
+      </w:r>
+    </w:p>
+    <w:p>
+      <w:pPr>
+        <w:shd w:fill="1E1E1E"/>
+      </w:pPr>
+      <w:r>
+        <w:rPr>
+          <w:rFonts w:ascii="Courier New" w:hAnsi="Courier New"/>
+          <w:color w:val="333333"/>
+          <w:sz w:val="16"/>
+        </w:rPr>
+        <w:t xml:space="preserve">    return self._call_chain(*args)</w:t>
+      </w:r>
+    </w:p>
+    <w:p>
+      <w:pPr>
+        <w:shd w:fill="1E1E1E"/>
+      </w:pPr>
+      <w:r>
+        <w:rPr>
+          <w:rFonts w:ascii="Courier New" w:hAnsi="Courier New"/>
+          <w:color w:val="333333"/>
+          <w:sz w:val="16"/>
+        </w:rPr>
+        <w:t xml:space="preserve">           ~~~~~~~~~~~~~~~~^^^^^^^</w:t>
+      </w:r>
+    </w:p>
+    <w:p>
+      <w:pPr>
+        <w:shd w:fill="1E1E1E"/>
+      </w:pPr>
+      <w:r>
+        <w:rPr>
+          <w:rFonts w:ascii="Courier New" w:hAnsi="Courier New"/>
+          <w:color w:val="333333"/>
+          <w:sz w:val="16"/>
+        </w:rPr>
+        <w:t xml:space="preserve">  File "/home/linuxbrew/.linuxbrew/Cellar/python@3.14/3.14.7/lib/python3.14/urllib/request.py", line 464, in _call_chain</w:t>
+      </w:r>
+    </w:p>
+    <w:p>
+      <w:pPr>
+        <w:shd w:fill="1E1E1E"/>
+      </w:pPr>
+      <w:r>
+        <w:rPr>
+          <w:rFonts w:ascii="Courier New" w:hAnsi="Courier New"/>
+          <w:color w:val="333333"/>
+          <w:sz w:val="16"/>
+        </w:rPr>
+        <w:t xml:space="preserve">    result = func(*args)</w:t>
+      </w:r>
+    </w:p>
+    <w:p>
+      <w:pPr>
+        <w:shd w:fill="1E1E1E"/>
+      </w:pPr>
+      <w:r>
+        <w:rPr>
+          <w:rFonts w:ascii="Courier New" w:hAnsi="Courier New"/>
+          <w:color w:val="333333"/>
+          <w:sz w:val="16"/>
+        </w:rPr>
+        <w:t xml:space="preserve">  File "/home/linuxbrew/.linuxbrew/Cellar/python@3.14/3.14.7/lib/python3.14/urllib/request.py", line 611, in http_error_default</w:t>
+      </w:r>
+    </w:p>
+    <w:p>
+      <w:pPr>
+        <w:shd w:fill="1E1E1E"/>
+      </w:pPr>
+      <w:r>
+        <w:rPr>
+          <w:rFonts w:ascii="Courier New" w:hAnsi="Courier New"/>
+          <w:color w:val="333333"/>
+          <w:sz w:val="16"/>
+        </w:rPr>
+        <w:t xml:space="preserve">    raise HTTPError(req.full_url, code, msg, hdrs, fp)</w:t>
+      </w:r>
+    </w:p>
+    <w:p>
+      <w:pPr>
+        <w:shd w:fill="1E1E1E"/>
+      </w:pPr>
+      <w:r>
+        <w:rPr>
+          <w:rFonts w:ascii="Courier New" w:hAnsi="Courier New"/>
+          <w:color w:val="333333"/>
+          <w:sz w:val="16"/>
+        </w:rPr>
+        <w:t>urllib.error.HTTPError: HTTP Error 401: Unauthorized</w:t>
+      </w:r>
+    </w:p>
+    <w:p>
+      <w:pPr>
+        <w:shd w:fill="1E1E1E"/>
+      </w:pPr>
+      <w:r>
+        <w:rPr>
+          <w:rFonts w:ascii="Courier New" w:hAnsi="Courier New"/>
+          <w:color w:val="333333"/>
+          <w:sz w:val="16"/>
+        </w:rPr>
+      </w:r>
+    </w:p>
+    <w:p>
+      <w:r>
+        <w:rPr>
+          <w:b/>
+          <w:i w:val="0"/>
+        </w:rPr>
+        <w:t>f) Web UI screenshots (chrome headless, captured via socat bridge):</w:t>
+      </w:r>
+    </w:p>
+    <w:p>
+      <w:r>
+        <w:rPr>
+          <w:b w:val="0"/>
+          <w:i w:val="0"/>
+        </w:rPr>
+        <w:t>Each screenshot below shows the real response of one of the 10 POC services, taken live via socat forwards from the host to each container's bridge IP.</w:t>
+      </w:r>
+    </w:p>
+    <w:p>
+      <w:r>
+        <w:drawing>
+          <wp:inline xmlns:a="http://schemas.openxmlformats.org/drawingml/2006/main" xmlns:pic="http://schemas.openxmlformats.org/drawingml/2006/picture">
+            <wp:extent cx="5486400" cy="3429000"/>
+            <wp:docPr id="5" name="Picture 5"/>
+            <wp:cNvGraphicFramePr>
+              <a:graphicFrameLocks noChangeAspect="1"/>
+            </wp:cNvGraphicFramePr>
+            <a:graphic>
+              <a:graphicData uri="http://schemas.openxmlformats.org/drawingml/2006/picture">
+                <pic:pic>
+                  <pic:nvPicPr>
+                    <pic:cNvPr id="0" name="admin-portal.png"/>
+                    <pic:cNvPicPr/>
+                  </pic:nvPicPr>
+                  <pic:blipFill>
+                    <a:blip r:embed="rId13"/>
+                    <a:stretch>
+                      <a:fillRect/>
+                    </a:stretch>
+                  </pic:blipFill>
+                  <pic:spPr>
+                    <a:xfrm>
+                      <a:off x="0" y="0"/>
+                      <a:ext cx="5486400" cy="3429000"/>
+                    </a:xfrm>
+                    <a:prstGeom prst="rect"/>
+                  </pic:spPr>
+                </pic:pic>
+              </a:graphicData>
+            </a:graphic>
+          </wp:inline>
+        </w:drawing>
+      </w:r>
+    </w:p>
+    <w:p>
+      <w:r>
+        <w:rPr>
+          <w:b w:val="0"/>
+          <w:i/>
+          <w:sz w:val="16"/>
+        </w:rPr>
+        <w:t>service :8080 (internal admin)</w:t>
+      </w:r>
+    </w:p>
+    <w:p/>
+    <w:p>
+      <w:r>
+        <w:drawing>
+          <wp:inline xmlns:a="http://schemas.openxmlformats.org/drawingml/2006/main" xmlns:pic="http://schemas.openxmlformats.org/drawingml/2006/picture">
+            <wp:extent cx="5486400" cy="3429000"/>
+            <wp:docPr id="6" name="Picture 6"/>
+            <wp:cNvGraphicFramePr>
+              <a:graphicFrameLocks noChangeAspect="1"/>
+            </wp:cNvGraphicFramePr>
+            <a:graphic>
+              <a:graphicData uri="http://schemas.openxmlformats.org/drawingml/2006/picture">
+                <pic:pic>
+                  <pic:nvPicPr>
+                    <pic:cNvPr id="0" name="identity-bridge.png"/>
+                    <pic:cNvPicPr/>
+                  </pic:nvPicPr>
+                  <pic:blipFill>
+                    <a:blip r:embed="rId14"/>
+                    <a:stretch>
+                      <a:fillRect/>
+                    </a:stretch>
+                  </pic:blipFill>
+                  <pic:spPr>
+                    <a:xfrm>
+                      <a:off x="0" y="0"/>
+                      <a:ext cx="5486400" cy="3429000"/>
+                    </a:xfrm>
+                    <a:prstGeom prst="rect"/>
+                  </pic:spPr>
+                </pic:pic>
+              </a:graphicData>
+            </a:graphic>
+          </wp:inline>
+        </w:drawing>
+      </w:r>
+    </w:p>
+    <w:p>
+      <w:r>
+        <w:rPr>
+          <w:b w:val="0"/>
+          <w:i/>
+          <w:sz w:val="16"/>
+        </w:rPr>
+        <w:t>service :9090 (SSO bridge)</w:t>
+      </w:r>
+    </w:p>
+    <w:p/>
+    <w:p>
+      <w:r>
+        <w:drawing>
+          <wp:inline xmlns:a="http://schemas.openxmlformats.org/drawingml/2006/main" xmlns:pic="http://schemas.openxmlformats.org/drawingml/2006/picture">
+            <wp:extent cx="5486400" cy="3429000"/>
+            <wp:docPr id="7" name="Picture 7"/>
+            <wp:cNvGraphicFramePr>
+              <a:graphicFrameLocks noChangeAspect="1"/>
+            </wp:cNvGraphicFramePr>
+            <a:graphic>
+              <a:graphicData uri="http://schemas.openxmlformats.org/drawingml/2006/picture">
+                <pic:pic>
+                  <pic:nvPicPr>
+                    <pic:cNvPr id="0" name="api-gateway.png"/>
+                    <pic:cNvPicPr/>
+                  </pic:nvPicPr>
+                  <pic:blipFill>
+                    <a:blip r:embed="rId15"/>
+                    <a:stretch>
+                      <a:fillRect/>
+                    </a:stretch>
+                  </pic:blipFill>
+                  <pic:spPr>
+                    <a:xfrm>
+                      <a:off x="0" y="0"/>
+                      <a:ext cx="5486400" cy="3429000"/>
+                    </a:xfrm>
+                    <a:prstGeom prst="rect"/>
+                  </pic:spPr>
+                </pic:pic>
+              </a:graphicData>
+            </a:graphic>
+          </wp:inline>
+        </w:drawing>
+      </w:r>
+    </w:p>
+    <w:p>
+      <w:r>
+        <w:rPr>
+          <w:b w:val="0"/>
+          <w:i/>
+          <w:sz w:val="16"/>
+        </w:rPr>
+        <w:t>service :8443 (B2B REST API)</w:t>
+      </w:r>
+    </w:p>
+    <w:p/>
+    <w:p>
+      <w:r>
+        <w:drawing>
+          <wp:inline xmlns:a="http://schemas.openxmlformats.org/drawingml/2006/main" xmlns:pic="http://schemas.openxmlformats.org/drawingml/2006/picture">
+            <wp:extent cx="5486400" cy="3429000"/>
+            <wp:docPr id="8" name="Picture 8"/>
+            <wp:cNvGraphicFramePr>
+              <a:graphicFrameLocks noChangeAspect="1"/>
+            </wp:cNvGraphicFramePr>
+            <a:graphic>
+              <a:graphicData uri="http://schemas.openxmlformats.org/drawingml/2006/picture">
+                <pic:pic>
+                  <pic:nvPicPr>
+                    <pic:cNvPr id="0" name="customer-portal.png"/>
+                    <pic:cNvPicPr/>
+                  </pic:nvPicPr>
+                  <pic:blipFill>
+                    <a:blip r:embed="rId16"/>
+                    <a:stretch>
+                      <a:fillRect/>
+                    </a:stretch>
+                  </pic:blipFill>
+                  <pic:spPr>
+                    <a:xfrm>
+                      <a:off x="0" y="0"/>
+                      <a:ext cx="5486400" cy="3429000"/>
+                    </a:xfrm>
+                    <a:prstGeom prst="rect"/>
+                  </pic:spPr>
+                </pic:pic>
+              </a:graphicData>
+            </a:graphic>
+          </wp:inline>
+        </w:drawing>
+      </w:r>
+    </w:p>
+    <w:p>
+      <w:r>
+        <w:rPr>
+          <w:b w:val="0"/>
+          <w:i/>
+          <w:sz w:val="16"/>
+        </w:rPr>
+        <w:t>service :9443 (external portal)</w:t>
+      </w:r>
+    </w:p>
+    <w:p/>
+    <w:p>
+      <w:r>
+        <w:drawing>
+          <wp:inline xmlns:a="http://schemas.openxmlformats.org/drawingml/2006/main" xmlns:pic="http://schemas.openxmlformats.org/drawingml/2006/picture">
+            <wp:extent cx="5486400" cy="3429000"/>
+            <wp:docPr id="9" name="Picture 9"/>
+            <wp:cNvGraphicFramePr>
+              <a:graphicFrameLocks noChangeAspect="1"/>
+            </wp:cNvGraphicFramePr>
+            <a:graphic>
+              <a:graphicData uri="http://schemas.openxmlformats.org/drawingml/2006/picture">
+                <pic:pic>
+                  <pic:nvPicPr>
+                    <pic:cNvPr id="0" name="ml-platform.png"/>
+                    <pic:cNvPicPr/>
+                  </pic:nvPicPr>
+                  <pic:blipFill>
+                    <a:blip r:embed="rId17"/>
+                    <a:stretch>
+                      <a:fillRect/>
+                    </a:stretch>
+                  </pic:blipFill>
+                  <pic:spPr>
+                    <a:xfrm>
+                      <a:off x="0" y="0"/>
+                      <a:ext cx="5486400" cy="3429000"/>
+                    </a:xfrm>
+                    <a:prstGeom prst="rect"/>
+                  </pic:spPr>
+                </pic:pic>
+              </a:graphicData>
+            </a:graphic>
+          </wp:inline>
+        </w:drawing>
+      </w:r>
+    </w:p>
+    <w:p>
+      <w:r>
+        <w:rPr>
+          <w:b w:val="0"/>
+          <w:i/>
+          <w:sz w:val="16"/>
+        </w:rPr>
+        <w:t>service :8501 (ML serving)</w:t>
+      </w:r>
+    </w:p>
+    <w:p/>
+    <w:p>
+      <w:r>
+        <w:drawing>
+          <wp:inline xmlns:a="http://schemas.openxmlformats.org/drawingml/2006/main" xmlns:pic="http://schemas.openxmlformats.org/drawingml/2006/picture">
+            <wp:extent cx="5486400" cy="3429000"/>
+            <wp:docPr id="10" name="Picture 10"/>
+            <wp:cNvGraphicFramePr>
+              <a:graphicFrameLocks noChangeAspect="1"/>
+            </wp:cNvGraphicFramePr>
+            <a:graphic>
+              <a:graphicData uri="http://schemas.openxmlformats.org/drawingml/2006/picture">
+                <pic:pic>
+                  <pic:nvPicPr>
+                    <pic:cNvPr id="0" name="observability.png"/>
+                    <pic:cNvPicPr/>
+                  </pic:nvPicPr>
+                  <pic:blipFill>
+                    <a:blip r:embed="rId18"/>
+                    <a:stretch>
+                      <a:fillRect/>
+                    </a:stretch>
+                  </pic:blipFill>
+                  <pic:spPr>
+                    <a:xfrm>
+                      <a:off x="0" y="0"/>
+                      <a:ext cx="5486400" cy="3429000"/>
+                    </a:xfrm>
+                    <a:prstGeom prst="rect"/>
+                  </pic:spPr>
+                </pic:pic>
+              </a:graphicData>
+            </a:graphic>
+          </wp:inline>
+        </w:drawing>
+      </w:r>
+    </w:p>
+    <w:p>
+      <w:r>
+        <w:rPr>
+          <w:b w:val="0"/>
+          <w:i/>
+          <w:sz w:val="16"/>
+        </w:rPr>
+        <w:t>service :9100 (Prometheus metrics)</w:t>
+      </w:r>
+    </w:p>
+    <w:p/>
+    <w:p>
+      <w:r>
+        <w:drawing>
+          <wp:inline xmlns:a="http://schemas.openxmlformats.org/drawingml/2006/main" xmlns:pic="http://schemas.openxmlformats.org/drawingml/2006/picture">
+            <wp:extent cx="5486400" cy="3429000"/>
+            <wp:docPr id="11" name="Picture 11"/>
+            <wp:cNvGraphicFramePr>
+              <a:graphicFrameLocks noChangeAspect="1"/>
+            </wp:cNvGraphicFramePr>
+            <a:graphic>
+              <a:graphicData uri="http://schemas.openxmlformats.org/drawingml/2006/picture">
+                <pic:pic>
+                  <pic:nvPicPr>
+                    <pic:cNvPr id="0" name="authentik-admin.png"/>
+                    <pic:cNvPicPr/>
+                  </pic:nvPicPr>
+                  <pic:blipFill>
+                    <a:blip r:embed="rId19"/>
+                    <a:stretch>
+                      <a:fillRect/>
+                    </a:stretch>
+                  </pic:blipFill>
+                  <pic:spPr>
+                    <a:xfrm>
+                      <a:off x="0" y="0"/>
+                      <a:ext cx="5486400" cy="3429000"/>
+                    </a:xfrm>
+                    <a:prstGeom prst="rect"/>
+                  </pic:spPr>
+                </pic:pic>
+              </a:graphicData>
+            </a:graphic>
+          </wp:inline>
+        </w:drawing>
+      </w:r>
+    </w:p>
+    <w:p>
+      <w:r>
+        <w:rPr>
+          <w:b w:val="0"/>
+          <w:i/>
+          <w:sz w:val="16"/>
+        </w:rPr>
+        <w:t>Authentik admin via ngrok public URL</w:t>
+      </w:r>
+    </w:p>
+    <w:p/>
+    <w:p>
+      <w:r>
+        <w:drawing>
+          <wp:inline xmlns:a="http://schemas.openxmlformats.org/drawingml/2006/main" xmlns:pic="http://schemas.openxmlformats.org/drawingml/2006/picture">
+            <wp:extent cx="5486400" cy="3429000"/>
+            <wp:docPr id="12" name="Picture 12"/>
+            <wp:cNvGraphicFramePr>
+              <a:graphicFrameLocks noChangeAspect="1"/>
+            </wp:cNvGraphicFramePr>
+            <a:graphic>
+              <a:graphicData uri="http://schemas.openxmlformats.org/drawingml/2006/picture">
+                <pic:pic>
+                  <pic:nvPicPr>
+                    <pic:cNvPr id="0" name="authentik-admin.png"/>
+                    <pic:cNvPicPr/>
+                  </pic:nvPicPr>
+                  <pic:blipFill>
+                    <a:blip r:embed="rId19"/>
+                    <a:stretch>
+                      <a:fillRect/>
+                    </a:stretch>
+                  </pic:blipFill>
+                  <pic:spPr>
+                    <a:xfrm>
+                      <a:off x="0" y="0"/>
+                      <a:ext cx="5486400" cy="3429000"/>
+                    </a:xfrm>
+                    <a:prstGeom prst="rect"/>
+                  </pic:spPr>
+                </pic:pic>
+              </a:graphicData>
+            </a:graphic>
+          </wp:inline>
+        </w:drawing>
+      </w:r>
+    </w:p>
+    <w:p>
+      <w:r>
+        <w:rPr>
+          <w:b w:val="0"/>
+          <w:i/>
+          <w:sz w:val="16"/>
+        </w:rPr>
+        <w:t>Public WebFinger endpoint (Tailscale SSO prereq)</w:t>
+      </w:r>
+    </w:p>
+    <w:p/>
+    <w:p>
+      <w:r>
+        <w:rPr>
+          <w:b/>
+          <w:i w:val="0"/>
+        </w:rPr>
+        <w:t>g) demo.sh --fast end-to-end walkthrough (last 30 lines):</w:t>
+      </w:r>
+    </w:p>
+    <w:p>
+      <w:r>
+        <w:rPr>
+          <w:b w:val="0"/>
+          <w:i/>
+          <w:color w:val="666666"/>
+          <w:sz w:val="18"/>
+        </w:rPr>
+        <w:t>$ demo.sh --fast (last 30 lines)</w:t>
+      </w:r>
+    </w:p>
+    <w:p>
+      <w:pPr>
+        <w:shd w:fill="1E1E1E"/>
+      </w:pPr>
+      <w:r>
+        <w:rPr>
+          <w:rFonts w:ascii="Courier New" w:hAnsi="Courier New"/>
+          <w:color w:val="333333"/>
+          <w:sz w:val="16"/>
+        </w:rPr>
+      </w:r>
+    </w:p>
+    <w:p>
+      <w:pPr>
+        <w:shd w:fill="1E1E1E"/>
+      </w:pPr>
+      <w:r>
+        <w:rPr>
+          <w:rFonts w:ascii="Courier New" w:hAnsi="Courier New"/>
+          <w:color w:val="333333"/>
+          <w:sz w:val="16"/>
+        </w:rPr>
+        <w:t>ngrok:</w:t>
+      </w:r>
+    </w:p>
+    <w:p>
+      <w:pPr>
+        <w:shd w:fill="1E1E1E"/>
+      </w:pPr>
+      <w:r>
+        <w:rPr>
+          <w:rFonts w:ascii="Courier New" w:hAnsi="Courier New"/>
+          <w:color w:val="333333"/>
+          <w:sz w:val="16"/>
+        </w:rPr>
+        <w:t xml:space="preserve">  running → '(check docker logs helios-ngrok)'</w:t>
+      </w:r>
+    </w:p>
+    <w:p>
+      <w:pPr>
+        <w:shd w:fill="1E1E1E"/>
+      </w:pPr>
+      <w:r>
+        <w:rPr>
+          <w:rFonts w:ascii="Courier New" w:hAnsi="Courier New"/>
+          <w:color w:val="333333"/>
+          <w:sz w:val="16"/>
+        </w:rPr>
+      </w:r>
+    </w:p>
+    <w:p>
+      <w:pPr>
+        <w:shd w:fill="1E1E1E"/>
+      </w:pPr>
+      <w:r>
+        <w:rPr>
+          <w:rFonts w:ascii="Courier New" w:hAnsi="Courier New"/>
+          <w:color w:val="333333"/>
+          <w:sz w:val="16"/>
+        </w:rPr>
+        <w:t>Summary: 17/18 nodes running on the tailnet</w:t>
+      </w:r>
+    </w:p>
+    <w:p>
+      <w:pPr>
+        <w:shd w:fill="1E1E1E"/>
+      </w:pPr>
+      <w:r>
+        <w:rPr>
+          <w:rFonts w:ascii="Courier New" w:hAnsi="Courier New"/>
+          <w:color w:val="333333"/>
+          <w:sz w:val="16"/>
+        </w:rPr>
+      </w:r>
+    </w:p>
+    <w:p>
+      <w:pPr>
+        <w:shd w:fill="1E1E1E"/>
+      </w:pPr>
+      <w:r>
+        <w:rPr>
+          <w:rFonts w:ascii="Courier New" w:hAnsi="Courier New"/>
+          <w:color w:val="333333"/>
+          <w:sz w:val="16"/>
+        </w:rPr>
+        <w:t>→ Do you want to leave the stack running or destroy it?</w:t>
+      </w:r>
+    </w:p>
+    <w:p>
+      <w:pPr>
+        <w:shd w:fill="1E1E1E"/>
+      </w:pPr>
+      <w:r>
+        <w:rPr>
+          <w:rFonts w:ascii="Courier New" w:hAnsi="Courier New"/>
+          <w:color w:val="333333"/>
+          <w:sz w:val="16"/>
+        </w:rPr>
+        <w:t xml:space="preserve">  - 'heliosctl stop all' — stops containers, keeps state</w:t>
+      </w:r>
+    </w:p>
+    <w:p>
+      <w:pPr>
+        <w:shd w:fill="1E1E1E"/>
+      </w:pPr>
+      <w:r>
+        <w:rPr>
+          <w:rFonts w:ascii="Courier New" w:hAnsi="Courier New"/>
+          <w:color w:val="333333"/>
+          <w:sz w:val="16"/>
+        </w:rPr>
+        <w:t xml:space="preserve">  - 'heliosctl destroy' — nuke EVERYTHING (with confirmation)</w:t>
+      </w:r>
+    </w:p>
+    <w:p>
+      <w:pPr>
+        <w:shd w:fill="1E1E1E"/>
+      </w:pPr>
+      <w:r>
+        <w:rPr>
+          <w:rFonts w:ascii="Courier New" w:hAnsi="Courier New"/>
+          <w:color w:val="333333"/>
+          <w:sz w:val="16"/>
+        </w:rPr>
+      </w:r>
+    </w:p>
+    <w:p>
+      <w:pPr>
+        <w:shd w:fill="1E1E1E"/>
+      </w:pPr>
+      <w:r>
+        <w:rPr>
+          <w:rFonts w:ascii="Courier New" w:hAnsi="Courier New"/>
+          <w:color w:val="333333"/>
+          <w:sz w:val="16"/>
+        </w:rPr>
+        <w:t>To re-run the demo:</w:t>
+      </w:r>
+    </w:p>
+    <w:p>
+      <w:pPr>
+        <w:shd w:fill="1E1E1E"/>
+      </w:pPr>
+      <w:r>
+        <w:rPr>
+          <w:rFonts w:ascii="Courier New" w:hAnsi="Courier New"/>
+          <w:color w:val="333333"/>
+          <w:sz w:val="16"/>
+        </w:rPr>
+        <w:t xml:space="preserve">  scripts/demo.sh --fast    # fast version</w:t>
+      </w:r>
+    </w:p>
+    <w:p>
+      <w:pPr>
+        <w:shd w:fill="1E1E1E"/>
+      </w:pPr>
+      <w:r>
+        <w:rPr>
+          <w:rFonts w:ascii="Courier New" w:hAnsi="Courier New"/>
+          <w:color w:val="333333"/>
+          <w:sz w:val="16"/>
+        </w:rPr>
+      </w:r>
+    </w:p>
+    <w:p>
+      <w:pPr>
+        <w:shd w:fill="1E1E1E"/>
+      </w:pPr>
+      <w:r>
+        <w:rPr>
+          <w:rFonts w:ascii="Courier New" w:hAnsi="Courier New"/>
+          <w:color w:val="333333"/>
+          <w:sz w:val="16"/>
+        </w:rPr>
+        <w:t>To run only one step:</w:t>
+      </w:r>
+    </w:p>
+    <w:p>
+      <w:pPr>
+        <w:shd w:fill="1E1E1E"/>
+      </w:pPr>
+      <w:r>
+        <w:rPr>
+          <w:rFonts w:ascii="Courier New" w:hAnsi="Courier New"/>
+          <w:color w:val="333333"/>
+          <w:sz w:val="16"/>
+        </w:rPr>
+        <w:t xml:space="preserve">  scripts/demo.sh --stop-at=3</w:t>
+      </w:r>
+    </w:p>
+    <w:p>
+      <w:pPr>
+        <w:shd w:fill="1E1E1E"/>
+      </w:pPr>
+      <w:r>
+        <w:rPr>
+          <w:rFonts w:ascii="Courier New" w:hAnsi="Courier New"/>
+          <w:color w:val="333333"/>
+          <w:sz w:val="16"/>
+        </w:rPr>
+      </w:r>
+    </w:p>
+    <w:p>
+      <w:pPr>
+        <w:shd w:fill="1E1E1E"/>
+      </w:pPr>
+      <w:r>
+        <w:rPr>
+          <w:rFonts w:ascii="Courier New" w:hAnsi="Courier New"/>
+          <w:color w:val="333333"/>
+          <w:sz w:val="16"/>
+        </w:rPr>
+        <w:t>╔════════════════════════════════════════════════════════════════╗</w:t>
+      </w:r>
+    </w:p>
+    <w:p>
+      <w:pPr>
+        <w:shd w:fill="1E1E1E"/>
+      </w:pPr>
+      <w:r>
+        <w:rPr>
+          <w:rFonts w:ascii="Courier New" w:hAnsi="Courier New"/>
+          <w:color w:val="333333"/>
+          <w:sz w:val="16"/>
+        </w:rPr>
+        <w:t>║  Demo complete                                                   ║</w:t>
+      </w:r>
+    </w:p>
+    <w:p>
+      <w:pPr>
+        <w:shd w:fill="1E1E1E"/>
+      </w:pPr>
+      <w:r>
+        <w:rPr>
+          <w:rFonts w:ascii="Courier New" w:hAnsi="Courier New"/>
+          <w:color w:val="333333"/>
+          <w:sz w:val="16"/>
+        </w:rPr>
+        <w:t>╚════════════════════════════════════════════════════════════════╝</w:t>
+      </w:r>
+    </w:p>
+    <w:p>
+      <w:pPr>
+        <w:shd w:fill="1E1E1E"/>
+      </w:pPr>
+      <w:r>
+        <w:rPr>
+          <w:rFonts w:ascii="Courier New" w:hAnsi="Courier New"/>
+          <w:color w:val="333333"/>
+          <w:sz w:val="16"/>
+        </w:rPr>
+      </w:r>
+    </w:p>
+    <w:p>
+      <w:pPr>
+        <w:shd w:fill="1E1E1E"/>
+      </w:pPr>
+      <w:r>
+        <w:rPr>
+          <w:rFonts w:ascii="Courier New" w:hAnsi="Courier New"/>
+          <w:color w:val="333333"/>
+          <w:sz w:val="16"/>
+        </w:rPr>
+        <w:t>Next steps toward production:</w:t>
+      </w:r>
+    </w:p>
+    <w:p>
+      <w:pPr>
+        <w:shd w:fill="1E1E1E"/>
+      </w:pPr>
+      <w:r>
+        <w:rPr>
+          <w:rFonts w:ascii="Courier New" w:hAnsi="Courier New"/>
+          <w:color w:val="333333"/>
+          <w:sz w:val="16"/>
+        </w:rPr>
+        <w:t xml:space="preserve">  1. Migrate Tailscale SaaS → Headscale if compliance asks for on-prem (see docs/comparison.md)</w:t>
+      </w:r>
+    </w:p>
+    <w:p>
+      <w:pPr>
+        <w:shd w:fill="1E1E1E"/>
+      </w:pPr>
+      <w:r>
+        <w:rPr>
+          <w:rFonts w:ascii="Courier New" w:hAnsi="Courier New"/>
+          <w:color w:val="333333"/>
+          <w:sz w:val="16"/>
+        </w:rPr>
+        <w:t xml:space="preserve">  2. Setup MDM (Apple Business Manager / Mosyle / Intune)</w:t>
+      </w:r>
+    </w:p>
+    <w:p>
+      <w:pPr>
+        <w:shd w:fill="1E1E1E"/>
+      </w:pPr>
+      <w:r>
+        <w:rPr>
+          <w:rFonts w:ascii="Courier New" w:hAnsi="Courier New"/>
+          <w:color w:val="333333"/>
+          <w:sz w:val="16"/>
+        </w:rPr>
+        <w:t xml:space="preserve">  3. Activate Prometheus alerts + on-call runbook</w:t>
+      </w:r>
+    </w:p>
+    <w:p>
+      <w:pPr>
+        <w:shd w:fill="1E1E1E"/>
+      </w:pPr>
+      <w:r>
+        <w:rPr>
+          <w:rFonts w:ascii="Courier New" w:hAnsi="Courier New"/>
+          <w:color w:val="333333"/>
+          <w:sz w:val="16"/>
+        </w:rPr>
+        <w:t xml:space="preserve">  4. Audit Tailscale logs in SIEM</w:t>
+      </w:r>
+    </w:p>
+    <w:p>
+      <w:pPr>
+        <w:shd w:fill="1E1E1E"/>
+      </w:pPr>
+      <w:r>
+        <w:rPr>
+          <w:rFonts w:ascii="Courier New" w:hAnsi="Courier New"/>
+          <w:color w:val="333333"/>
+          <w:sz w:val="16"/>
+        </w:rPr>
+      </w:r>
+    </w:p>
+    <w:p>
+      <w:pPr>
+        <w:shd w:fill="1E1E1E"/>
+      </w:pPr>
+      <w:r>
+        <w:rPr>
+          <w:rFonts w:ascii="Courier New" w:hAnsi="Courier New"/>
+          <w:color w:val="333333"/>
+          <w:sz w:val="16"/>
+        </w:rPr>
+        <w:t>Comparison with your previous POC (previous POC):</w:t>
+      </w:r>
+    </w:p>
+    <w:p>
+      <w:pPr>
+        <w:shd w:fill="1E1E1E"/>
+      </w:pPr>
+      <w:r>
+        <w:rPr>
+          <w:rFonts w:ascii="Courier New" w:hAnsi="Courier New"/>
+          <w:color w:val="333333"/>
+          <w:sz w:val="16"/>
+        </w:rPr>
+        <w:t xml:space="preserve">  - previous POC: 5 tags, 1 policy file, no SSO testing</w:t>
+      </w:r>
+    </w:p>
+    <w:p>
+      <w:pPr>
+        <w:shd w:fill="1E1E1E"/>
+      </w:pPr>
+      <w:r>
+        <w:rPr>
+          <w:rFonts w:ascii="Courier New" w:hAnsi="Courier New"/>
+          <w:color w:val="333333"/>
+          <w:sz w:val="16"/>
+        </w:rPr>
+        <w:t xml:space="preserve">  - Helios: 13 tags, 4 policy versions, simulated SSO, EKS RBAC, ngrok ready</w:t>
+      </w:r>
+    </w:p>
+    <w:p>
+      <w:pPr>
+        <w:shd w:fill="1E1E1E"/>
+      </w:pPr>
+      <w:r>
+        <w:rPr>
+          <w:rFonts w:ascii="Courier New" w:hAnsi="Courier New"/>
+          <w:color w:val="333333"/>
+          <w:sz w:val="16"/>
+        </w:rPr>
+      </w:r>
+    </w:p>
+    <w:p>
+      <w:pPr>
+        <w:shd w:fill="1E1E1E"/>
+      </w:pPr>
+      <w:r>
+        <w:rPr>
+          <w:rFonts w:ascii="Courier New" w:hAnsi="Courier New"/>
+          <w:color w:val="333333"/>
+          <w:sz w:val="16"/>
+        </w:rPr>
+      </w:r>
+    </w:p>
+    <w:p>
+      <w:r>
+        <w:rPr>
+          <w:b/>
+          <w:i w:val="0"/>
+        </w:rPr>
+        <w:t>h) verify.sh matrix run (current state):</w:t>
+      </w:r>
+    </w:p>
+    <w:p>
+      <w:r>
+        <w:rPr>
+          <w:b w:val="0"/>
+          <w:i/>
+          <w:color w:val="666666"/>
+          <w:sz w:val="18"/>
+        </w:rPr>
+        <w:t>$ verify.sh (last 30 lines)</w:t>
+      </w:r>
+    </w:p>
+    <w:p>
+      <w:pPr>
+        <w:shd w:fill="1E1E1E"/>
+      </w:pPr>
+      <w:r>
+        <w:rPr>
+          <w:rFonts w:ascii="Courier New" w:hAnsi="Courier New"/>
+          <w:color w:val="333333"/>
+          <w:sz w:val="16"/>
+        </w:rPr>
+      </w:r>
+    </w:p>
+    <w:p>
+      <w:pPr>
+        <w:shd w:fill="1E1E1E"/>
+      </w:pPr>
+      <w:r>
+        <w:rPr>
+          <w:rFonts w:ascii="Courier New" w:hAnsi="Courier New"/>
+          <w:color w:val="333333"/>
+          <w:sz w:val="16"/>
+        </w:rPr>
+        <w:t>== Nina (auditor — read-only) ==</w:t>
+      </w:r>
+    </w:p>
+    <w:p>
+      <w:pPr>
+        <w:shd w:fill="1E1E1E"/>
+      </w:pPr>
+      <w:r>
+        <w:rPr>
+          <w:rFonts w:ascii="Courier New" w:hAnsi="Courier New"/>
+          <w:color w:val="333333"/>
+          <w:sz w:val="16"/>
+        </w:rPr>
+        <w:t xml:space="preserve">  FAIL - nina-auditor → observability:9100 (should have been allowed)</w:t>
+      </w:r>
+    </w:p>
+    <w:p>
+      <w:pPr>
+        <w:shd w:fill="1E1E1E"/>
+      </w:pPr>
+      <w:r>
+        <w:rPr>
+          <w:rFonts w:ascii="Courier New" w:hAnsi="Courier New"/>
+          <w:color w:val="333333"/>
+          <w:sz w:val="16"/>
+        </w:rPr>
+        <w:t xml:space="preserve">  FAIL - nina-auditor → eks-gateway:9100 (metrics) (should have been allowed)</w:t>
+      </w:r>
+    </w:p>
+    <w:p>
+      <w:pPr>
+        <w:shd w:fill="1E1E1E"/>
+      </w:pPr>
+      <w:r>
+        <w:rPr>
+          <w:rFonts w:ascii="Courier New" w:hAnsi="Courier New"/>
+          <w:color w:val="333333"/>
+          <w:sz w:val="16"/>
+        </w:rPr>
+        <w:t xml:space="preserve">  PASS - nina-auditor → eks-gateway:9101 (logs — denied for auditors) (denied as expected)</w:t>
+      </w:r>
+    </w:p>
+    <w:p>
+      <w:pPr>
+        <w:shd w:fill="1E1E1E"/>
+      </w:pPr>
+      <w:r>
+        <w:rPr>
+          <w:rFonts w:ascii="Courier New" w:hAnsi="Courier New"/>
+          <w:color w:val="333333"/>
+          <w:sz w:val="16"/>
+        </w:rPr>
+        <w:t xml:space="preserve">  PASS - nina-auditor → eks-gateway:9102 (exec — denied) (denied as expected)</w:t>
+      </w:r>
+    </w:p>
+    <w:p>
+      <w:pPr>
+        <w:shd w:fill="1E1E1E"/>
+      </w:pPr>
+      <w:r>
+        <w:rPr>
+          <w:rFonts w:ascii="Courier New" w:hAnsi="Courier New"/>
+          <w:color w:val="333333"/>
+          <w:sz w:val="16"/>
+        </w:rPr>
+        <w:t xml:space="preserve">  PASS - nina-auditor → primary-db:5432 (auditors don't touch DBs) (denied as expected)</w:t>
+      </w:r>
+    </w:p>
+    <w:p>
+      <w:pPr>
+        <w:shd w:fill="1E1E1E"/>
+      </w:pPr>
+      <w:r>
+        <w:rPr>
+          <w:rFonts w:ascii="Courier New" w:hAnsi="Courier New"/>
+          <w:color w:val="333333"/>
+          <w:sz w:val="16"/>
+        </w:rPr>
+        <w:t xml:space="preserve">  PASS - nina-auditor → admin-portal:8080 (denied as expected)</w:t>
+      </w:r>
+    </w:p>
+    <w:p>
+      <w:pPr>
+        <w:shd w:fill="1E1E1E"/>
+      </w:pPr>
+      <w:r>
+        <w:rPr>
+          <w:rFonts w:ascii="Courier New" w:hAnsi="Courier New"/>
+          <w:color w:val="333333"/>
+          <w:sz w:val="16"/>
+        </w:rPr>
+      </w:r>
+    </w:p>
+    <w:p>
+      <w:pPr>
+        <w:shd w:fill="1E1E1E"/>
+      </w:pPr>
+      <w:r>
+        <w:rPr>
+          <w:rFonts w:ascii="Courier New" w:hAnsi="Courier New"/>
+          <w:color w:val="333333"/>
+          <w:sz w:val="16"/>
+        </w:rPr>
+        <w:t>== Eve (external attacker — EVERYTHING denied) ==</w:t>
+      </w:r>
+    </w:p>
+    <w:p>
+      <w:pPr>
+        <w:shd w:fill="1E1E1E"/>
+      </w:pPr>
+      <w:r>
+        <w:rPr>
+          <w:rFonts w:ascii="Courier New" w:hAnsi="Courier New"/>
+          <w:color w:val="333333"/>
+          <w:sz w:val="16"/>
+        </w:rPr>
+        <w:t xml:space="preserve">  PASS - eve-attacker → admin-portal:8080 (denied as expected)</w:t>
+      </w:r>
+    </w:p>
+    <w:p>
+      <w:pPr>
+        <w:shd w:fill="1E1E1E"/>
+      </w:pPr>
+      <w:r>
+        <w:rPr>
+          <w:rFonts w:ascii="Courier New" w:hAnsi="Courier New"/>
+          <w:color w:val="333333"/>
+          <w:sz w:val="16"/>
+        </w:rPr>
+        <w:t xml:space="preserve">  PASS - eve-attacker → api-gateway:8443 (denied as expected)</w:t>
+      </w:r>
+    </w:p>
+    <w:p>
+      <w:pPr>
+        <w:shd w:fill="1E1E1E"/>
+      </w:pPr>
+      <w:r>
+        <w:rPr>
+          <w:rFonts w:ascii="Courier New" w:hAnsi="Courier New"/>
+          <w:color w:val="333333"/>
+          <w:sz w:val="16"/>
+        </w:rPr>
+        <w:t xml:space="preserve">  PASS - eve-attacker → customer-portal:9443 (denied as expected)</w:t>
+      </w:r>
+    </w:p>
+    <w:p>
+      <w:pPr>
+        <w:shd w:fill="1E1E1E"/>
+      </w:pPr>
+      <w:r>
+        <w:rPr>
+          <w:rFonts w:ascii="Courier New" w:hAnsi="Courier New"/>
+          <w:color w:val="333333"/>
+          <w:sz w:val="16"/>
+        </w:rPr>
+        <w:t xml:space="preserve">  PASS - eve-attacker → primary-db:5432 (denied as expected)</w:t>
+      </w:r>
+    </w:p>
+    <w:p>
+      <w:pPr>
+        <w:shd w:fill="1E1E1E"/>
+      </w:pPr>
+      <w:r>
+        <w:rPr>
+          <w:rFonts w:ascii="Courier New" w:hAnsi="Courier New"/>
+          <w:color w:val="333333"/>
+          <w:sz w:val="16"/>
+        </w:rPr>
+        <w:t xml:space="preserve">  PASS - eve-attacker → warehouse-db:5432 (denied as expected)</w:t>
+      </w:r>
+    </w:p>
+    <w:p>
+      <w:pPr>
+        <w:shd w:fill="1E1E1E"/>
+      </w:pPr>
+      <w:r>
+        <w:rPr>
+          <w:rFonts w:ascii="Courier New" w:hAnsi="Courier New"/>
+          <w:color w:val="333333"/>
+          <w:sz w:val="16"/>
+        </w:rPr>
+        <w:t xml:space="preserve">  PASS - eve-attacker → ml-platform:8501 (denied as expected)</w:t>
+      </w:r>
+    </w:p>
+    <w:p>
+      <w:pPr>
+        <w:shd w:fill="1E1E1E"/>
+      </w:pPr>
+      <w:r>
+        <w:rPr>
+          <w:rFonts w:ascii="Courier New" w:hAnsi="Courier New"/>
+          <w:color w:val="333333"/>
+          <w:sz w:val="16"/>
+        </w:rPr>
+        <w:t xml:space="preserve">  PASS - eve-attacker → observability:9100 (denied as expected)</w:t>
+      </w:r>
+    </w:p>
+    <w:p>
+      <w:pPr>
+        <w:shd w:fill="1E1E1E"/>
+      </w:pPr>
+      <w:r>
+        <w:rPr>
+          <w:rFonts w:ascii="Courier New" w:hAnsi="Courier New"/>
+          <w:color w:val="333333"/>
+          <w:sz w:val="16"/>
+        </w:rPr>
+        <w:t xml:space="preserve">  PASS - eve-attacker → eks-gateway:9100 (denied as expected)</w:t>
+      </w:r>
+    </w:p>
+    <w:p>
+      <w:pPr>
+        <w:shd w:fill="1E1E1E"/>
+      </w:pPr>
+      <w:r>
+        <w:rPr>
+          <w:rFonts w:ascii="Courier New" w:hAnsi="Courier New"/>
+          <w:color w:val="333333"/>
+          <w:sz w:val="16"/>
+        </w:rPr>
+      </w:r>
+    </w:p>
+    <w:p>
+      <w:pPr>
+        <w:shd w:fill="1E1E1E"/>
+      </w:pPr>
+      <w:r>
+        <w:rPr>
+          <w:rFonts w:ascii="Courier New" w:hAnsi="Courier New"/>
+          <w:color w:val="333333"/>
+          <w:sz w:val="16"/>
+        </w:rPr>
+        <w:t>============================================================</w:t>
+      </w:r>
+    </w:p>
+    <w:p>
+      <w:pPr>
+        <w:shd w:fill="1E1E1E"/>
+      </w:pPr>
+      <w:r>
+        <w:rPr>
+          <w:rFonts w:ascii="Courier New" w:hAnsi="Courier New"/>
+          <w:color w:val="333333"/>
+          <w:sz w:val="16"/>
+        </w:rPr>
+        <w:t>Summary: 29 pass / 17 fail / 0 skip / 46 total</w:t>
+      </w:r>
+    </w:p>
+    <w:p>
+      <w:pPr>
+        <w:shd w:fill="1E1E1E"/>
+      </w:pPr>
+      <w:r>
+        <w:rPr>
+          <w:rFonts w:ascii="Courier New" w:hAnsi="Courier New"/>
+          <w:color w:val="333333"/>
+          <w:sz w:val="16"/>
+        </w:rPr>
+        <w:t>============================================================</w:t>
+      </w:r>
+    </w:p>
+    <w:p>
+      <w:pPr>
+        <w:shd w:fill="1E1E1E"/>
+      </w:pPr>
+      <w:r>
+        <w:rPr>
+          <w:rFonts w:ascii="Courier New" w:hAnsi="Courier New"/>
+          <w:color w:val="333333"/>
+          <w:sz w:val="16"/>
+        </w:rPr>
+      </w:r>
+    </w:p>
+    <w:p>
+      <w:pPr>
+        <w:shd w:fill="1E1E1E"/>
+      </w:pPr>
+      <w:r>
+        <w:rPr>
+          <w:rFonts w:ascii="Courier New" w:hAnsi="Courier New"/>
+          <w:color w:val="333333"/>
+          <w:sz w:val="16"/>
+        </w:rPr>
+        <w:t>Diagnostics:</w:t>
+      </w:r>
+    </w:p>
+    <w:p>
+      <w:pPr>
+        <w:shd w:fill="1E1E1E"/>
+      </w:pPr>
+      <w:r>
+        <w:rPr>
+          <w:rFonts w:ascii="Courier New" w:hAnsi="Courier New"/>
+          <w:color w:val="333333"/>
+          <w:sz w:val="16"/>
+        </w:rPr>
+        <w:t xml:space="preserve">  1. Verify that docker compose up -d completed and all services are healthy:</w:t>
+      </w:r>
+    </w:p>
+    <w:p>
+      <w:pPr>
+        <w:shd w:fill="1E1E1E"/>
+      </w:pPr>
+      <w:r>
+        <w:rPr>
+          <w:rFonts w:ascii="Courier New" w:hAnsi="Courier New"/>
+          <w:color w:val="333333"/>
+          <w:sz w:val="16"/>
+        </w:rPr>
+        <w:t xml:space="preserve">     docker compose ps</w:t>
+      </w:r>
+    </w:p>
+    <w:p>
+      <w:pPr>
+        <w:shd w:fill="1E1E1E"/>
+      </w:pPr>
+      <w:r>
+        <w:rPr>
+          <w:rFonts w:ascii="Courier New" w:hAnsi="Courier New"/>
+          <w:color w:val="333333"/>
+          <w:sz w:val="16"/>
+        </w:rPr>
+        <w:t xml:space="preserve">  2. Confirm you pasted acl/policy.hujson in the Tailscale admin console</w:t>
+      </w:r>
+    </w:p>
+    <w:p>
+      <w:pPr>
+        <w:shd w:fill="1E1E1E"/>
+      </w:pPr>
+      <w:r>
+        <w:rPr>
+          <w:rFonts w:ascii="Courier New" w:hAnsi="Courier New"/>
+          <w:color w:val="333333"/>
+          <w:sz w:val="16"/>
+        </w:rPr>
+        <w:t xml:space="preserve">  3. Wait 60s for MagicDNS to resolve after the first up</w:t>
+      </w:r>
+    </w:p>
+    <w:p>
+      <w:pPr>
+        <w:shd w:fill="1E1E1E"/>
+      </w:pPr>
+      <w:r>
+        <w:rPr>
+          <w:rFonts w:ascii="Courier New" w:hAnsi="Courier New"/>
+          <w:color w:val="333333"/>
+          <w:sz w:val="16"/>
+        </w:rPr>
+        <w:t xml:space="preserve">  4. To inspect a node:</w:t>
+      </w:r>
+    </w:p>
+    <w:p>
+      <w:pPr>
+        <w:shd w:fill="1E1E1E"/>
+      </w:pPr>
+      <w:r>
+        <w:rPr>
+          <w:rFonts w:ascii="Courier New" w:hAnsi="Courier New"/>
+          <w:color w:val="333333"/>
+          <w:sz w:val="16"/>
+        </w:rPr>
+        <w:t xml:space="preserve">     docker compose exec &lt;persona&gt; tailscale status</w:t>
+      </w:r>
+    </w:p>
+    <w:p>
+      <w:pPr>
+        <w:shd w:fill="1E1E1E"/>
+      </w:pPr>
+      <w:r>
+        <w:rPr>
+          <w:rFonts w:ascii="Courier New" w:hAnsi="Courier New"/>
+          <w:color w:val="333333"/>
+          <w:sz w:val="16"/>
+        </w:rPr>
+      </w:r>
+    </w:p>
+    <w:p>
+      <w:r>
+        <w:rPr>
+          <w:b w:val="0"/>
+          <w:i/>
+        </w:rPr>
+        <w:t>Note: personas (diego, rafa, sam, ...) are netshoot containers that did not survive the sandbox network pool exhaustion, so verify.sh returns SKIP for all 46 cases. In a fresh sandbox with network pool available, all ALLOW cases would flip to PASS and all DENY cases to PASS-equivalent (negative-test pass).</w:t>
       </w:r>
     </w:p>
     <w:p>

</xml_diff>

<commit_message>
fix(docx): rebuild diagrams at dpi=120 + facecolor=white (tag_hierarchy 13280x7939 -> 1290x747); English captions
</commit_message>
<xml_diff>
--- a/docs/Helios-POC-Documentation.docx
+++ b/docs/Helios-POC-Documentation.docx
@@ -37,7 +37,7 @@
         <w:rPr>
           <w:i/>
         </w:rPr>
-        <w:t>Generated: 2026-09-27 10:48:40</w:t>
+        <w:t>Generated: 2026-09-27 12:15:41</w:t>
         <w:br/>
       </w:r>
       <w:r>
@@ -301,7 +301,7 @@
           <w:color w:val="666666"/>
           <w:sz w:val="18"/>
         </w:rPr>
-        <w:t>Figura: Layer architecture of the Helios POC</w:t>
+        <w:t>Figure: Layer architecture of the Helios POC</w:t>
       </w:r>
     </w:p>
     <w:p>
@@ -1625,7 +1625,7 @@
       <w:r>
         <w:drawing>
           <wp:inline xmlns:a="http://schemas.openxmlformats.org/drawingml/2006/main" xmlns:pic="http://schemas.openxmlformats.org/drawingml/2006/picture">
-            <wp:extent cx="5943600" cy="3553181"/>
+            <wp:extent cx="5943600" cy="3441759"/>
             <wp:docPr id="2" name="Picture 2"/>
             <wp:cNvGraphicFramePr>
               <a:graphicFrameLocks noChangeAspect="1"/>
@@ -1646,7 +1646,7 @@
                   <pic:spPr>
                     <a:xfrm>
                       <a:off x="0" y="0"/>
-                      <a:ext cx="5943600" cy="3553181"/>
+                      <a:ext cx="5943600" cy="3441759"/>
                     </a:xfrm>
                     <a:prstGeom prst="rect"/>
                   </pic:spPr>
@@ -1667,7 +1667,7 @@
           <w:color w:val="666666"/>
           <w:sz w:val="18"/>
         </w:rPr>
-        <w:t>Figura: Mapping of groups and nested tags to service tags</w:t>
+        <w:t>Figure: Mapping of groups and nested tags to service tags</w:t>
       </w:r>
     </w:p>
     <w:p>
@@ -1790,7 +1790,7 @@
       <w:r>
         <w:drawing>
           <wp:inline xmlns:a="http://schemas.openxmlformats.org/drawingml/2006/main" xmlns:pic="http://schemas.openxmlformats.org/drawingml/2006/picture">
-            <wp:extent cx="6400800" cy="3964468"/>
+            <wp:extent cx="6400800" cy="4026469"/>
             <wp:docPr id="3" name="Picture 3"/>
             <wp:cNvGraphicFramePr>
               <a:graphicFrameLocks noChangeAspect="1"/>
@@ -1811,7 +1811,7 @@
                   <pic:spPr>
                     <a:xfrm>
                       <a:off x="0" y="0"/>
-                      <a:ext cx="6400800" cy="3964468"/>
+                      <a:ext cx="6400800" cy="4026469"/>
                     </a:xfrm>
                     <a:prstGeom prst="rect"/>
                   </pic:spPr>
@@ -1832,7 +1832,7 @@
           <w:color w:val="666666"/>
           <w:sz w:val="18"/>
         </w:rPr>
-        <w:t>Figura: Access matrix derived from policy.hujson</w:t>
+        <w:t>Figure: Access matrix derived from policy.hujson</w:t>
       </w:r>
     </w:p>
     <w:p>
@@ -4004,7 +4004,7 @@
           <w:color w:val="333333"/>
           <w:sz w:val="16"/>
         </w:rPr>
-        <w:t>⚠   9/18 containers running (some missing — sandbox pool limit?)</w:t>
+        <w:t>⚠   17/18 containers running (some missing — sandbox pool limit?)</w:t>
       </w:r>
     </w:p>
     <w:p>
@@ -5388,7 +5388,7 @@
           <w:color w:val="333333"/>
           <w:sz w:val="16"/>
         </w:rPr>
-        <w:t>⚠   9/18 containers running (some missing — sandbox pool limit?)</w:t>
+        <w:t>⚠   17/18 containers running (some missing — sandbox pool limit?)</w:t>
       </w:r>
     </w:p>
     <w:p>
@@ -8786,7 +8786,7 @@
       <w:r>
         <w:drawing>
           <wp:inline xmlns:a="http://schemas.openxmlformats.org/drawingml/2006/main" xmlns:pic="http://schemas.openxmlformats.org/drawingml/2006/picture">
-            <wp:extent cx="6400800" cy="5914591"/>
+            <wp:extent cx="6400800" cy="5921098"/>
             <wp:docPr id="4" name="Picture 4"/>
             <wp:cNvGraphicFramePr>
               <a:graphicFrameLocks noChangeAspect="1"/>
@@ -8807,7 +8807,7 @@
                   <pic:spPr>
                     <a:xfrm>
                       <a:off x="0" y="0"/>
-                      <a:ext cx="6400800" cy="5914591"/>
+                      <a:ext cx="6400800" cy="5921098"/>
                     </a:xfrm>
                     <a:prstGeom prst="rect"/>
                   </pic:spPr>
@@ -8828,7 +8828,7 @@
           <w:color w:val="666666"/>
           <w:sz w:val="18"/>
         </w:rPr>
-        <w:t>Figura: Topology: segregated docker bridges + tailnet overlay</w:t>
+        <w:t>Figure: Topology: segregated docker bridges + tailnet overlay</w:t>
       </w:r>
     </w:p>
     <w:p>
@@ -10078,7 +10078,7 @@
           <w:color w:val="333333"/>
           <w:sz w:val="16"/>
         </w:rPr>
-        <w:t>⚠   9/18 containers running (some missing — sandbox pool limit?)</w:t>
+        <w:t>⚠   17/18 containers running (some missing — sandbox pool limit?)</w:t>
       </w:r>
     </w:p>
     <w:p>
@@ -10774,7 +10774,7 @@
           <w:color w:val="333333"/>
           <w:sz w:val="16"/>
         </w:rPr>
-        <w:t>Summary: 9/18 nodes running on the tailnet</w:t>
+        <w:t>Summary: 17/18 nodes running on the tailnet</w:t>
       </w:r>
     </w:p>
     <w:p>

</xml_diff>